<commit_message>
task 1(Design a complete database)
</commit_message>
<xml_diff>
--- a/IT244 -#5- Project.docx
+++ b/IT244 -#5- Project.docx
@@ -450,13 +450,13 @@
               </wp:anchor>
             </w:drawing>
           </mc:Choice>
-          <mc:Fallback xmlns:w16du="http://schemas.microsoft.com/office/word/2023/wordml/word16du" xmlns:w16sdtfl="http://schemas.microsoft.com/office/word/2024/wordml/sdtformatlock" xmlns:w16sdtdh="http://schemas.microsoft.com/office/word/2020/wordml/sdtdatahash" xmlns:w16="http://schemas.microsoft.com/office/word/2018/wordml" xmlns:w16cid="http://schemas.microsoft.com/office/word/2016/wordml/cid" xmlns:w16cex="http://schemas.microsoft.com/office/word/2018/wordml/cex" xmlns:w16cei="http://schemas.microsoft.com/office/word/2026/wordml/cei" xmlns:oel="http://schemas.microsoft.com/office/2019/extlst" xmlns:am3d="http://schemas.microsoft.com/office/drawing/2017/model3d" xmlns:aink="http://schemas.microsoft.com/office/drawing/2016/ink" xmlns:cx8="http://schemas.microsoft.com/office/drawing/2016/5/14/chartex" xmlns:cx7="http://schemas.microsoft.com/office/drawing/2016/5/13/chartex" xmlns:cx6="http://schemas.microsoft.com/office/drawing/2016/5/12/chartex" xmlns:cx5="http://schemas.microsoft.com/office/drawing/2016/5/11/chartex" xmlns:cx4="http://schemas.microsoft.com/office/drawing/2016/5/10/chartex" xmlns:cx3="http://schemas.microsoft.com/office/drawing/2016/5/9/chartex" xmlns:cx2="http://schemas.microsoft.com/office/drawing/2015/10/21/chartex" xmlns:cx1="http://schemas.microsoft.com/office/drawing/2015/9/8/chartex">
+          <mc:Fallback>
             <w:pict>
               <v:shapetype w14:anchorId="31BDEDF3" id="_x0000_t202" coordsize="21600,21600" o:spt="202" path="m,l,21600r21600,l21600,xe">
                 <v:stroke joinstyle="miter"/>
                 <v:path gradientshapeok="t" o:connecttype="rect"/>
               </v:shapetype>
-              <v:shape id="Text Box 14" o:spid="_x0000_s1026" type="#_x0000_t202" alt="Report title" style="position:absolute;margin-left:36pt;margin-top:85.4pt;width:540pt;height:148.1pt;z-index:-251641856;visibility:visible;mso-wrap-style:square;mso-width-percent:0;mso-height-percent:0;mso-wrap-distance-left:9pt;mso-wrap-distance-top:0;mso-wrap-distance-right:9pt;mso-wrap-distance-bottom:0;mso-position-horizontal:absolute;mso-position-horizontal-relative:page;mso-position-vertical:absolute;mso-position-vertical-relative:margin;mso-width-percent:0;mso-height-percent:0;mso-width-relative:margin;mso-height-relative:margin;v-text-anchor:bottom" o:gfxdata="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" o:allowoverlap="f" filled="f" stroked="f">
+              <v:shape id="Text Box 14" o:spid="_x0000_s1026" type="#_x0000_t202" alt="Report title" style="position:absolute;margin-left:36pt;margin-top:85.4pt;width:540pt;height:148.1pt;z-index:-251641856;visibility:visible;mso-wrap-style:square;mso-width-percent:0;mso-height-percent:0;mso-wrap-distance-left:9pt;mso-wrap-distance-top:0;mso-wrap-distance-right:9pt;mso-wrap-distance-bottom:0;mso-position-horizontal:absolute;mso-position-horizontal-relative:page;mso-position-vertical:absolute;mso-position-vertical-relative:margin;mso-width-percent:0;mso-height-percent:0;mso-width-relative:margin;mso-height-relative:margin;v-text-anchor:bottom" o:gfxdata="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" o:allowoverlap="f" filled="f" stroked="f">
                 <v:textbox inset="0,0,0,0">
                   <w:txbxContent>
                     <w:sdt>
@@ -474,6 +474,7 @@
                         <w:dataBinding w:prefixMappings="xmlns:ns0='http://purl.org/dc/elements/1.1/' xmlns:ns1='http://schemas.openxmlformats.org/package/2006/metadata/core-properties' " w:xpath="/ns1:coreProperties[1]/ns0:title[1]" w:storeItemID="{6C3C8BC8-F283-45AE-878A-BAB7291924A1}"/>
                         <w:text/>
                       </w:sdtPr>
+                      <w:sdtEndPr/>
                       <w:sdtContent>
                         <w:p>
                           <w:pPr>
@@ -531,6 +532,7 @@
                           <w:dataBinding w:prefixMappings="xmlns:ns0='http://purl.org/dc/elements/1.1/' xmlns:ns1='http://schemas.openxmlformats.org/package/2006/metadata/core-properties' " w:xpath="/ns1:coreProperties[1]/ns0:subject[1]" w:storeItemID="{6C3C8BC8-F283-45AE-878A-BAB7291924A1}"/>
                           <w:text/>
                         </w:sdtPr>
+                        <w:sdtEndPr/>
                         <w:sdtContent>
                           <w:r>
                             <w:rPr>
@@ -773,6 +775,7 @@
                         <w:dataBinding w:prefixMappings="xmlns:ns0='http://schemas.microsoft.com/office/2006/coverPageProps'" w:xpath="/ns0:CoverPageProperties[1]/ns0:Abstract[1]" w:storeItemID="{55AF091B-3C7A-41E3-B477-F2FDAA23CFDA}"/>
                         <w:text/>
                       </w:sdtPr>
+                      <w:sdtEndPr/>
                       <w:sdtContent>
                         <w:p>
                           <w:pPr>
@@ -988,9 +991,9 @@
               </wp:anchor>
             </w:drawing>
           </mc:Choice>
-          <mc:Fallback xmlns:w16du="http://schemas.microsoft.com/office/word/2023/wordml/word16du" xmlns:w16sdtfl="http://schemas.microsoft.com/office/word/2024/wordml/sdtformatlock" xmlns:w16sdtdh="http://schemas.microsoft.com/office/word/2020/wordml/sdtdatahash" xmlns:w16="http://schemas.microsoft.com/office/word/2018/wordml" xmlns:w16cid="http://schemas.microsoft.com/office/word/2016/wordml/cid" xmlns:w16cex="http://schemas.microsoft.com/office/word/2018/wordml/cex" xmlns:w16cei="http://schemas.microsoft.com/office/word/2026/wordml/cei" xmlns:oel="http://schemas.microsoft.com/office/2019/extlst" xmlns:am3d="http://schemas.microsoft.com/office/drawing/2017/model3d" xmlns:aink="http://schemas.microsoft.com/office/drawing/2016/ink" xmlns:cx8="http://schemas.microsoft.com/office/drawing/2016/5/14/chartex" xmlns:cx7="http://schemas.microsoft.com/office/drawing/2016/5/13/chartex" xmlns:cx6="http://schemas.microsoft.com/office/drawing/2016/5/12/chartex" xmlns:cx5="http://schemas.microsoft.com/office/drawing/2016/5/11/chartex" xmlns:cx4="http://schemas.microsoft.com/office/drawing/2016/5/10/chartex" xmlns:cx3="http://schemas.microsoft.com/office/drawing/2016/5/9/chartex" xmlns:cx2="http://schemas.microsoft.com/office/drawing/2015/10/21/chartex" xmlns:cx1="http://schemas.microsoft.com/office/drawing/2015/9/8/chartex">
+          <mc:Fallback>
             <w:pict>
-              <v:shape w14:anchorId="6466823C" id="Text Box 2" o:spid="_x0000_s1027" type="#_x0000_t202" style="position:absolute;margin-left:40.3pt;margin-top:.05pt;width:545.45pt;height:87.55pt;z-index:251679744;visibility:visible;mso-wrap-style:square;mso-width-percent:0;mso-height-percent:0;mso-wrap-distance-left:9pt;mso-wrap-distance-top:7.2pt;mso-wrap-distance-right:9pt;mso-wrap-distance-bottom:7.2pt;mso-position-horizontal:absolute;mso-position-horizontal-relative:page;mso-position-vertical:absolute;mso-position-vertical-relative:text;mso-width-percent:0;mso-height-percent:0;mso-width-relative:margin;mso-height-relative:margin;v-text-anchor:top" o:gfxdata="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" filled="f" stroked="f">
+              <v:shape w14:anchorId="6466823C" id="Text Box 2" o:spid="_x0000_s1027" type="#_x0000_t202" style="position:absolute;margin-left:40.3pt;margin-top:.05pt;width:545.45pt;height:87.55pt;z-index:251679744;visibility:visible;mso-wrap-style:square;mso-width-percent:0;mso-height-percent:0;mso-wrap-distance-left:9pt;mso-wrap-distance-top:7.2pt;mso-wrap-distance-right:9pt;mso-wrap-distance-bottom:7.2pt;mso-position-horizontal:absolute;mso-position-horizontal-relative:page;mso-position-vertical:absolute;mso-position-vertical-relative:text;mso-width-percent:0;mso-height-percent:0;mso-width-relative:margin;mso-height-relative:margin;v-text-anchor:top" o:gfxdata="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" filled="f" stroked="f">
                 <v:textbox>
                   <w:txbxContent>
                     <w:p>
@@ -1377,7 +1380,14 @@
                                     <w:rPr>
                                       <w:color w:val="auto"/>
                                     </w:rPr>
-                                    <w:t xml:space="preserve"> will be given if you try to bypass the SafeAssi</w:t>
+                                    <w:t xml:space="preserve"> will be given if you try to bypass the </w:t>
+                                  </w:r>
+                                  <w:proofErr w:type="spellStart"/>
+                                  <w:r>
+                                    <w:rPr>
+                                      <w:color w:val="auto"/>
+                                    </w:rPr>
+                                    <w:t>SafeAssi</w:t>
                                   </w:r>
                                   <w:r>
                                     <w:rPr>
@@ -1385,6 +1395,7 @@
                                     </w:rPr>
                                     <w:t>gn</w:t>
                                   </w:r>
+                                  <w:proofErr w:type="spellEnd"/>
                                   <w:r>
                                     <w:rPr>
                                       <w:color w:val="auto"/>
@@ -1701,10 +1712,10 @@
                   </wp:anchor>
                 </w:drawing>
               </mc:Choice>
-              <mc:Fallback xmlns:w16du="http://schemas.microsoft.com/office/word/2023/wordml/word16du" xmlns:w16sdtfl="http://schemas.microsoft.com/office/word/2024/wordml/sdtformatlock" xmlns:w16sdtdh="http://schemas.microsoft.com/office/word/2020/wordml/sdtdatahash" xmlns:w16="http://schemas.microsoft.com/office/word/2018/wordml" xmlns:w16cid="http://schemas.microsoft.com/office/word/2016/wordml/cid" xmlns:w16cex="http://schemas.microsoft.com/office/word/2018/wordml/cex" xmlns:w16cei="http://schemas.microsoft.com/office/word/2026/wordml/cei" xmlns:oel="http://schemas.microsoft.com/office/2019/extlst" xmlns:am3d="http://schemas.microsoft.com/office/drawing/2017/model3d" xmlns:aink="http://schemas.microsoft.com/office/drawing/2016/ink" xmlns:cx8="http://schemas.microsoft.com/office/drawing/2016/5/14/chartex" xmlns:cx7="http://schemas.microsoft.com/office/drawing/2016/5/13/chartex" xmlns:cx6="http://schemas.microsoft.com/office/drawing/2016/5/12/chartex" xmlns:cx5="http://schemas.microsoft.com/office/drawing/2016/5/11/chartex" xmlns:cx4="http://schemas.microsoft.com/office/drawing/2016/5/10/chartex" xmlns:cx3="http://schemas.microsoft.com/office/drawing/2016/5/9/chartex" xmlns:cx2="http://schemas.microsoft.com/office/drawing/2015/10/21/chartex" xmlns:cx1="http://schemas.microsoft.com/office/drawing/2015/9/8/chartex">
+              <mc:Fallback>
                 <w:pict>
-                  <v:group w14:anchorId="31857F9A" id="Group 198" o:spid="_x0000_s1028" style="position:absolute;margin-left:-105.75pt;margin-top:341.4pt;width:518.25pt;height:318.6pt;z-index:251677696;mso-wrap-distance-left:14.4pt;mso-wrap-distance-top:3.6pt;mso-wrap-distance-right:14.4pt;mso-wrap-distance-bottom:3.6pt;mso-position-horizontal-relative:margin;mso-position-vertical-relative:margin;mso-width-relative:margin;mso-height-relative:margin" coordorigin=",228" coordsize="35784,22576" o:gfxdata="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">
-                    <v:rect id="Rectangle 199" o:spid="_x0000_s1029" style="position:absolute;top:228;width:35674;height:2448;visibility:visible;mso-wrap-style:square;v-text-anchor:middle" o:gfxdata="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" fillcolor="#ef4623 [3204]" stroked="f" strokeweight="2pt">
+                  <v:group w14:anchorId="31857F9A" id="Group 198" o:spid="_x0000_s1028" style="position:absolute;margin-left:-105.75pt;margin-top:341.4pt;width:518.25pt;height:318.6pt;z-index:251677696;mso-wrap-distance-left:14.4pt;mso-wrap-distance-top:3.6pt;mso-wrap-distance-right:14.4pt;mso-wrap-distance-bottom:3.6pt;mso-position-horizontal-relative:margin;mso-position-vertical-relative:margin;mso-width-relative:margin;mso-height-relative:margin" coordorigin=",228" coordsize="35784,22576" o:gfxdata="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">
+                    <v:rect id="Rectangle 199" o:spid="_x0000_s1029" style="position:absolute;top:228;width:35674;height:2448;visibility:visible;mso-wrap-style:square;v-text-anchor:middle" o:gfxdata="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" fillcolor="#ef4623 [3204]" stroked="f" strokeweight="2pt">
                       <v:textbox>
                         <w:txbxContent>
                           <w:p>
@@ -1733,7 +1744,7 @@
                         </w:txbxContent>
                       </v:textbox>
                     </v:rect>
-                    <v:shape id="Text Box 200" o:spid="_x0000_s1030" type="#_x0000_t202" style="position:absolute;top:2896;width:35784;height:19908;visibility:visible;mso-wrap-style:square;v-text-anchor:top" o:gfxdata="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" filled="f" stroked="f" strokeweight=".5pt">
+                    <v:shape id="Text Box 200" o:spid="_x0000_s1030" type="#_x0000_t202" style="position:absolute;top:2896;width:35784;height:19908;visibility:visible;mso-wrap-style:square;v-text-anchor:top" o:gfxdata="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" filled="f" stroked="f" strokeweight=".5pt">
                       <v:textbox inset=",7.2pt,,0">
                         <w:txbxContent>
                           <w:p>
@@ -1857,7 +1868,14 @@
                               <w:rPr>
                                 <w:color w:val="auto"/>
                               </w:rPr>
-                              <w:t xml:space="preserve"> will be given if you try to bypass the SafeAssi</w:t>
+                              <w:t xml:space="preserve"> will be given if you try to bypass the </w:t>
+                            </w:r>
+                            <w:proofErr w:type="spellStart"/>
+                            <w:r>
+                              <w:rPr>
+                                <w:color w:val="auto"/>
+                              </w:rPr>
+                              <w:t>SafeAssi</w:t>
                             </w:r>
                             <w:r>
                               <w:rPr>
@@ -1865,6 +1883,7 @@
                               </w:rPr>
                               <w:t>gn</w:t>
                             </w:r>
+                            <w:proofErr w:type="spellEnd"/>
                             <w:r>
                               <w:rPr>
                                 <w:color w:val="auto"/>
@@ -2623,11 +2642,7 @@
               </mc:Choice>
               <mc:Fallback>
                 <w:pict>
-                  <v:shapetype w14:anchorId="7CBAAF0B" id="_x0000_t202" coordsize="21600,21600" o:spt="202" path="m,l,21600r21600,l21600,xe">
-                    <v:stroke joinstyle="miter"/>
-                    <v:path gradientshapeok="t" o:connecttype="rect"/>
-                  </v:shapetype>
-                  <v:shape id="Text Box 15" o:spid="_x0000_s1031" type="#_x0000_t202" alt="contact info" style="position:absolute;margin-left:36pt;margin-top:228.75pt;width:540pt;height:99.75pt;z-index:251675648;visibility:visible;mso-wrap-style:square;mso-width-percent:1282;mso-height-percent:0;mso-wrap-distance-left:9pt;mso-wrap-distance-top:0;mso-wrap-distance-right:9pt;mso-wrap-distance-bottom:0;mso-position-horizontal:absolute;mso-position-horizontal-relative:page;mso-position-vertical:absolute;mso-position-vertical-relative:margin;mso-width-percent:1282;mso-height-percent:0;mso-width-relative:margin;mso-height-relative:margin;v-text-anchor:bottom" o:gfxdata="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" o:allowoverlap="f" filled="f" stroked="f" strokeweight=".5pt">
+                  <v:shape w14:anchorId="7CBAAF0B" id="Text Box 15" o:spid="_x0000_s1031" type="#_x0000_t202" alt="contact info" style="position:absolute;margin-left:36pt;margin-top:228.75pt;width:540pt;height:99.75pt;z-index:251675648;visibility:visible;mso-wrap-style:square;mso-width-percent:1282;mso-height-percent:0;mso-wrap-distance-left:9pt;mso-wrap-distance-top:0;mso-wrap-distance-right:9pt;mso-wrap-distance-bottom:0;mso-position-horizontal:absolute;mso-position-horizontal-relative:page;mso-position-vertical:absolute;mso-position-vertical-relative:margin;mso-width-percent:1282;mso-height-percent:0;mso-width-relative:margin;mso-height-relative:margin;v-text-anchor:bottom" o:gfxdata="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" o:allowoverlap="f" filled="f" stroked="f" strokeweight=".5pt">
                     <v:textbox inset="0,0,0,0">
                       <w:txbxContent>
                         <w:p>
@@ -3701,7 +3716,25 @@
           <w:sz w:val="24"/>
           <w:szCs w:val="24"/>
         </w:rPr>
-        <w:t>Task 1 : database design</w:t>
+        <w:t xml:space="preserve">Task </w:t>
+      </w:r>
+      <w:proofErr w:type="gramStart"/>
+      <w:r>
+        <w:rPr>
+          <w:rFonts w:ascii="Times New Roman" w:hAnsi="Times New Roman" w:cs="Times New Roman"/>
+          <w:sz w:val="24"/>
+          <w:szCs w:val="24"/>
+        </w:rPr>
+        <w:t>1 :</w:t>
+      </w:r>
+      <w:proofErr w:type="gramEnd"/>
+      <w:r>
+        <w:rPr>
+          <w:rFonts w:ascii="Times New Roman" w:hAnsi="Times New Roman" w:cs="Times New Roman"/>
+          <w:sz w:val="24"/>
+          <w:szCs w:val="24"/>
+        </w:rPr>
+        <w:t xml:space="preserve"> database design</w:t>
       </w:r>
     </w:p>
     <w:p>
@@ -3944,7 +3977,25 @@
           <w:sz w:val="24"/>
           <w:szCs w:val="24"/>
         </w:rPr>
-        <w:t xml:space="preserve"> (or GitLab) repository containing the complete project with regular commits and meaningful commit messages.</w:t>
+        <w:t xml:space="preserve"> (or </w:t>
+      </w:r>
+      <w:proofErr w:type="spellStart"/>
+      <w:r>
+        <w:rPr>
+          <w:rFonts w:ascii="Times New Roman" w:hAnsi="Times New Roman" w:cs="Times New Roman"/>
+          <w:sz w:val="24"/>
+          <w:szCs w:val="24"/>
+        </w:rPr>
+        <w:t>GitLab</w:t>
+      </w:r>
+      <w:proofErr w:type="spellEnd"/>
+      <w:r>
+        <w:rPr>
+          <w:rFonts w:ascii="Times New Roman" w:hAnsi="Times New Roman" w:cs="Times New Roman"/>
+          <w:sz w:val="24"/>
+          <w:szCs w:val="24"/>
+        </w:rPr>
+        <w:t>) repository containing the complete project with regular commits and meaningful commit messages.</w:t>
       </w:r>
     </w:p>
     <w:p>
@@ -4030,7 +4081,43 @@
           <w:sz w:val="24"/>
           <w:szCs w:val="24"/>
         </w:rPr>
-        <w:t xml:space="preserve"> to the live report document, GitHub/GitLab repository, and Google Colab notebook (if applicable) in the </w:t>
+        <w:t xml:space="preserve"> to the live report document, GitHub/</w:t>
+      </w:r>
+      <w:proofErr w:type="spellStart"/>
+      <w:r>
+        <w:rPr>
+          <w:rFonts w:ascii="Times New Roman" w:hAnsi="Times New Roman" w:cs="Times New Roman"/>
+          <w:sz w:val="24"/>
+          <w:szCs w:val="24"/>
+        </w:rPr>
+        <w:t>GitLab</w:t>
+      </w:r>
+      <w:proofErr w:type="spellEnd"/>
+      <w:r>
+        <w:rPr>
+          <w:rFonts w:ascii="Times New Roman" w:hAnsi="Times New Roman" w:cs="Times New Roman"/>
+          <w:sz w:val="24"/>
+          <w:szCs w:val="24"/>
+        </w:rPr>
+        <w:t xml:space="preserve"> repository, and Google </w:t>
+      </w:r>
+      <w:proofErr w:type="spellStart"/>
+      <w:r>
+        <w:rPr>
+          <w:rFonts w:ascii="Times New Roman" w:hAnsi="Times New Roman" w:cs="Times New Roman"/>
+          <w:sz w:val="24"/>
+          <w:szCs w:val="24"/>
+        </w:rPr>
+        <w:t>Colab</w:t>
+      </w:r>
+      <w:proofErr w:type="spellEnd"/>
+      <w:r>
+        <w:rPr>
+          <w:rFonts w:ascii="Times New Roman" w:hAnsi="Times New Roman" w:cs="Times New Roman"/>
+          <w:sz w:val="24"/>
+          <w:szCs w:val="24"/>
+        </w:rPr>
+        <w:t xml:space="preserve"> notebook (if applicable) in the </w:t>
       </w:r>
       <w:r>
         <w:rPr>
@@ -4581,9 +4668,9 @@
               </wp:anchor>
             </w:drawing>
           </mc:Choice>
-          <mc:Fallback xmlns:w16du="http://schemas.microsoft.com/office/word/2023/wordml/word16du" xmlns:w16sdtfl="http://schemas.microsoft.com/office/word/2024/wordml/sdtformatlock" xmlns:w16sdtdh="http://schemas.microsoft.com/office/word/2020/wordml/sdtdatahash" xmlns:w16="http://schemas.microsoft.com/office/word/2018/wordml" xmlns:w16cid="http://schemas.microsoft.com/office/word/2016/wordml/cid" xmlns:w16cex="http://schemas.microsoft.com/office/word/2018/wordml/cex" xmlns:w16cei="http://schemas.microsoft.com/office/word/2026/wordml/cei" xmlns:oel="http://schemas.microsoft.com/office/2019/extlst" xmlns:am3d="http://schemas.microsoft.com/office/drawing/2017/model3d" xmlns:aink="http://schemas.microsoft.com/office/drawing/2016/ink" xmlns:cx8="http://schemas.microsoft.com/office/drawing/2016/5/14/chartex" xmlns:cx7="http://schemas.microsoft.com/office/drawing/2016/5/13/chartex" xmlns:cx6="http://schemas.microsoft.com/office/drawing/2016/5/12/chartex" xmlns:cx5="http://schemas.microsoft.com/office/drawing/2016/5/11/chartex" xmlns:cx4="http://schemas.microsoft.com/office/drawing/2016/5/10/chartex" xmlns:cx3="http://schemas.microsoft.com/office/drawing/2016/5/9/chartex" xmlns:cx2="http://schemas.microsoft.com/office/drawing/2015/10/21/chartex" xmlns:cx1="http://schemas.microsoft.com/office/drawing/2015/9/8/chartex">
+          <mc:Fallback>
             <w:pict>
-              <v:shape w14:anchorId="2E8B6DDD" id="Text Box 1" o:spid="_x0000_s1032" type="#_x0000_t202" alt="Sidebar" style="position:absolute;left:0;text-align:left;margin-left:32.5pt;margin-top:6.6pt;width:95.9pt;height:181.45pt;z-index:251681792;visibility:visible;mso-wrap-style:square;mso-width-percent:250;mso-height-percent:950;mso-wrap-distance-left:14.4pt;mso-wrap-distance-top:0;mso-wrap-distance-right:14.4pt;mso-wrap-distance-bottom:3in;mso-position-horizontal:absolute;mso-position-horizontal-relative:page;mso-position-vertical:absolute;mso-position-vertical-relative:margin;mso-width-percent:250;mso-height-percent:950;mso-width-relative:margin;mso-height-relative:margin;v-text-anchor:top" o:gfxdata="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" filled="f" stroked="f" strokeweight=".5pt">
+              <v:shape w14:anchorId="2E8B6DDD" id="Text Box 1" o:spid="_x0000_s1032" type="#_x0000_t202" alt="Sidebar" style="position:absolute;left:0;text-align:left;margin-left:32.5pt;margin-top:6.6pt;width:95.9pt;height:181.45pt;z-index:251681792;visibility:visible;mso-wrap-style:square;mso-width-percent:250;mso-height-percent:950;mso-wrap-distance-left:14.4pt;mso-wrap-distance-top:0;mso-wrap-distance-right:14.4pt;mso-wrap-distance-bottom:3in;mso-position-horizontal:absolute;mso-position-horizontal-relative:page;mso-position-vertical:absolute;mso-position-vertical-relative:margin;mso-width-percent:250;mso-height-percent:950;mso-width-relative:margin;mso-height-relative:margin;v-text-anchor:top" o:gfxdata="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" filled="f" stroked="f" strokeweight=".5pt">
                 <v:textbox inset="3.6pt,0,3.6pt,0">
                   <w:txbxContent>
                     <w:p>
@@ -4761,13 +4848,23 @@
           <w:szCs w:val="24"/>
         </w:rPr>
       </w:pPr>
-      <w:r>
-        <w:rPr>
-          <w:rFonts w:ascii="Times New Roman" w:hAnsi="Times New Roman" w:cs="Times New Roman"/>
-          <w:sz w:val="24"/>
-          <w:szCs w:val="24"/>
-        </w:rPr>
-        <w:t>Design a complete database for the clinic that includes at least six entities such as Patients, Doctors, Appointments, Treatments, Medicines, Payments, or any other appropriate entities.</w:t>
+      <w:bookmarkStart w:id="5" w:name="_GoBack"/>
+      <w:r>
+        <w:rPr>
+          <w:rFonts w:ascii="Times New Roman" w:hAnsi="Times New Roman" w:cs="Times New Roman"/>
+          <w:sz w:val="24"/>
+          <w:szCs w:val="24"/>
+        </w:rPr>
+        <w:t xml:space="preserve">Design a complete database </w:t>
+      </w:r>
+      <w:bookmarkEnd w:id="5"/>
+      <w:r>
+        <w:rPr>
+          <w:rFonts w:ascii="Times New Roman" w:hAnsi="Times New Roman" w:cs="Times New Roman"/>
+          <w:sz w:val="24"/>
+          <w:szCs w:val="24"/>
+        </w:rPr>
+        <w:t>for the clinic that includes at least six entities such as Patients, Doctors, Appointments, Treatments, Medicines, Payments, or any other appropriate entities.</w:t>
       </w:r>
     </w:p>
     <w:p>
@@ -4787,7 +4884,27 @@
           <w:szCs w:val="24"/>
           <w:lang w:val="es-ES"/>
         </w:rPr>
-        <w:t>A complete ER/EER diagram.</w:t>
+        <w:t xml:space="preserve">A complete ER/EER </w:t>
+      </w:r>
+      <w:proofErr w:type="spellStart"/>
+      <w:r>
+        <w:rPr>
+          <w:rFonts w:ascii="Times New Roman" w:hAnsi="Times New Roman" w:cs="Times New Roman"/>
+          <w:sz w:val="24"/>
+          <w:szCs w:val="24"/>
+          <w:lang w:val="es-ES"/>
+        </w:rPr>
+        <w:t>diagram</w:t>
+      </w:r>
+      <w:proofErr w:type="spellEnd"/>
+      <w:r>
+        <w:rPr>
+          <w:rFonts w:ascii="Times New Roman" w:hAnsi="Times New Roman" w:cs="Times New Roman"/>
+          <w:sz w:val="24"/>
+          <w:szCs w:val="24"/>
+          <w:lang w:val="es-ES"/>
+        </w:rPr>
+        <w:t>.</w:t>
       </w:r>
     </w:p>
     <w:p>
@@ -4885,7 +5002,7 @@
           <w:bCs/>
         </w:rPr>
       </w:pPr>
-      <w:bookmarkStart w:id="4" w:name="_Hlk235258935"/>
+      <w:bookmarkStart w:id="6" w:name="_Hlk235258935"/>
       <w:r>
         <w:rPr>
           <w:b/>
@@ -4898,11 +5015,3731 @@
       <w:pPr>
         <w:pStyle w:val="IT"/>
         <w:rPr>
+          <w:b/>
+          <w:bCs/>
+          <w:color w:val="EF4623" w:themeColor="accent1"/>
+        </w:rPr>
+      </w:pPr>
+      <w:r>
+        <w:rPr>
+          <w:b/>
+          <w:bCs/>
+          <w:color w:val="EF4623" w:themeColor="accent1"/>
+          <w:highlight w:val="yellow"/>
+        </w:rPr>
+        <w:t>1)</w:t>
+      </w:r>
+    </w:p>
+    <w:p>
+      <w:pPr>
+        <w:pStyle w:val="IT"/>
+        <w:rPr>
           <w:lang/>
         </w:rPr>
       </w:pPr>
+      <w:r>
+        <w:rPr>
+          <w:b/>
+          <w:bCs/>
+          <w:lang/>
+        </w:rPr>
+        <w:t>Smart Clinic Database Design</w:t>
+      </w:r>
     </w:p>
-    <w:bookmarkEnd w:id="4"/>
+    <w:p>
+      <w:pPr>
+        <w:pStyle w:val="IT"/>
+        <w:rPr>
+          <w:lang/>
+        </w:rPr>
+      </w:pPr>
+      <w:r>
+        <w:rPr>
+          <w:lang/>
+        </w:rPr>
+        <w:t>The database contains six related entities: Patients, Doctors, Appointments, Medicines, Treatments, and Payments. It supports patient registration, appointment scheduling, treatment documentation, medicine recording, and payment tracking.</w:t>
+      </w:r>
+    </w:p>
+    <w:p>
+      <w:pPr>
+        <w:pStyle w:val="IT"/>
+        <w:rPr>
+          <w:lang/>
+        </w:rPr>
+      </w:pPr>
+      <w:r>
+        <w:rPr>
+          <w:b/>
+          <w:bCs/>
+          <w:lang/>
+        </w:rPr>
+        <w:t>1. Patients</w:t>
+      </w:r>
+    </w:p>
+    <w:p>
+      <w:pPr>
+        <w:pStyle w:val="IT"/>
+        <w:rPr>
+          <w:lang/>
+        </w:rPr>
+      </w:pPr>
+      <w:r>
+        <w:rPr>
+          <w:lang/>
+        </w:rPr>
+        <w:t>Stores the personal and contact information of each clinic patient.</w:t>
+      </w:r>
+    </w:p>
+    <w:tbl>
+      <w:tblPr>
+        <w:tblStyle w:val="GridTable3-Accent1"/>
+        <w:tblW w:w="0" w:type="auto"/>
+        <w:tblLook w:val="04A0" w:firstRow="1" w:lastRow="0" w:firstColumn="1" w:lastColumn="0" w:noHBand="0" w:noVBand="1"/>
+      </w:tblPr>
+      <w:tblGrid>
+        <w:gridCol w:w="1523"/>
+        <w:gridCol w:w="1879"/>
+        <w:gridCol w:w="2953"/>
+      </w:tblGrid>
+      <w:tr>
+        <w:trPr>
+          <w:cnfStyle w:val="100000000000" w:firstRow="1" w:lastRow="0" w:firstColumn="0" w:lastColumn="0" w:oddVBand="0" w:evenVBand="0" w:oddHBand="0" w:evenHBand="0" w:firstRowFirstColumn="0" w:firstRowLastColumn="0" w:lastRowFirstColumn="0" w:lastRowLastColumn="0"/>
+        </w:trPr>
+        <w:tc>
+          <w:tcPr>
+            <w:cnfStyle w:val="001000000100" w:firstRow="0" w:lastRow="0" w:firstColumn="1" w:lastColumn="0" w:oddVBand="0" w:evenVBand="0" w:oddHBand="0" w:evenHBand="0" w:firstRowFirstColumn="1" w:firstRowLastColumn="0" w:lastRowFirstColumn="0" w:lastRowLastColumn="0"/>
+            <w:tcW w:w="0" w:type="auto"/>
+            <w:hideMark/>
+          </w:tcPr>
+          <w:p>
+            <w:pPr>
+              <w:pStyle w:val="IT"/>
+              <w:rPr>
+                <w:lang/>
+              </w:rPr>
+            </w:pPr>
+            <w:r>
+              <w:rPr>
+                <w:lang/>
+              </w:rPr>
+              <w:t>Attribute</w:t>
+            </w:r>
+          </w:p>
+        </w:tc>
+        <w:tc>
+          <w:tcPr>
+            <w:tcW w:w="0" w:type="auto"/>
+            <w:hideMark/>
+          </w:tcPr>
+          <w:p>
+            <w:pPr>
+              <w:pStyle w:val="IT"/>
+              <w:cnfStyle w:val="100000000000" w:firstRow="1" w:lastRow="0" w:firstColumn="0" w:lastColumn="0" w:oddVBand="0" w:evenVBand="0" w:oddHBand="0" w:evenHBand="0" w:firstRowFirstColumn="0" w:firstRowLastColumn="0" w:lastRowFirstColumn="0" w:lastRowLastColumn="0"/>
+              <w:rPr>
+                <w:lang/>
+              </w:rPr>
+            </w:pPr>
+            <w:r>
+              <w:rPr>
+                <w:lang/>
+              </w:rPr>
+              <w:t>Data Type</w:t>
+            </w:r>
+          </w:p>
+        </w:tc>
+        <w:tc>
+          <w:tcPr>
+            <w:tcW w:w="0" w:type="auto"/>
+            <w:hideMark/>
+          </w:tcPr>
+          <w:p>
+            <w:pPr>
+              <w:pStyle w:val="IT"/>
+              <w:cnfStyle w:val="100000000000" w:firstRow="1" w:lastRow="0" w:firstColumn="0" w:lastColumn="0" w:oddVBand="0" w:evenVBand="0" w:oddHBand="0" w:evenHBand="0" w:firstRowFirstColumn="0" w:firstRowLastColumn="0" w:lastRowFirstColumn="0" w:lastRowLastColumn="0"/>
+              <w:rPr>
+                <w:lang/>
+              </w:rPr>
+            </w:pPr>
+            <w:r>
+              <w:rPr>
+                <w:lang/>
+              </w:rPr>
+              <w:t>Constraint</w:t>
+            </w:r>
+          </w:p>
+        </w:tc>
+      </w:tr>
+      <w:tr>
+        <w:trPr>
+          <w:cnfStyle w:val="000000100000" w:firstRow="0" w:lastRow="0" w:firstColumn="0" w:lastColumn="0" w:oddVBand="0" w:evenVBand="0" w:oddHBand="1" w:evenHBand="0" w:firstRowFirstColumn="0" w:firstRowLastColumn="0" w:lastRowFirstColumn="0" w:lastRowLastColumn="0"/>
+        </w:trPr>
+        <w:tc>
+          <w:tcPr>
+            <w:cnfStyle w:val="001000000000" w:firstRow="0" w:lastRow="0" w:firstColumn="1" w:lastColumn="0" w:oddVBand="0" w:evenVBand="0" w:oddHBand="0" w:evenHBand="0" w:firstRowFirstColumn="0" w:firstRowLastColumn="0" w:lastRowFirstColumn="0" w:lastRowLastColumn="0"/>
+            <w:tcW w:w="0" w:type="auto"/>
+            <w:hideMark/>
+          </w:tcPr>
+          <w:p>
+            <w:pPr>
+              <w:pStyle w:val="IT"/>
+              <w:rPr>
+                <w:lang/>
+              </w:rPr>
+            </w:pPr>
+            <w:r>
+              <w:rPr>
+                <w:lang/>
+              </w:rPr>
+              <w:t>patient_id</w:t>
+            </w:r>
+          </w:p>
+        </w:tc>
+        <w:tc>
+          <w:tcPr>
+            <w:tcW w:w="0" w:type="auto"/>
+            <w:hideMark/>
+          </w:tcPr>
+          <w:p>
+            <w:pPr>
+              <w:pStyle w:val="IT"/>
+              <w:cnfStyle w:val="000000100000" w:firstRow="0" w:lastRow="0" w:firstColumn="0" w:lastColumn="0" w:oddVBand="0" w:evenVBand="0" w:oddHBand="1" w:evenHBand="0" w:firstRowFirstColumn="0" w:firstRowLastColumn="0" w:lastRowFirstColumn="0" w:lastRowLastColumn="0"/>
+              <w:rPr>
+                <w:lang/>
+              </w:rPr>
+            </w:pPr>
+            <w:r>
+              <w:rPr>
+                <w:lang/>
+              </w:rPr>
+              <w:t>INT</w:t>
+            </w:r>
+          </w:p>
+        </w:tc>
+        <w:tc>
+          <w:tcPr>
+            <w:tcW w:w="0" w:type="auto"/>
+            <w:hideMark/>
+          </w:tcPr>
+          <w:p>
+            <w:pPr>
+              <w:pStyle w:val="IT"/>
+              <w:cnfStyle w:val="000000100000" w:firstRow="0" w:lastRow="0" w:firstColumn="0" w:lastColumn="0" w:oddVBand="0" w:evenVBand="0" w:oddHBand="1" w:evenHBand="0" w:firstRowFirstColumn="0" w:firstRowLastColumn="0" w:lastRowFirstColumn="0" w:lastRowLastColumn="0"/>
+              <w:rPr>
+                <w:lang/>
+              </w:rPr>
+            </w:pPr>
+            <w:r>
+              <w:rPr>
+                <w:lang/>
+              </w:rPr>
+              <w:t>Primary key, auto-increment</w:t>
+            </w:r>
+          </w:p>
+        </w:tc>
+      </w:tr>
+      <w:tr>
+        <w:tc>
+          <w:tcPr>
+            <w:cnfStyle w:val="001000000000" w:firstRow="0" w:lastRow="0" w:firstColumn="1" w:lastColumn="0" w:oddVBand="0" w:evenVBand="0" w:oddHBand="0" w:evenHBand="0" w:firstRowFirstColumn="0" w:firstRowLastColumn="0" w:lastRowFirstColumn="0" w:lastRowLastColumn="0"/>
+            <w:tcW w:w="0" w:type="auto"/>
+            <w:hideMark/>
+          </w:tcPr>
+          <w:p>
+            <w:pPr>
+              <w:pStyle w:val="IT"/>
+              <w:rPr>
+                <w:lang/>
+              </w:rPr>
+            </w:pPr>
+            <w:r>
+              <w:rPr>
+                <w:lang/>
+              </w:rPr>
+              <w:t>first_name</w:t>
+            </w:r>
+          </w:p>
+        </w:tc>
+        <w:tc>
+          <w:tcPr>
+            <w:tcW w:w="0" w:type="auto"/>
+            <w:hideMark/>
+          </w:tcPr>
+          <w:p>
+            <w:pPr>
+              <w:pStyle w:val="IT"/>
+              <w:cnfStyle w:val="000000000000" w:firstRow="0" w:lastRow="0" w:firstColumn="0" w:lastColumn="0" w:oddVBand="0" w:evenVBand="0" w:oddHBand="0" w:evenHBand="0" w:firstRowFirstColumn="0" w:firstRowLastColumn="0" w:lastRowFirstColumn="0" w:lastRowLastColumn="0"/>
+              <w:rPr>
+                <w:lang/>
+              </w:rPr>
+            </w:pPr>
+            <w:r>
+              <w:rPr>
+                <w:lang/>
+              </w:rPr>
+              <w:t>VARCHAR(50)</w:t>
+            </w:r>
+          </w:p>
+        </w:tc>
+        <w:tc>
+          <w:tcPr>
+            <w:tcW w:w="0" w:type="auto"/>
+            <w:hideMark/>
+          </w:tcPr>
+          <w:p>
+            <w:pPr>
+              <w:pStyle w:val="IT"/>
+              <w:cnfStyle w:val="000000000000" w:firstRow="0" w:lastRow="0" w:firstColumn="0" w:lastColumn="0" w:oddVBand="0" w:evenVBand="0" w:oddHBand="0" w:evenHBand="0" w:firstRowFirstColumn="0" w:firstRowLastColumn="0" w:lastRowFirstColumn="0" w:lastRowLastColumn="0"/>
+              <w:rPr>
+                <w:lang/>
+              </w:rPr>
+            </w:pPr>
+            <w:r>
+              <w:rPr>
+                <w:lang/>
+              </w:rPr>
+              <w:t>Not null</w:t>
+            </w:r>
+          </w:p>
+        </w:tc>
+      </w:tr>
+      <w:tr>
+        <w:trPr>
+          <w:cnfStyle w:val="000000100000" w:firstRow="0" w:lastRow="0" w:firstColumn="0" w:lastColumn="0" w:oddVBand="0" w:evenVBand="0" w:oddHBand="1" w:evenHBand="0" w:firstRowFirstColumn="0" w:firstRowLastColumn="0" w:lastRowFirstColumn="0" w:lastRowLastColumn="0"/>
+        </w:trPr>
+        <w:tc>
+          <w:tcPr>
+            <w:cnfStyle w:val="001000000000" w:firstRow="0" w:lastRow="0" w:firstColumn="1" w:lastColumn="0" w:oddVBand="0" w:evenVBand="0" w:oddHBand="0" w:evenHBand="0" w:firstRowFirstColumn="0" w:firstRowLastColumn="0" w:lastRowFirstColumn="0" w:lastRowLastColumn="0"/>
+            <w:tcW w:w="0" w:type="auto"/>
+            <w:hideMark/>
+          </w:tcPr>
+          <w:p>
+            <w:pPr>
+              <w:pStyle w:val="IT"/>
+              <w:rPr>
+                <w:lang/>
+              </w:rPr>
+            </w:pPr>
+            <w:r>
+              <w:rPr>
+                <w:lang/>
+              </w:rPr>
+              <w:t>last_name</w:t>
+            </w:r>
+          </w:p>
+        </w:tc>
+        <w:tc>
+          <w:tcPr>
+            <w:tcW w:w="0" w:type="auto"/>
+            <w:hideMark/>
+          </w:tcPr>
+          <w:p>
+            <w:pPr>
+              <w:pStyle w:val="IT"/>
+              <w:cnfStyle w:val="000000100000" w:firstRow="0" w:lastRow="0" w:firstColumn="0" w:lastColumn="0" w:oddVBand="0" w:evenVBand="0" w:oddHBand="1" w:evenHBand="0" w:firstRowFirstColumn="0" w:firstRowLastColumn="0" w:lastRowFirstColumn="0" w:lastRowLastColumn="0"/>
+              <w:rPr>
+                <w:lang/>
+              </w:rPr>
+            </w:pPr>
+            <w:r>
+              <w:rPr>
+                <w:lang/>
+              </w:rPr>
+              <w:t>VARCHAR(50)</w:t>
+            </w:r>
+          </w:p>
+        </w:tc>
+        <w:tc>
+          <w:tcPr>
+            <w:tcW w:w="0" w:type="auto"/>
+            <w:hideMark/>
+          </w:tcPr>
+          <w:p>
+            <w:pPr>
+              <w:pStyle w:val="IT"/>
+              <w:cnfStyle w:val="000000100000" w:firstRow="0" w:lastRow="0" w:firstColumn="0" w:lastColumn="0" w:oddVBand="0" w:evenVBand="0" w:oddHBand="1" w:evenHBand="0" w:firstRowFirstColumn="0" w:firstRowLastColumn="0" w:lastRowFirstColumn="0" w:lastRowLastColumn="0"/>
+              <w:rPr>
+                <w:lang/>
+              </w:rPr>
+            </w:pPr>
+            <w:r>
+              <w:rPr>
+                <w:lang/>
+              </w:rPr>
+              <w:t>Not null</w:t>
+            </w:r>
+          </w:p>
+        </w:tc>
+      </w:tr>
+      <w:tr>
+        <w:tc>
+          <w:tcPr>
+            <w:cnfStyle w:val="001000000000" w:firstRow="0" w:lastRow="0" w:firstColumn="1" w:lastColumn="0" w:oddVBand="0" w:evenVBand="0" w:oddHBand="0" w:evenHBand="0" w:firstRowFirstColumn="0" w:firstRowLastColumn="0" w:lastRowFirstColumn="0" w:lastRowLastColumn="0"/>
+            <w:tcW w:w="0" w:type="auto"/>
+            <w:hideMark/>
+          </w:tcPr>
+          <w:p>
+            <w:pPr>
+              <w:pStyle w:val="IT"/>
+              <w:rPr>
+                <w:lang/>
+              </w:rPr>
+            </w:pPr>
+            <w:r>
+              <w:rPr>
+                <w:lang/>
+              </w:rPr>
+              <w:t>gender</w:t>
+            </w:r>
+          </w:p>
+        </w:tc>
+        <w:tc>
+          <w:tcPr>
+            <w:tcW w:w="0" w:type="auto"/>
+            <w:hideMark/>
+          </w:tcPr>
+          <w:p>
+            <w:pPr>
+              <w:pStyle w:val="IT"/>
+              <w:cnfStyle w:val="000000000000" w:firstRow="0" w:lastRow="0" w:firstColumn="0" w:lastColumn="0" w:oddVBand="0" w:evenVBand="0" w:oddHBand="0" w:evenHBand="0" w:firstRowFirstColumn="0" w:firstRowLastColumn="0" w:lastRowFirstColumn="0" w:lastRowLastColumn="0"/>
+              <w:rPr>
+                <w:lang/>
+              </w:rPr>
+            </w:pPr>
+            <w:r>
+              <w:rPr>
+                <w:lang/>
+              </w:rPr>
+              <w:t>ENUM</w:t>
+            </w:r>
+          </w:p>
+        </w:tc>
+        <w:tc>
+          <w:tcPr>
+            <w:tcW w:w="0" w:type="auto"/>
+            <w:hideMark/>
+          </w:tcPr>
+          <w:p>
+            <w:pPr>
+              <w:pStyle w:val="IT"/>
+              <w:cnfStyle w:val="000000000000" w:firstRow="0" w:lastRow="0" w:firstColumn="0" w:lastColumn="0" w:oddVBand="0" w:evenVBand="0" w:oddHBand="0" w:evenHBand="0" w:firstRowFirstColumn="0" w:firstRowLastColumn="0" w:lastRowFirstColumn="0" w:lastRowLastColumn="0"/>
+              <w:rPr>
+                <w:lang/>
+              </w:rPr>
+            </w:pPr>
+            <w:r>
+              <w:rPr>
+                <w:lang/>
+              </w:rPr>
+              <w:t>Not null</w:t>
+            </w:r>
+          </w:p>
+        </w:tc>
+      </w:tr>
+      <w:tr>
+        <w:trPr>
+          <w:cnfStyle w:val="000000100000" w:firstRow="0" w:lastRow="0" w:firstColumn="0" w:lastColumn="0" w:oddVBand="0" w:evenVBand="0" w:oddHBand="1" w:evenHBand="0" w:firstRowFirstColumn="0" w:firstRowLastColumn="0" w:lastRowFirstColumn="0" w:lastRowLastColumn="0"/>
+        </w:trPr>
+        <w:tc>
+          <w:tcPr>
+            <w:cnfStyle w:val="001000000000" w:firstRow="0" w:lastRow="0" w:firstColumn="1" w:lastColumn="0" w:oddVBand="0" w:evenVBand="0" w:oddHBand="0" w:evenHBand="0" w:firstRowFirstColumn="0" w:firstRowLastColumn="0" w:lastRowFirstColumn="0" w:lastRowLastColumn="0"/>
+            <w:tcW w:w="0" w:type="auto"/>
+            <w:hideMark/>
+          </w:tcPr>
+          <w:p>
+            <w:pPr>
+              <w:pStyle w:val="IT"/>
+              <w:rPr>
+                <w:lang/>
+              </w:rPr>
+            </w:pPr>
+            <w:r>
+              <w:rPr>
+                <w:lang/>
+              </w:rPr>
+              <w:t>date_of_birth</w:t>
+            </w:r>
+          </w:p>
+        </w:tc>
+        <w:tc>
+          <w:tcPr>
+            <w:tcW w:w="0" w:type="auto"/>
+            <w:hideMark/>
+          </w:tcPr>
+          <w:p>
+            <w:pPr>
+              <w:pStyle w:val="IT"/>
+              <w:cnfStyle w:val="000000100000" w:firstRow="0" w:lastRow="0" w:firstColumn="0" w:lastColumn="0" w:oddVBand="0" w:evenVBand="0" w:oddHBand="1" w:evenHBand="0" w:firstRowFirstColumn="0" w:firstRowLastColumn="0" w:lastRowFirstColumn="0" w:lastRowLastColumn="0"/>
+              <w:rPr>
+                <w:lang/>
+              </w:rPr>
+            </w:pPr>
+            <w:r>
+              <w:rPr>
+                <w:lang/>
+              </w:rPr>
+              <w:t>DATE</w:t>
+            </w:r>
+          </w:p>
+        </w:tc>
+        <w:tc>
+          <w:tcPr>
+            <w:tcW w:w="0" w:type="auto"/>
+            <w:hideMark/>
+          </w:tcPr>
+          <w:p>
+            <w:pPr>
+              <w:pStyle w:val="IT"/>
+              <w:cnfStyle w:val="000000100000" w:firstRow="0" w:lastRow="0" w:firstColumn="0" w:lastColumn="0" w:oddVBand="0" w:evenVBand="0" w:oddHBand="1" w:evenHBand="0" w:firstRowFirstColumn="0" w:firstRowLastColumn="0" w:lastRowFirstColumn="0" w:lastRowLastColumn="0"/>
+              <w:rPr>
+                <w:lang/>
+              </w:rPr>
+            </w:pPr>
+            <w:r>
+              <w:rPr>
+                <w:lang/>
+              </w:rPr>
+              <w:t>Not null</w:t>
+            </w:r>
+          </w:p>
+        </w:tc>
+      </w:tr>
+      <w:tr>
+        <w:tc>
+          <w:tcPr>
+            <w:cnfStyle w:val="001000000000" w:firstRow="0" w:lastRow="0" w:firstColumn="1" w:lastColumn="0" w:oddVBand="0" w:evenVBand="0" w:oddHBand="0" w:evenHBand="0" w:firstRowFirstColumn="0" w:firstRowLastColumn="0" w:lastRowFirstColumn="0" w:lastRowLastColumn="0"/>
+            <w:tcW w:w="0" w:type="auto"/>
+            <w:hideMark/>
+          </w:tcPr>
+          <w:p>
+            <w:pPr>
+              <w:pStyle w:val="IT"/>
+              <w:rPr>
+                <w:lang/>
+              </w:rPr>
+            </w:pPr>
+            <w:r>
+              <w:rPr>
+                <w:lang/>
+              </w:rPr>
+              <w:lastRenderedPageBreak/>
+              <w:t>phone</w:t>
+            </w:r>
+          </w:p>
+        </w:tc>
+        <w:tc>
+          <w:tcPr>
+            <w:tcW w:w="0" w:type="auto"/>
+            <w:hideMark/>
+          </w:tcPr>
+          <w:p>
+            <w:pPr>
+              <w:pStyle w:val="IT"/>
+              <w:cnfStyle w:val="000000000000" w:firstRow="0" w:lastRow="0" w:firstColumn="0" w:lastColumn="0" w:oddVBand="0" w:evenVBand="0" w:oddHBand="0" w:evenHBand="0" w:firstRowFirstColumn="0" w:firstRowLastColumn="0" w:lastRowFirstColumn="0" w:lastRowLastColumn="0"/>
+              <w:rPr>
+                <w:lang/>
+              </w:rPr>
+            </w:pPr>
+            <w:r>
+              <w:rPr>
+                <w:lang/>
+              </w:rPr>
+              <w:t>VARCHAR(20)</w:t>
+            </w:r>
+          </w:p>
+        </w:tc>
+        <w:tc>
+          <w:tcPr>
+            <w:tcW w:w="0" w:type="auto"/>
+            <w:hideMark/>
+          </w:tcPr>
+          <w:p>
+            <w:pPr>
+              <w:pStyle w:val="IT"/>
+              <w:cnfStyle w:val="000000000000" w:firstRow="0" w:lastRow="0" w:firstColumn="0" w:lastColumn="0" w:oddVBand="0" w:evenVBand="0" w:oddHBand="0" w:evenHBand="0" w:firstRowFirstColumn="0" w:firstRowLastColumn="0" w:lastRowFirstColumn="0" w:lastRowLastColumn="0"/>
+              <w:rPr>
+                <w:lang/>
+              </w:rPr>
+            </w:pPr>
+            <w:r>
+              <w:rPr>
+                <w:lang/>
+              </w:rPr>
+              <w:t>Unique, not null</w:t>
+            </w:r>
+          </w:p>
+        </w:tc>
+      </w:tr>
+      <w:tr>
+        <w:trPr>
+          <w:cnfStyle w:val="000000100000" w:firstRow="0" w:lastRow="0" w:firstColumn="0" w:lastColumn="0" w:oddVBand="0" w:evenVBand="0" w:oddHBand="1" w:evenHBand="0" w:firstRowFirstColumn="0" w:firstRowLastColumn="0" w:lastRowFirstColumn="0" w:lastRowLastColumn="0"/>
+        </w:trPr>
+        <w:tc>
+          <w:tcPr>
+            <w:cnfStyle w:val="001000000000" w:firstRow="0" w:lastRow="0" w:firstColumn="1" w:lastColumn="0" w:oddVBand="0" w:evenVBand="0" w:oddHBand="0" w:evenHBand="0" w:firstRowFirstColumn="0" w:firstRowLastColumn="0" w:lastRowFirstColumn="0" w:lastRowLastColumn="0"/>
+            <w:tcW w:w="0" w:type="auto"/>
+            <w:hideMark/>
+          </w:tcPr>
+          <w:p>
+            <w:pPr>
+              <w:pStyle w:val="IT"/>
+              <w:rPr>
+                <w:lang/>
+              </w:rPr>
+            </w:pPr>
+            <w:r>
+              <w:rPr>
+                <w:lang/>
+              </w:rPr>
+              <w:t>email</w:t>
+            </w:r>
+          </w:p>
+        </w:tc>
+        <w:tc>
+          <w:tcPr>
+            <w:tcW w:w="0" w:type="auto"/>
+            <w:hideMark/>
+          </w:tcPr>
+          <w:p>
+            <w:pPr>
+              <w:pStyle w:val="IT"/>
+              <w:cnfStyle w:val="000000100000" w:firstRow="0" w:lastRow="0" w:firstColumn="0" w:lastColumn="0" w:oddVBand="0" w:evenVBand="0" w:oddHBand="1" w:evenHBand="0" w:firstRowFirstColumn="0" w:firstRowLastColumn="0" w:lastRowFirstColumn="0" w:lastRowLastColumn="0"/>
+              <w:rPr>
+                <w:lang/>
+              </w:rPr>
+            </w:pPr>
+            <w:r>
+              <w:rPr>
+                <w:lang/>
+              </w:rPr>
+              <w:t>VARCHAR(100)</w:t>
+            </w:r>
+          </w:p>
+        </w:tc>
+        <w:tc>
+          <w:tcPr>
+            <w:tcW w:w="0" w:type="auto"/>
+            <w:hideMark/>
+          </w:tcPr>
+          <w:p>
+            <w:pPr>
+              <w:pStyle w:val="IT"/>
+              <w:cnfStyle w:val="000000100000" w:firstRow="0" w:lastRow="0" w:firstColumn="0" w:lastColumn="0" w:oddVBand="0" w:evenVBand="0" w:oddHBand="1" w:evenHBand="0" w:firstRowFirstColumn="0" w:firstRowLastColumn="0" w:lastRowFirstColumn="0" w:lastRowLastColumn="0"/>
+              <w:rPr>
+                <w:lang/>
+              </w:rPr>
+            </w:pPr>
+            <w:r>
+              <w:rPr>
+                <w:lang/>
+              </w:rPr>
+              <w:t>Unique</w:t>
+            </w:r>
+          </w:p>
+        </w:tc>
+      </w:tr>
+      <w:tr>
+        <w:tc>
+          <w:tcPr>
+            <w:cnfStyle w:val="001000000000" w:firstRow="0" w:lastRow="0" w:firstColumn="1" w:lastColumn="0" w:oddVBand="0" w:evenVBand="0" w:oddHBand="0" w:evenHBand="0" w:firstRowFirstColumn="0" w:firstRowLastColumn="0" w:lastRowFirstColumn="0" w:lastRowLastColumn="0"/>
+            <w:tcW w:w="0" w:type="auto"/>
+            <w:hideMark/>
+          </w:tcPr>
+          <w:p>
+            <w:pPr>
+              <w:pStyle w:val="IT"/>
+              <w:rPr>
+                <w:lang/>
+              </w:rPr>
+            </w:pPr>
+            <w:r>
+              <w:rPr>
+                <w:lang/>
+              </w:rPr>
+              <w:t>address</w:t>
+            </w:r>
+          </w:p>
+        </w:tc>
+        <w:tc>
+          <w:tcPr>
+            <w:tcW w:w="0" w:type="auto"/>
+            <w:hideMark/>
+          </w:tcPr>
+          <w:p>
+            <w:pPr>
+              <w:pStyle w:val="IT"/>
+              <w:cnfStyle w:val="000000000000" w:firstRow="0" w:lastRow="0" w:firstColumn="0" w:lastColumn="0" w:oddVBand="0" w:evenVBand="0" w:oddHBand="0" w:evenHBand="0" w:firstRowFirstColumn="0" w:firstRowLastColumn="0" w:lastRowFirstColumn="0" w:lastRowLastColumn="0"/>
+              <w:rPr>
+                <w:lang/>
+              </w:rPr>
+            </w:pPr>
+            <w:r>
+              <w:rPr>
+                <w:lang/>
+              </w:rPr>
+              <w:t>VARCHAR(200)</w:t>
+            </w:r>
+          </w:p>
+        </w:tc>
+        <w:tc>
+          <w:tcPr>
+            <w:tcW w:w="0" w:type="auto"/>
+            <w:hideMark/>
+          </w:tcPr>
+          <w:p>
+            <w:pPr>
+              <w:pStyle w:val="IT"/>
+              <w:cnfStyle w:val="000000000000" w:firstRow="0" w:lastRow="0" w:firstColumn="0" w:lastColumn="0" w:oddVBand="0" w:evenVBand="0" w:oddHBand="0" w:evenHBand="0" w:firstRowFirstColumn="0" w:firstRowLastColumn="0" w:lastRowFirstColumn="0" w:lastRowLastColumn="0"/>
+              <w:rPr>
+                <w:lang/>
+              </w:rPr>
+            </w:pPr>
+            <w:r>
+              <w:rPr>
+                <w:lang/>
+              </w:rPr>
+              <w:t>Optional</w:t>
+            </w:r>
+          </w:p>
+        </w:tc>
+      </w:tr>
+      <w:tr>
+        <w:trPr>
+          <w:cnfStyle w:val="000000100000" w:firstRow="0" w:lastRow="0" w:firstColumn="0" w:lastColumn="0" w:oddVBand="0" w:evenVBand="0" w:oddHBand="1" w:evenHBand="0" w:firstRowFirstColumn="0" w:firstRowLastColumn="0" w:lastRowFirstColumn="0" w:lastRowLastColumn="0"/>
+        </w:trPr>
+        <w:tc>
+          <w:tcPr>
+            <w:cnfStyle w:val="001000000000" w:firstRow="0" w:lastRow="0" w:firstColumn="1" w:lastColumn="0" w:oddVBand="0" w:evenVBand="0" w:oddHBand="0" w:evenHBand="0" w:firstRowFirstColumn="0" w:firstRowLastColumn="0" w:lastRowFirstColumn="0" w:lastRowLastColumn="0"/>
+            <w:tcW w:w="0" w:type="auto"/>
+            <w:hideMark/>
+          </w:tcPr>
+          <w:p>
+            <w:pPr>
+              <w:pStyle w:val="IT"/>
+              <w:rPr>
+                <w:lang/>
+              </w:rPr>
+            </w:pPr>
+            <w:r>
+              <w:rPr>
+                <w:lang/>
+              </w:rPr>
+              <w:t>blood_type</w:t>
+            </w:r>
+          </w:p>
+        </w:tc>
+        <w:tc>
+          <w:tcPr>
+            <w:tcW w:w="0" w:type="auto"/>
+            <w:hideMark/>
+          </w:tcPr>
+          <w:p>
+            <w:pPr>
+              <w:pStyle w:val="IT"/>
+              <w:cnfStyle w:val="000000100000" w:firstRow="0" w:lastRow="0" w:firstColumn="0" w:lastColumn="0" w:oddVBand="0" w:evenVBand="0" w:oddHBand="1" w:evenHBand="0" w:firstRowFirstColumn="0" w:firstRowLastColumn="0" w:lastRowFirstColumn="0" w:lastRowLastColumn="0"/>
+              <w:rPr>
+                <w:lang/>
+              </w:rPr>
+            </w:pPr>
+            <w:r>
+              <w:rPr>
+                <w:lang/>
+              </w:rPr>
+              <w:t>VARCHAR(5)</w:t>
+            </w:r>
+          </w:p>
+        </w:tc>
+        <w:tc>
+          <w:tcPr>
+            <w:tcW w:w="0" w:type="auto"/>
+            <w:hideMark/>
+          </w:tcPr>
+          <w:p>
+            <w:pPr>
+              <w:pStyle w:val="IT"/>
+              <w:cnfStyle w:val="000000100000" w:firstRow="0" w:lastRow="0" w:firstColumn="0" w:lastColumn="0" w:oddVBand="0" w:evenVBand="0" w:oddHBand="1" w:evenHBand="0" w:firstRowFirstColumn="0" w:firstRowLastColumn="0" w:lastRowFirstColumn="0" w:lastRowLastColumn="0"/>
+              <w:rPr>
+                <w:lang/>
+              </w:rPr>
+            </w:pPr>
+            <w:r>
+              <w:rPr>
+                <w:lang/>
+              </w:rPr>
+              <w:t>Optional</w:t>
+            </w:r>
+          </w:p>
+        </w:tc>
+      </w:tr>
+    </w:tbl>
+    <w:p>
+      <w:pPr>
+        <w:pStyle w:val="IT"/>
+        <w:rPr>
+          <w:lang/>
+        </w:rPr>
+      </w:pPr>
+      <w:r>
+        <w:rPr>
+          <w:b/>
+          <w:bCs/>
+          <w:lang/>
+        </w:rPr>
+        <w:t>2. Doctors</w:t>
+      </w:r>
+    </w:p>
+    <w:p>
+      <w:pPr>
+        <w:pStyle w:val="IT"/>
+        <w:rPr>
+          <w:lang/>
+        </w:rPr>
+      </w:pPr>
+      <w:r>
+        <w:rPr>
+          <w:lang/>
+        </w:rPr>
+        <w:t>Stores information about the doctors employed by the clinic.</w:t>
+      </w:r>
+    </w:p>
+    <w:tbl>
+      <w:tblPr>
+        <w:tblStyle w:val="GridTable3-Accent1"/>
+        <w:tblW w:w="0" w:type="auto"/>
+        <w:tblLook w:val="04A0" w:firstRow="1" w:lastRow="0" w:firstColumn="1" w:lastColumn="0" w:noHBand="0" w:noVBand="1"/>
+      </w:tblPr>
+      <w:tblGrid>
+        <w:gridCol w:w="1550"/>
+        <w:gridCol w:w="1879"/>
+        <w:gridCol w:w="2953"/>
+      </w:tblGrid>
+      <w:tr>
+        <w:trPr>
+          <w:cnfStyle w:val="100000000000" w:firstRow="1" w:lastRow="0" w:firstColumn="0" w:lastColumn="0" w:oddVBand="0" w:evenVBand="0" w:oddHBand="0" w:evenHBand="0" w:firstRowFirstColumn="0" w:firstRowLastColumn="0" w:lastRowFirstColumn="0" w:lastRowLastColumn="0"/>
+        </w:trPr>
+        <w:tc>
+          <w:tcPr>
+            <w:cnfStyle w:val="001000000100" w:firstRow="0" w:lastRow="0" w:firstColumn="1" w:lastColumn="0" w:oddVBand="0" w:evenVBand="0" w:oddHBand="0" w:evenHBand="0" w:firstRowFirstColumn="1" w:firstRowLastColumn="0" w:lastRowFirstColumn="0" w:lastRowLastColumn="0"/>
+            <w:tcW w:w="0" w:type="auto"/>
+            <w:hideMark/>
+          </w:tcPr>
+          <w:p>
+            <w:pPr>
+              <w:pStyle w:val="IT"/>
+              <w:rPr>
+                <w:lang/>
+              </w:rPr>
+            </w:pPr>
+            <w:r>
+              <w:rPr>
+                <w:lang/>
+              </w:rPr>
+              <w:t>Attribute</w:t>
+            </w:r>
+          </w:p>
+        </w:tc>
+        <w:tc>
+          <w:tcPr>
+            <w:tcW w:w="0" w:type="auto"/>
+            <w:hideMark/>
+          </w:tcPr>
+          <w:p>
+            <w:pPr>
+              <w:pStyle w:val="IT"/>
+              <w:cnfStyle w:val="100000000000" w:firstRow="1" w:lastRow="0" w:firstColumn="0" w:lastColumn="0" w:oddVBand="0" w:evenVBand="0" w:oddHBand="0" w:evenHBand="0" w:firstRowFirstColumn="0" w:firstRowLastColumn="0" w:lastRowFirstColumn="0" w:lastRowLastColumn="0"/>
+              <w:rPr>
+                <w:lang/>
+              </w:rPr>
+            </w:pPr>
+            <w:r>
+              <w:rPr>
+                <w:lang/>
+              </w:rPr>
+              <w:t>Data Type</w:t>
+            </w:r>
+          </w:p>
+        </w:tc>
+        <w:tc>
+          <w:tcPr>
+            <w:tcW w:w="0" w:type="auto"/>
+            <w:hideMark/>
+          </w:tcPr>
+          <w:p>
+            <w:pPr>
+              <w:pStyle w:val="IT"/>
+              <w:cnfStyle w:val="100000000000" w:firstRow="1" w:lastRow="0" w:firstColumn="0" w:lastColumn="0" w:oddVBand="0" w:evenVBand="0" w:oddHBand="0" w:evenHBand="0" w:firstRowFirstColumn="0" w:firstRowLastColumn="0" w:lastRowFirstColumn="0" w:lastRowLastColumn="0"/>
+              <w:rPr>
+                <w:lang/>
+              </w:rPr>
+            </w:pPr>
+            <w:r>
+              <w:rPr>
+                <w:lang/>
+              </w:rPr>
+              <w:t>Constraint</w:t>
+            </w:r>
+          </w:p>
+        </w:tc>
+      </w:tr>
+      <w:tr>
+        <w:trPr>
+          <w:cnfStyle w:val="000000100000" w:firstRow="0" w:lastRow="0" w:firstColumn="0" w:lastColumn="0" w:oddVBand="0" w:evenVBand="0" w:oddHBand="1" w:evenHBand="0" w:firstRowFirstColumn="0" w:firstRowLastColumn="0" w:lastRowFirstColumn="0" w:lastRowLastColumn="0"/>
+        </w:trPr>
+        <w:tc>
+          <w:tcPr>
+            <w:cnfStyle w:val="001000000000" w:firstRow="0" w:lastRow="0" w:firstColumn="1" w:lastColumn="0" w:oddVBand="0" w:evenVBand="0" w:oddHBand="0" w:evenHBand="0" w:firstRowFirstColumn="0" w:firstRowLastColumn="0" w:lastRowFirstColumn="0" w:lastRowLastColumn="0"/>
+            <w:tcW w:w="0" w:type="auto"/>
+            <w:hideMark/>
+          </w:tcPr>
+          <w:p>
+            <w:pPr>
+              <w:pStyle w:val="IT"/>
+              <w:rPr>
+                <w:lang/>
+              </w:rPr>
+            </w:pPr>
+            <w:r>
+              <w:rPr>
+                <w:lang/>
+              </w:rPr>
+              <w:t>doctor_id</w:t>
+            </w:r>
+          </w:p>
+        </w:tc>
+        <w:tc>
+          <w:tcPr>
+            <w:tcW w:w="0" w:type="auto"/>
+            <w:hideMark/>
+          </w:tcPr>
+          <w:p>
+            <w:pPr>
+              <w:pStyle w:val="IT"/>
+              <w:cnfStyle w:val="000000100000" w:firstRow="0" w:lastRow="0" w:firstColumn="0" w:lastColumn="0" w:oddVBand="0" w:evenVBand="0" w:oddHBand="1" w:evenHBand="0" w:firstRowFirstColumn="0" w:firstRowLastColumn="0" w:lastRowFirstColumn="0" w:lastRowLastColumn="0"/>
+              <w:rPr>
+                <w:lang/>
+              </w:rPr>
+            </w:pPr>
+            <w:r>
+              <w:rPr>
+                <w:lang/>
+              </w:rPr>
+              <w:t>INT</w:t>
+            </w:r>
+          </w:p>
+        </w:tc>
+        <w:tc>
+          <w:tcPr>
+            <w:tcW w:w="0" w:type="auto"/>
+            <w:hideMark/>
+          </w:tcPr>
+          <w:p>
+            <w:pPr>
+              <w:pStyle w:val="IT"/>
+              <w:cnfStyle w:val="000000100000" w:firstRow="0" w:lastRow="0" w:firstColumn="0" w:lastColumn="0" w:oddVBand="0" w:evenVBand="0" w:oddHBand="1" w:evenHBand="0" w:firstRowFirstColumn="0" w:firstRowLastColumn="0" w:lastRowFirstColumn="0" w:lastRowLastColumn="0"/>
+              <w:rPr>
+                <w:lang/>
+              </w:rPr>
+            </w:pPr>
+            <w:r>
+              <w:rPr>
+                <w:lang/>
+              </w:rPr>
+              <w:t>Primary key, auto-increment</w:t>
+            </w:r>
+          </w:p>
+        </w:tc>
+      </w:tr>
+      <w:tr>
+        <w:tc>
+          <w:tcPr>
+            <w:cnfStyle w:val="001000000000" w:firstRow="0" w:lastRow="0" w:firstColumn="1" w:lastColumn="0" w:oddVBand="0" w:evenVBand="0" w:oddHBand="0" w:evenHBand="0" w:firstRowFirstColumn="0" w:firstRowLastColumn="0" w:lastRowFirstColumn="0" w:lastRowLastColumn="0"/>
+            <w:tcW w:w="0" w:type="auto"/>
+            <w:hideMark/>
+          </w:tcPr>
+          <w:p>
+            <w:pPr>
+              <w:pStyle w:val="IT"/>
+              <w:rPr>
+                <w:lang/>
+              </w:rPr>
+            </w:pPr>
+            <w:r>
+              <w:rPr>
+                <w:lang/>
+              </w:rPr>
+              <w:t>first_name</w:t>
+            </w:r>
+          </w:p>
+        </w:tc>
+        <w:tc>
+          <w:tcPr>
+            <w:tcW w:w="0" w:type="auto"/>
+            <w:hideMark/>
+          </w:tcPr>
+          <w:p>
+            <w:pPr>
+              <w:pStyle w:val="IT"/>
+              <w:cnfStyle w:val="000000000000" w:firstRow="0" w:lastRow="0" w:firstColumn="0" w:lastColumn="0" w:oddVBand="0" w:evenVBand="0" w:oddHBand="0" w:evenHBand="0" w:firstRowFirstColumn="0" w:firstRowLastColumn="0" w:lastRowFirstColumn="0" w:lastRowLastColumn="0"/>
+              <w:rPr>
+                <w:lang/>
+              </w:rPr>
+            </w:pPr>
+            <w:r>
+              <w:rPr>
+                <w:lang/>
+              </w:rPr>
+              <w:t>VARCHAR(50)</w:t>
+            </w:r>
+          </w:p>
+        </w:tc>
+        <w:tc>
+          <w:tcPr>
+            <w:tcW w:w="0" w:type="auto"/>
+            <w:hideMark/>
+          </w:tcPr>
+          <w:p>
+            <w:pPr>
+              <w:pStyle w:val="IT"/>
+              <w:cnfStyle w:val="000000000000" w:firstRow="0" w:lastRow="0" w:firstColumn="0" w:lastColumn="0" w:oddVBand="0" w:evenVBand="0" w:oddHBand="0" w:evenHBand="0" w:firstRowFirstColumn="0" w:firstRowLastColumn="0" w:lastRowFirstColumn="0" w:lastRowLastColumn="0"/>
+              <w:rPr>
+                <w:lang/>
+              </w:rPr>
+            </w:pPr>
+            <w:r>
+              <w:rPr>
+                <w:lang/>
+              </w:rPr>
+              <w:t>Not null</w:t>
+            </w:r>
+          </w:p>
+        </w:tc>
+      </w:tr>
+      <w:tr>
+        <w:trPr>
+          <w:cnfStyle w:val="000000100000" w:firstRow="0" w:lastRow="0" w:firstColumn="0" w:lastColumn="0" w:oddVBand="0" w:evenVBand="0" w:oddHBand="1" w:evenHBand="0" w:firstRowFirstColumn="0" w:firstRowLastColumn="0" w:lastRowFirstColumn="0" w:lastRowLastColumn="0"/>
+        </w:trPr>
+        <w:tc>
+          <w:tcPr>
+            <w:cnfStyle w:val="001000000000" w:firstRow="0" w:lastRow="0" w:firstColumn="1" w:lastColumn="0" w:oddVBand="0" w:evenVBand="0" w:oddHBand="0" w:evenHBand="0" w:firstRowFirstColumn="0" w:firstRowLastColumn="0" w:lastRowFirstColumn="0" w:lastRowLastColumn="0"/>
+            <w:tcW w:w="0" w:type="auto"/>
+            <w:hideMark/>
+          </w:tcPr>
+          <w:p>
+            <w:pPr>
+              <w:pStyle w:val="IT"/>
+              <w:rPr>
+                <w:lang/>
+              </w:rPr>
+            </w:pPr>
+            <w:r>
+              <w:rPr>
+                <w:lang/>
+              </w:rPr>
+              <w:t>last_name</w:t>
+            </w:r>
+          </w:p>
+        </w:tc>
+        <w:tc>
+          <w:tcPr>
+            <w:tcW w:w="0" w:type="auto"/>
+            <w:hideMark/>
+          </w:tcPr>
+          <w:p>
+            <w:pPr>
+              <w:pStyle w:val="IT"/>
+              <w:cnfStyle w:val="000000100000" w:firstRow="0" w:lastRow="0" w:firstColumn="0" w:lastColumn="0" w:oddVBand="0" w:evenVBand="0" w:oddHBand="1" w:evenHBand="0" w:firstRowFirstColumn="0" w:firstRowLastColumn="0" w:lastRowFirstColumn="0" w:lastRowLastColumn="0"/>
+              <w:rPr>
+                <w:lang/>
+              </w:rPr>
+            </w:pPr>
+            <w:r>
+              <w:rPr>
+                <w:lang/>
+              </w:rPr>
+              <w:t>VARCHAR(50)</w:t>
+            </w:r>
+          </w:p>
+        </w:tc>
+        <w:tc>
+          <w:tcPr>
+            <w:tcW w:w="0" w:type="auto"/>
+            <w:hideMark/>
+          </w:tcPr>
+          <w:p>
+            <w:pPr>
+              <w:pStyle w:val="IT"/>
+              <w:cnfStyle w:val="000000100000" w:firstRow="0" w:lastRow="0" w:firstColumn="0" w:lastColumn="0" w:oddVBand="0" w:evenVBand="0" w:oddHBand="1" w:evenHBand="0" w:firstRowFirstColumn="0" w:firstRowLastColumn="0" w:lastRowFirstColumn="0" w:lastRowLastColumn="0"/>
+              <w:rPr>
+                <w:lang/>
+              </w:rPr>
+            </w:pPr>
+            <w:r>
+              <w:rPr>
+                <w:lang/>
+              </w:rPr>
+              <w:t>Not null</w:t>
+            </w:r>
+          </w:p>
+        </w:tc>
+      </w:tr>
+      <w:tr>
+        <w:tc>
+          <w:tcPr>
+            <w:cnfStyle w:val="001000000000" w:firstRow="0" w:lastRow="0" w:firstColumn="1" w:lastColumn="0" w:oddVBand="0" w:evenVBand="0" w:oddHBand="0" w:evenHBand="0" w:firstRowFirstColumn="0" w:firstRowLastColumn="0" w:lastRowFirstColumn="0" w:lastRowLastColumn="0"/>
+            <w:tcW w:w="0" w:type="auto"/>
+            <w:hideMark/>
+          </w:tcPr>
+          <w:p>
+            <w:pPr>
+              <w:pStyle w:val="IT"/>
+              <w:rPr>
+                <w:lang/>
+              </w:rPr>
+            </w:pPr>
+            <w:r>
+              <w:rPr>
+                <w:lang/>
+              </w:rPr>
+              <w:t>specialization</w:t>
+            </w:r>
+          </w:p>
+        </w:tc>
+        <w:tc>
+          <w:tcPr>
+            <w:tcW w:w="0" w:type="auto"/>
+            <w:hideMark/>
+          </w:tcPr>
+          <w:p>
+            <w:pPr>
+              <w:pStyle w:val="IT"/>
+              <w:cnfStyle w:val="000000000000" w:firstRow="0" w:lastRow="0" w:firstColumn="0" w:lastColumn="0" w:oddVBand="0" w:evenVBand="0" w:oddHBand="0" w:evenHBand="0" w:firstRowFirstColumn="0" w:firstRowLastColumn="0" w:lastRowFirstColumn="0" w:lastRowLastColumn="0"/>
+              <w:rPr>
+                <w:lang/>
+              </w:rPr>
+            </w:pPr>
+            <w:r>
+              <w:rPr>
+                <w:lang/>
+              </w:rPr>
+              <w:t>VARCHAR(100)</w:t>
+            </w:r>
+          </w:p>
+        </w:tc>
+        <w:tc>
+          <w:tcPr>
+            <w:tcW w:w="0" w:type="auto"/>
+            <w:hideMark/>
+          </w:tcPr>
+          <w:p>
+            <w:pPr>
+              <w:pStyle w:val="IT"/>
+              <w:cnfStyle w:val="000000000000" w:firstRow="0" w:lastRow="0" w:firstColumn="0" w:lastColumn="0" w:oddVBand="0" w:evenVBand="0" w:oddHBand="0" w:evenHBand="0" w:firstRowFirstColumn="0" w:firstRowLastColumn="0" w:lastRowFirstColumn="0" w:lastRowLastColumn="0"/>
+              <w:rPr>
+                <w:lang/>
+              </w:rPr>
+            </w:pPr>
+            <w:r>
+              <w:rPr>
+                <w:lang/>
+              </w:rPr>
+              <w:t>Not null</w:t>
+            </w:r>
+          </w:p>
+        </w:tc>
+      </w:tr>
+      <w:tr>
+        <w:trPr>
+          <w:cnfStyle w:val="000000100000" w:firstRow="0" w:lastRow="0" w:firstColumn="0" w:lastColumn="0" w:oddVBand="0" w:evenVBand="0" w:oddHBand="1" w:evenHBand="0" w:firstRowFirstColumn="0" w:firstRowLastColumn="0" w:lastRowFirstColumn="0" w:lastRowLastColumn="0"/>
+        </w:trPr>
+        <w:tc>
+          <w:tcPr>
+            <w:cnfStyle w:val="001000000000" w:firstRow="0" w:lastRow="0" w:firstColumn="1" w:lastColumn="0" w:oddVBand="0" w:evenVBand="0" w:oddHBand="0" w:evenHBand="0" w:firstRowFirstColumn="0" w:firstRowLastColumn="0" w:lastRowFirstColumn="0" w:lastRowLastColumn="0"/>
+            <w:tcW w:w="0" w:type="auto"/>
+            <w:hideMark/>
+          </w:tcPr>
+          <w:p>
+            <w:pPr>
+              <w:pStyle w:val="IT"/>
+              <w:rPr>
+                <w:lang/>
+              </w:rPr>
+            </w:pPr>
+            <w:r>
+              <w:rPr>
+                <w:lang/>
+              </w:rPr>
+              <w:t>phone</w:t>
+            </w:r>
+          </w:p>
+        </w:tc>
+        <w:tc>
+          <w:tcPr>
+            <w:tcW w:w="0" w:type="auto"/>
+            <w:hideMark/>
+          </w:tcPr>
+          <w:p>
+            <w:pPr>
+              <w:pStyle w:val="IT"/>
+              <w:cnfStyle w:val="000000100000" w:firstRow="0" w:lastRow="0" w:firstColumn="0" w:lastColumn="0" w:oddVBand="0" w:evenVBand="0" w:oddHBand="1" w:evenHBand="0" w:firstRowFirstColumn="0" w:firstRowLastColumn="0" w:lastRowFirstColumn="0" w:lastRowLastColumn="0"/>
+              <w:rPr>
+                <w:lang/>
+              </w:rPr>
+            </w:pPr>
+            <w:r>
+              <w:rPr>
+                <w:lang/>
+              </w:rPr>
+              <w:t>VARCHAR(20)</w:t>
+            </w:r>
+          </w:p>
+        </w:tc>
+        <w:tc>
+          <w:tcPr>
+            <w:tcW w:w="0" w:type="auto"/>
+            <w:hideMark/>
+          </w:tcPr>
+          <w:p>
+            <w:pPr>
+              <w:pStyle w:val="IT"/>
+              <w:cnfStyle w:val="000000100000" w:firstRow="0" w:lastRow="0" w:firstColumn="0" w:lastColumn="0" w:oddVBand="0" w:evenVBand="0" w:oddHBand="1" w:evenHBand="0" w:firstRowFirstColumn="0" w:firstRowLastColumn="0" w:lastRowFirstColumn="0" w:lastRowLastColumn="0"/>
+              <w:rPr>
+                <w:lang/>
+              </w:rPr>
+            </w:pPr>
+            <w:r>
+              <w:rPr>
+                <w:lang/>
+              </w:rPr>
+              <w:t>Unique, not null</w:t>
+            </w:r>
+          </w:p>
+        </w:tc>
+      </w:tr>
+      <w:tr>
+        <w:tc>
+          <w:tcPr>
+            <w:cnfStyle w:val="001000000000" w:firstRow="0" w:lastRow="0" w:firstColumn="1" w:lastColumn="0" w:oddVBand="0" w:evenVBand="0" w:oddHBand="0" w:evenHBand="0" w:firstRowFirstColumn="0" w:firstRowLastColumn="0" w:lastRowFirstColumn="0" w:lastRowLastColumn="0"/>
+            <w:tcW w:w="0" w:type="auto"/>
+            <w:hideMark/>
+          </w:tcPr>
+          <w:p>
+            <w:pPr>
+              <w:pStyle w:val="IT"/>
+              <w:rPr>
+                <w:lang/>
+              </w:rPr>
+            </w:pPr>
+            <w:r>
+              <w:rPr>
+                <w:lang/>
+              </w:rPr>
+              <w:t>email</w:t>
+            </w:r>
+          </w:p>
+        </w:tc>
+        <w:tc>
+          <w:tcPr>
+            <w:tcW w:w="0" w:type="auto"/>
+            <w:hideMark/>
+          </w:tcPr>
+          <w:p>
+            <w:pPr>
+              <w:pStyle w:val="IT"/>
+              <w:cnfStyle w:val="000000000000" w:firstRow="0" w:lastRow="0" w:firstColumn="0" w:lastColumn="0" w:oddVBand="0" w:evenVBand="0" w:oddHBand="0" w:evenHBand="0" w:firstRowFirstColumn="0" w:firstRowLastColumn="0" w:lastRowFirstColumn="0" w:lastRowLastColumn="0"/>
+              <w:rPr>
+                <w:lang/>
+              </w:rPr>
+            </w:pPr>
+            <w:r>
+              <w:rPr>
+                <w:lang/>
+              </w:rPr>
+              <w:t>VARCHAR(100)</w:t>
+            </w:r>
+          </w:p>
+        </w:tc>
+        <w:tc>
+          <w:tcPr>
+            <w:tcW w:w="0" w:type="auto"/>
+            <w:hideMark/>
+          </w:tcPr>
+          <w:p>
+            <w:pPr>
+              <w:pStyle w:val="IT"/>
+              <w:cnfStyle w:val="000000000000" w:firstRow="0" w:lastRow="0" w:firstColumn="0" w:lastColumn="0" w:oddVBand="0" w:evenVBand="0" w:oddHBand="0" w:evenHBand="0" w:firstRowFirstColumn="0" w:firstRowLastColumn="0" w:lastRowFirstColumn="0" w:lastRowLastColumn="0"/>
+              <w:rPr>
+                <w:lang/>
+              </w:rPr>
+            </w:pPr>
+            <w:r>
+              <w:rPr>
+                <w:lang/>
+              </w:rPr>
+              <w:t>Unique, not null</w:t>
+            </w:r>
+          </w:p>
+        </w:tc>
+      </w:tr>
+      <w:tr>
+        <w:trPr>
+          <w:cnfStyle w:val="000000100000" w:firstRow="0" w:lastRow="0" w:firstColumn="0" w:lastColumn="0" w:oddVBand="0" w:evenVBand="0" w:oddHBand="1" w:evenHBand="0" w:firstRowFirstColumn="0" w:firstRowLastColumn="0" w:lastRowFirstColumn="0" w:lastRowLastColumn="0"/>
+        </w:trPr>
+        <w:tc>
+          <w:tcPr>
+            <w:cnfStyle w:val="001000000000" w:firstRow="0" w:lastRow="0" w:firstColumn="1" w:lastColumn="0" w:oddVBand="0" w:evenVBand="0" w:oddHBand="0" w:evenHBand="0" w:firstRowFirstColumn="0" w:firstRowLastColumn="0" w:lastRowFirstColumn="0" w:lastRowLastColumn="0"/>
+            <w:tcW w:w="0" w:type="auto"/>
+            <w:hideMark/>
+          </w:tcPr>
+          <w:p>
+            <w:pPr>
+              <w:pStyle w:val="IT"/>
+              <w:rPr>
+                <w:lang/>
+              </w:rPr>
+            </w:pPr>
+            <w:r>
+              <w:rPr>
+                <w:lang/>
+              </w:rPr>
+              <w:t>hire_date</w:t>
+            </w:r>
+          </w:p>
+        </w:tc>
+        <w:tc>
+          <w:tcPr>
+            <w:tcW w:w="0" w:type="auto"/>
+            <w:hideMark/>
+          </w:tcPr>
+          <w:p>
+            <w:pPr>
+              <w:pStyle w:val="IT"/>
+              <w:cnfStyle w:val="000000100000" w:firstRow="0" w:lastRow="0" w:firstColumn="0" w:lastColumn="0" w:oddVBand="0" w:evenVBand="0" w:oddHBand="1" w:evenHBand="0" w:firstRowFirstColumn="0" w:firstRowLastColumn="0" w:lastRowFirstColumn="0" w:lastRowLastColumn="0"/>
+              <w:rPr>
+                <w:lang/>
+              </w:rPr>
+            </w:pPr>
+            <w:r>
+              <w:rPr>
+                <w:lang/>
+              </w:rPr>
+              <w:t>DATE</w:t>
+            </w:r>
+          </w:p>
+        </w:tc>
+        <w:tc>
+          <w:tcPr>
+            <w:tcW w:w="0" w:type="auto"/>
+            <w:hideMark/>
+          </w:tcPr>
+          <w:p>
+            <w:pPr>
+              <w:pStyle w:val="IT"/>
+              <w:cnfStyle w:val="000000100000" w:firstRow="0" w:lastRow="0" w:firstColumn="0" w:lastColumn="0" w:oddVBand="0" w:evenVBand="0" w:oddHBand="1" w:evenHBand="0" w:firstRowFirstColumn="0" w:firstRowLastColumn="0" w:lastRowFirstColumn="0" w:lastRowLastColumn="0"/>
+              <w:rPr>
+                <w:lang/>
+              </w:rPr>
+            </w:pPr>
+            <w:r>
+              <w:rPr>
+                <w:lang/>
+              </w:rPr>
+              <w:t>Not null</w:t>
+            </w:r>
+          </w:p>
+        </w:tc>
+      </w:tr>
+    </w:tbl>
+    <w:p>
+      <w:pPr>
+        <w:pStyle w:val="IT"/>
+        <w:rPr>
+          <w:lang/>
+        </w:rPr>
+      </w:pPr>
+      <w:r>
+        <w:rPr>
+          <w:b/>
+          <w:bCs/>
+          <w:lang/>
+        </w:rPr>
+        <w:t>3. Appointments</w:t>
+      </w:r>
+    </w:p>
+    <w:p>
+      <w:pPr>
+        <w:pStyle w:val="IT"/>
+        <w:rPr>
+          <w:lang/>
+        </w:rPr>
+      </w:pPr>
+      <w:r>
+        <w:rPr>
+          <w:lang/>
+        </w:rPr>
+        <w:t>Records appointments arranged between patients and doctors.</w:t>
+      </w:r>
+    </w:p>
+    <w:tbl>
+      <w:tblPr>
+        <w:tblStyle w:val="GridTable3-Accent1"/>
+        <w:tblW w:w="0" w:type="auto"/>
+        <w:tblLook w:val="04A0" w:firstRow="1" w:lastRow="0" w:firstColumn="1" w:lastColumn="0" w:noHBand="0" w:noVBand="1"/>
+      </w:tblPr>
+      <w:tblGrid>
+        <w:gridCol w:w="1950"/>
+        <w:gridCol w:w="1879"/>
+        <w:gridCol w:w="2953"/>
+      </w:tblGrid>
+      <w:tr>
+        <w:trPr>
+          <w:cnfStyle w:val="100000000000" w:firstRow="1" w:lastRow="0" w:firstColumn="0" w:lastColumn="0" w:oddVBand="0" w:evenVBand="0" w:oddHBand="0" w:evenHBand="0" w:firstRowFirstColumn="0" w:firstRowLastColumn="0" w:lastRowFirstColumn="0" w:lastRowLastColumn="0"/>
+        </w:trPr>
+        <w:tc>
+          <w:tcPr>
+            <w:cnfStyle w:val="001000000100" w:firstRow="0" w:lastRow="0" w:firstColumn="1" w:lastColumn="0" w:oddVBand="0" w:evenVBand="0" w:oddHBand="0" w:evenHBand="0" w:firstRowFirstColumn="1" w:firstRowLastColumn="0" w:lastRowFirstColumn="0" w:lastRowLastColumn="0"/>
+            <w:tcW w:w="0" w:type="auto"/>
+            <w:hideMark/>
+          </w:tcPr>
+          <w:p>
+            <w:pPr>
+              <w:pStyle w:val="IT"/>
+              <w:rPr>
+                <w:lang/>
+              </w:rPr>
+            </w:pPr>
+            <w:r>
+              <w:rPr>
+                <w:lang/>
+              </w:rPr>
+              <w:t>Attribute</w:t>
+            </w:r>
+          </w:p>
+        </w:tc>
+        <w:tc>
+          <w:tcPr>
+            <w:tcW w:w="0" w:type="auto"/>
+            <w:hideMark/>
+          </w:tcPr>
+          <w:p>
+            <w:pPr>
+              <w:pStyle w:val="IT"/>
+              <w:cnfStyle w:val="100000000000" w:firstRow="1" w:lastRow="0" w:firstColumn="0" w:lastColumn="0" w:oddVBand="0" w:evenVBand="0" w:oddHBand="0" w:evenHBand="0" w:firstRowFirstColumn="0" w:firstRowLastColumn="0" w:lastRowFirstColumn="0" w:lastRowLastColumn="0"/>
+              <w:rPr>
+                <w:lang/>
+              </w:rPr>
+            </w:pPr>
+            <w:r>
+              <w:rPr>
+                <w:lang/>
+              </w:rPr>
+              <w:t>Data Type</w:t>
+            </w:r>
+          </w:p>
+        </w:tc>
+        <w:tc>
+          <w:tcPr>
+            <w:tcW w:w="0" w:type="auto"/>
+            <w:hideMark/>
+          </w:tcPr>
+          <w:p>
+            <w:pPr>
+              <w:pStyle w:val="IT"/>
+              <w:cnfStyle w:val="100000000000" w:firstRow="1" w:lastRow="0" w:firstColumn="0" w:lastColumn="0" w:oddVBand="0" w:evenVBand="0" w:oddHBand="0" w:evenHBand="0" w:firstRowFirstColumn="0" w:firstRowLastColumn="0" w:lastRowFirstColumn="0" w:lastRowLastColumn="0"/>
+              <w:rPr>
+                <w:lang/>
+              </w:rPr>
+            </w:pPr>
+            <w:r>
+              <w:rPr>
+                <w:lang/>
+              </w:rPr>
+              <w:t>Constraint</w:t>
+            </w:r>
+          </w:p>
+        </w:tc>
+      </w:tr>
+      <w:tr>
+        <w:trPr>
+          <w:cnfStyle w:val="000000100000" w:firstRow="0" w:lastRow="0" w:firstColumn="0" w:lastColumn="0" w:oddVBand="0" w:evenVBand="0" w:oddHBand="1" w:evenHBand="0" w:firstRowFirstColumn="0" w:firstRowLastColumn="0" w:lastRowFirstColumn="0" w:lastRowLastColumn="0"/>
+        </w:trPr>
+        <w:tc>
+          <w:tcPr>
+            <w:cnfStyle w:val="001000000000" w:firstRow="0" w:lastRow="0" w:firstColumn="1" w:lastColumn="0" w:oddVBand="0" w:evenVBand="0" w:oddHBand="0" w:evenHBand="0" w:firstRowFirstColumn="0" w:firstRowLastColumn="0" w:lastRowFirstColumn="0" w:lastRowLastColumn="0"/>
+            <w:tcW w:w="0" w:type="auto"/>
+            <w:hideMark/>
+          </w:tcPr>
+          <w:p>
+            <w:pPr>
+              <w:pStyle w:val="IT"/>
+              <w:rPr>
+                <w:lang/>
+              </w:rPr>
+            </w:pPr>
+            <w:r>
+              <w:rPr>
+                <w:lang/>
+              </w:rPr>
+              <w:t>appointment_id</w:t>
+            </w:r>
+          </w:p>
+        </w:tc>
+        <w:tc>
+          <w:tcPr>
+            <w:tcW w:w="0" w:type="auto"/>
+            <w:hideMark/>
+          </w:tcPr>
+          <w:p>
+            <w:pPr>
+              <w:pStyle w:val="IT"/>
+              <w:cnfStyle w:val="000000100000" w:firstRow="0" w:lastRow="0" w:firstColumn="0" w:lastColumn="0" w:oddVBand="0" w:evenVBand="0" w:oddHBand="1" w:evenHBand="0" w:firstRowFirstColumn="0" w:firstRowLastColumn="0" w:lastRowFirstColumn="0" w:lastRowLastColumn="0"/>
+              <w:rPr>
+                <w:lang/>
+              </w:rPr>
+            </w:pPr>
+            <w:r>
+              <w:rPr>
+                <w:lang/>
+              </w:rPr>
+              <w:t>INT</w:t>
+            </w:r>
+          </w:p>
+        </w:tc>
+        <w:tc>
+          <w:tcPr>
+            <w:tcW w:w="0" w:type="auto"/>
+            <w:hideMark/>
+          </w:tcPr>
+          <w:p>
+            <w:pPr>
+              <w:pStyle w:val="IT"/>
+              <w:cnfStyle w:val="000000100000" w:firstRow="0" w:lastRow="0" w:firstColumn="0" w:lastColumn="0" w:oddVBand="0" w:evenVBand="0" w:oddHBand="1" w:evenHBand="0" w:firstRowFirstColumn="0" w:firstRowLastColumn="0" w:lastRowFirstColumn="0" w:lastRowLastColumn="0"/>
+              <w:rPr>
+                <w:lang/>
+              </w:rPr>
+            </w:pPr>
+            <w:r>
+              <w:rPr>
+                <w:lang/>
+              </w:rPr>
+              <w:t>Primary key, auto-increment</w:t>
+            </w:r>
+          </w:p>
+        </w:tc>
+      </w:tr>
+      <w:tr>
+        <w:tc>
+          <w:tcPr>
+            <w:cnfStyle w:val="001000000000" w:firstRow="0" w:lastRow="0" w:firstColumn="1" w:lastColumn="0" w:oddVBand="0" w:evenVBand="0" w:oddHBand="0" w:evenHBand="0" w:firstRowFirstColumn="0" w:firstRowLastColumn="0" w:lastRowFirstColumn="0" w:lastRowLastColumn="0"/>
+            <w:tcW w:w="0" w:type="auto"/>
+            <w:hideMark/>
+          </w:tcPr>
+          <w:p>
+            <w:pPr>
+              <w:pStyle w:val="IT"/>
+              <w:rPr>
+                <w:lang/>
+              </w:rPr>
+            </w:pPr>
+            <w:r>
+              <w:rPr>
+                <w:lang/>
+              </w:rPr>
+              <w:t>patient_id</w:t>
+            </w:r>
+          </w:p>
+        </w:tc>
+        <w:tc>
+          <w:tcPr>
+            <w:tcW w:w="0" w:type="auto"/>
+            <w:hideMark/>
+          </w:tcPr>
+          <w:p>
+            <w:pPr>
+              <w:pStyle w:val="IT"/>
+              <w:cnfStyle w:val="000000000000" w:firstRow="0" w:lastRow="0" w:firstColumn="0" w:lastColumn="0" w:oddVBand="0" w:evenVBand="0" w:oddHBand="0" w:evenHBand="0" w:firstRowFirstColumn="0" w:firstRowLastColumn="0" w:lastRowFirstColumn="0" w:lastRowLastColumn="0"/>
+              <w:rPr>
+                <w:lang/>
+              </w:rPr>
+            </w:pPr>
+            <w:r>
+              <w:rPr>
+                <w:lang/>
+              </w:rPr>
+              <w:t>INT</w:t>
+            </w:r>
+          </w:p>
+        </w:tc>
+        <w:tc>
+          <w:tcPr>
+            <w:tcW w:w="0" w:type="auto"/>
+            <w:hideMark/>
+          </w:tcPr>
+          <w:p>
+            <w:pPr>
+              <w:pStyle w:val="IT"/>
+              <w:cnfStyle w:val="000000000000" w:firstRow="0" w:lastRow="0" w:firstColumn="0" w:lastColumn="0" w:oddVBand="0" w:evenVBand="0" w:oddHBand="0" w:evenHBand="0" w:firstRowFirstColumn="0" w:firstRowLastColumn="0" w:lastRowFirstColumn="0" w:lastRowLastColumn="0"/>
+              <w:rPr>
+                <w:lang/>
+              </w:rPr>
+            </w:pPr>
+            <w:r>
+              <w:rPr>
+                <w:lang/>
+              </w:rPr>
+              <w:t>Foreign key</w:t>
+            </w:r>
+          </w:p>
+        </w:tc>
+      </w:tr>
+      <w:tr>
+        <w:trPr>
+          <w:cnfStyle w:val="000000100000" w:firstRow="0" w:lastRow="0" w:firstColumn="0" w:lastColumn="0" w:oddVBand="0" w:evenVBand="0" w:oddHBand="1" w:evenHBand="0" w:firstRowFirstColumn="0" w:firstRowLastColumn="0" w:lastRowFirstColumn="0" w:lastRowLastColumn="0"/>
+        </w:trPr>
+        <w:tc>
+          <w:tcPr>
+            <w:cnfStyle w:val="001000000000" w:firstRow="0" w:lastRow="0" w:firstColumn="1" w:lastColumn="0" w:oddVBand="0" w:evenVBand="0" w:oddHBand="0" w:evenHBand="0" w:firstRowFirstColumn="0" w:firstRowLastColumn="0" w:lastRowFirstColumn="0" w:lastRowLastColumn="0"/>
+            <w:tcW w:w="0" w:type="auto"/>
+            <w:hideMark/>
+          </w:tcPr>
+          <w:p>
+            <w:pPr>
+              <w:pStyle w:val="IT"/>
+              <w:rPr>
+                <w:lang/>
+              </w:rPr>
+            </w:pPr>
+            <w:r>
+              <w:rPr>
+                <w:lang/>
+              </w:rPr>
+              <w:t>doctor_id</w:t>
+            </w:r>
+          </w:p>
+        </w:tc>
+        <w:tc>
+          <w:tcPr>
+            <w:tcW w:w="0" w:type="auto"/>
+            <w:hideMark/>
+          </w:tcPr>
+          <w:p>
+            <w:pPr>
+              <w:pStyle w:val="IT"/>
+              <w:cnfStyle w:val="000000100000" w:firstRow="0" w:lastRow="0" w:firstColumn="0" w:lastColumn="0" w:oddVBand="0" w:evenVBand="0" w:oddHBand="1" w:evenHBand="0" w:firstRowFirstColumn="0" w:firstRowLastColumn="0" w:lastRowFirstColumn="0" w:lastRowLastColumn="0"/>
+              <w:rPr>
+                <w:lang/>
+              </w:rPr>
+            </w:pPr>
+            <w:r>
+              <w:rPr>
+                <w:lang/>
+              </w:rPr>
+              <w:t>INT</w:t>
+            </w:r>
+          </w:p>
+        </w:tc>
+        <w:tc>
+          <w:tcPr>
+            <w:tcW w:w="0" w:type="auto"/>
+            <w:hideMark/>
+          </w:tcPr>
+          <w:p>
+            <w:pPr>
+              <w:pStyle w:val="IT"/>
+              <w:cnfStyle w:val="000000100000" w:firstRow="0" w:lastRow="0" w:firstColumn="0" w:lastColumn="0" w:oddVBand="0" w:evenVBand="0" w:oddHBand="1" w:evenHBand="0" w:firstRowFirstColumn="0" w:firstRowLastColumn="0" w:lastRowFirstColumn="0" w:lastRowLastColumn="0"/>
+              <w:rPr>
+                <w:lang/>
+              </w:rPr>
+            </w:pPr>
+            <w:r>
+              <w:rPr>
+                <w:lang/>
+              </w:rPr>
+              <w:t>Foreign key</w:t>
+            </w:r>
+          </w:p>
+        </w:tc>
+      </w:tr>
+      <w:tr>
+        <w:tc>
+          <w:tcPr>
+            <w:cnfStyle w:val="001000000000" w:firstRow="0" w:lastRow="0" w:firstColumn="1" w:lastColumn="0" w:oddVBand="0" w:evenVBand="0" w:oddHBand="0" w:evenHBand="0" w:firstRowFirstColumn="0" w:firstRowLastColumn="0" w:lastRowFirstColumn="0" w:lastRowLastColumn="0"/>
+            <w:tcW w:w="0" w:type="auto"/>
+            <w:hideMark/>
+          </w:tcPr>
+          <w:p>
+            <w:pPr>
+              <w:pStyle w:val="IT"/>
+              <w:rPr>
+                <w:lang/>
+              </w:rPr>
+            </w:pPr>
+            <w:r>
+              <w:rPr>
+                <w:lang/>
+              </w:rPr>
+              <w:lastRenderedPageBreak/>
+              <w:t>appointment_date</w:t>
+            </w:r>
+          </w:p>
+        </w:tc>
+        <w:tc>
+          <w:tcPr>
+            <w:tcW w:w="0" w:type="auto"/>
+            <w:hideMark/>
+          </w:tcPr>
+          <w:p>
+            <w:pPr>
+              <w:pStyle w:val="IT"/>
+              <w:cnfStyle w:val="000000000000" w:firstRow="0" w:lastRow="0" w:firstColumn="0" w:lastColumn="0" w:oddVBand="0" w:evenVBand="0" w:oddHBand="0" w:evenHBand="0" w:firstRowFirstColumn="0" w:firstRowLastColumn="0" w:lastRowFirstColumn="0" w:lastRowLastColumn="0"/>
+              <w:rPr>
+                <w:lang/>
+              </w:rPr>
+            </w:pPr>
+            <w:r>
+              <w:rPr>
+                <w:lang/>
+              </w:rPr>
+              <w:t>DATE</w:t>
+            </w:r>
+          </w:p>
+        </w:tc>
+        <w:tc>
+          <w:tcPr>
+            <w:tcW w:w="0" w:type="auto"/>
+            <w:hideMark/>
+          </w:tcPr>
+          <w:p>
+            <w:pPr>
+              <w:pStyle w:val="IT"/>
+              <w:cnfStyle w:val="000000000000" w:firstRow="0" w:lastRow="0" w:firstColumn="0" w:lastColumn="0" w:oddVBand="0" w:evenVBand="0" w:oddHBand="0" w:evenHBand="0" w:firstRowFirstColumn="0" w:firstRowLastColumn="0" w:lastRowFirstColumn="0" w:lastRowLastColumn="0"/>
+              <w:rPr>
+                <w:lang/>
+              </w:rPr>
+            </w:pPr>
+            <w:r>
+              <w:rPr>
+                <w:lang/>
+              </w:rPr>
+              <w:t>Not null</w:t>
+            </w:r>
+          </w:p>
+        </w:tc>
+      </w:tr>
+      <w:tr>
+        <w:trPr>
+          <w:cnfStyle w:val="000000100000" w:firstRow="0" w:lastRow="0" w:firstColumn="0" w:lastColumn="0" w:oddVBand="0" w:evenVBand="0" w:oddHBand="1" w:evenHBand="0" w:firstRowFirstColumn="0" w:firstRowLastColumn="0" w:lastRowFirstColumn="0" w:lastRowLastColumn="0"/>
+        </w:trPr>
+        <w:tc>
+          <w:tcPr>
+            <w:cnfStyle w:val="001000000000" w:firstRow="0" w:lastRow="0" w:firstColumn="1" w:lastColumn="0" w:oddVBand="0" w:evenVBand="0" w:oddHBand="0" w:evenHBand="0" w:firstRowFirstColumn="0" w:firstRowLastColumn="0" w:lastRowFirstColumn="0" w:lastRowLastColumn="0"/>
+            <w:tcW w:w="0" w:type="auto"/>
+            <w:hideMark/>
+          </w:tcPr>
+          <w:p>
+            <w:pPr>
+              <w:pStyle w:val="IT"/>
+              <w:rPr>
+                <w:lang/>
+              </w:rPr>
+            </w:pPr>
+            <w:r>
+              <w:rPr>
+                <w:lang/>
+              </w:rPr>
+              <w:t>appointment_time</w:t>
+            </w:r>
+          </w:p>
+        </w:tc>
+        <w:tc>
+          <w:tcPr>
+            <w:tcW w:w="0" w:type="auto"/>
+            <w:hideMark/>
+          </w:tcPr>
+          <w:p>
+            <w:pPr>
+              <w:pStyle w:val="IT"/>
+              <w:cnfStyle w:val="000000100000" w:firstRow="0" w:lastRow="0" w:firstColumn="0" w:lastColumn="0" w:oddVBand="0" w:evenVBand="0" w:oddHBand="1" w:evenHBand="0" w:firstRowFirstColumn="0" w:firstRowLastColumn="0" w:lastRowFirstColumn="0" w:lastRowLastColumn="0"/>
+              <w:rPr>
+                <w:lang/>
+              </w:rPr>
+            </w:pPr>
+            <w:r>
+              <w:rPr>
+                <w:lang/>
+              </w:rPr>
+              <w:t>TIME</w:t>
+            </w:r>
+          </w:p>
+        </w:tc>
+        <w:tc>
+          <w:tcPr>
+            <w:tcW w:w="0" w:type="auto"/>
+            <w:hideMark/>
+          </w:tcPr>
+          <w:p>
+            <w:pPr>
+              <w:pStyle w:val="IT"/>
+              <w:cnfStyle w:val="000000100000" w:firstRow="0" w:lastRow="0" w:firstColumn="0" w:lastColumn="0" w:oddVBand="0" w:evenVBand="0" w:oddHBand="1" w:evenHBand="0" w:firstRowFirstColumn="0" w:firstRowLastColumn="0" w:lastRowFirstColumn="0" w:lastRowLastColumn="0"/>
+              <w:rPr>
+                <w:lang/>
+              </w:rPr>
+            </w:pPr>
+            <w:r>
+              <w:rPr>
+                <w:lang/>
+              </w:rPr>
+              <w:t>Not null</w:t>
+            </w:r>
+          </w:p>
+        </w:tc>
+      </w:tr>
+      <w:tr>
+        <w:tc>
+          <w:tcPr>
+            <w:cnfStyle w:val="001000000000" w:firstRow="0" w:lastRow="0" w:firstColumn="1" w:lastColumn="0" w:oddVBand="0" w:evenVBand="0" w:oddHBand="0" w:evenHBand="0" w:firstRowFirstColumn="0" w:firstRowLastColumn="0" w:lastRowFirstColumn="0" w:lastRowLastColumn="0"/>
+            <w:tcW w:w="0" w:type="auto"/>
+            <w:hideMark/>
+          </w:tcPr>
+          <w:p>
+            <w:pPr>
+              <w:pStyle w:val="IT"/>
+              <w:rPr>
+                <w:lang/>
+              </w:rPr>
+            </w:pPr>
+            <w:r>
+              <w:rPr>
+                <w:lang/>
+              </w:rPr>
+              <w:t>reason</w:t>
+            </w:r>
+          </w:p>
+        </w:tc>
+        <w:tc>
+          <w:tcPr>
+            <w:tcW w:w="0" w:type="auto"/>
+            <w:hideMark/>
+          </w:tcPr>
+          <w:p>
+            <w:pPr>
+              <w:pStyle w:val="IT"/>
+              <w:cnfStyle w:val="000000000000" w:firstRow="0" w:lastRow="0" w:firstColumn="0" w:lastColumn="0" w:oddVBand="0" w:evenVBand="0" w:oddHBand="0" w:evenHBand="0" w:firstRowFirstColumn="0" w:firstRowLastColumn="0" w:lastRowFirstColumn="0" w:lastRowLastColumn="0"/>
+              <w:rPr>
+                <w:lang/>
+              </w:rPr>
+            </w:pPr>
+            <w:r>
+              <w:rPr>
+                <w:lang/>
+              </w:rPr>
+              <w:t>VARCHAR(255)</w:t>
+            </w:r>
+          </w:p>
+        </w:tc>
+        <w:tc>
+          <w:tcPr>
+            <w:tcW w:w="0" w:type="auto"/>
+            <w:hideMark/>
+          </w:tcPr>
+          <w:p>
+            <w:pPr>
+              <w:pStyle w:val="IT"/>
+              <w:cnfStyle w:val="000000000000" w:firstRow="0" w:lastRow="0" w:firstColumn="0" w:lastColumn="0" w:oddVBand="0" w:evenVBand="0" w:oddHBand="0" w:evenHBand="0" w:firstRowFirstColumn="0" w:firstRowLastColumn="0" w:lastRowFirstColumn="0" w:lastRowLastColumn="0"/>
+              <w:rPr>
+                <w:lang/>
+              </w:rPr>
+            </w:pPr>
+            <w:r>
+              <w:rPr>
+                <w:lang/>
+              </w:rPr>
+              <w:t>Optional</w:t>
+            </w:r>
+          </w:p>
+        </w:tc>
+      </w:tr>
+      <w:tr>
+        <w:trPr>
+          <w:cnfStyle w:val="000000100000" w:firstRow="0" w:lastRow="0" w:firstColumn="0" w:lastColumn="0" w:oddVBand="0" w:evenVBand="0" w:oddHBand="1" w:evenHBand="0" w:firstRowFirstColumn="0" w:firstRowLastColumn="0" w:lastRowFirstColumn="0" w:lastRowLastColumn="0"/>
+        </w:trPr>
+        <w:tc>
+          <w:tcPr>
+            <w:cnfStyle w:val="001000000000" w:firstRow="0" w:lastRow="0" w:firstColumn="1" w:lastColumn="0" w:oddVBand="0" w:evenVBand="0" w:oddHBand="0" w:evenHBand="0" w:firstRowFirstColumn="0" w:firstRowLastColumn="0" w:lastRowFirstColumn="0" w:lastRowLastColumn="0"/>
+            <w:tcW w:w="0" w:type="auto"/>
+            <w:hideMark/>
+          </w:tcPr>
+          <w:p>
+            <w:pPr>
+              <w:pStyle w:val="IT"/>
+              <w:rPr>
+                <w:lang/>
+              </w:rPr>
+            </w:pPr>
+            <w:r>
+              <w:rPr>
+                <w:lang/>
+              </w:rPr>
+              <w:t>status</w:t>
+            </w:r>
+          </w:p>
+        </w:tc>
+        <w:tc>
+          <w:tcPr>
+            <w:tcW w:w="0" w:type="auto"/>
+            <w:hideMark/>
+          </w:tcPr>
+          <w:p>
+            <w:pPr>
+              <w:pStyle w:val="IT"/>
+              <w:cnfStyle w:val="000000100000" w:firstRow="0" w:lastRow="0" w:firstColumn="0" w:lastColumn="0" w:oddVBand="0" w:evenVBand="0" w:oddHBand="1" w:evenHBand="0" w:firstRowFirstColumn="0" w:firstRowLastColumn="0" w:lastRowFirstColumn="0" w:lastRowLastColumn="0"/>
+              <w:rPr>
+                <w:lang/>
+              </w:rPr>
+            </w:pPr>
+            <w:r>
+              <w:rPr>
+                <w:lang/>
+              </w:rPr>
+              <w:t>ENUM</w:t>
+            </w:r>
+          </w:p>
+        </w:tc>
+        <w:tc>
+          <w:tcPr>
+            <w:tcW w:w="0" w:type="auto"/>
+            <w:hideMark/>
+          </w:tcPr>
+          <w:p>
+            <w:pPr>
+              <w:pStyle w:val="IT"/>
+              <w:cnfStyle w:val="000000100000" w:firstRow="0" w:lastRow="0" w:firstColumn="0" w:lastColumn="0" w:oddVBand="0" w:evenVBand="0" w:oddHBand="1" w:evenHBand="0" w:firstRowFirstColumn="0" w:firstRowLastColumn="0" w:lastRowFirstColumn="0" w:lastRowLastColumn="0"/>
+              <w:rPr>
+                <w:lang/>
+              </w:rPr>
+            </w:pPr>
+            <w:r>
+              <w:rPr>
+                <w:lang/>
+              </w:rPr>
+              <w:t>Not null</w:t>
+            </w:r>
+          </w:p>
+        </w:tc>
+      </w:tr>
+      <w:tr>
+        <w:tc>
+          <w:tcPr>
+            <w:cnfStyle w:val="001000000000" w:firstRow="0" w:lastRow="0" w:firstColumn="1" w:lastColumn="0" w:oddVBand="0" w:evenVBand="0" w:oddHBand="0" w:evenHBand="0" w:firstRowFirstColumn="0" w:firstRowLastColumn="0" w:lastRowFirstColumn="0" w:lastRowLastColumn="0"/>
+            <w:tcW w:w="0" w:type="auto"/>
+            <w:hideMark/>
+          </w:tcPr>
+          <w:p>
+            <w:pPr>
+              <w:pStyle w:val="IT"/>
+              <w:rPr>
+                <w:lang/>
+              </w:rPr>
+            </w:pPr>
+            <w:r>
+              <w:rPr>
+                <w:lang/>
+              </w:rPr>
+              <w:t>notes</w:t>
+            </w:r>
+          </w:p>
+        </w:tc>
+        <w:tc>
+          <w:tcPr>
+            <w:tcW w:w="0" w:type="auto"/>
+            <w:hideMark/>
+          </w:tcPr>
+          <w:p>
+            <w:pPr>
+              <w:pStyle w:val="IT"/>
+              <w:cnfStyle w:val="000000000000" w:firstRow="0" w:lastRow="0" w:firstColumn="0" w:lastColumn="0" w:oddVBand="0" w:evenVBand="0" w:oddHBand="0" w:evenHBand="0" w:firstRowFirstColumn="0" w:firstRowLastColumn="0" w:lastRowFirstColumn="0" w:lastRowLastColumn="0"/>
+              <w:rPr>
+                <w:lang/>
+              </w:rPr>
+            </w:pPr>
+            <w:r>
+              <w:rPr>
+                <w:lang/>
+              </w:rPr>
+              <w:t>TEXT</w:t>
+            </w:r>
+          </w:p>
+        </w:tc>
+        <w:tc>
+          <w:tcPr>
+            <w:tcW w:w="0" w:type="auto"/>
+            <w:hideMark/>
+          </w:tcPr>
+          <w:p>
+            <w:pPr>
+              <w:pStyle w:val="IT"/>
+              <w:cnfStyle w:val="000000000000" w:firstRow="0" w:lastRow="0" w:firstColumn="0" w:lastColumn="0" w:oddVBand="0" w:evenVBand="0" w:oddHBand="0" w:evenHBand="0" w:firstRowFirstColumn="0" w:firstRowLastColumn="0" w:lastRowFirstColumn="0" w:lastRowLastColumn="0"/>
+              <w:rPr>
+                <w:lang/>
+              </w:rPr>
+            </w:pPr>
+            <w:r>
+              <w:rPr>
+                <w:lang/>
+              </w:rPr>
+              <w:t>Optional</w:t>
+            </w:r>
+          </w:p>
+        </w:tc>
+      </w:tr>
+    </w:tbl>
+    <w:p>
+      <w:pPr>
+        <w:pStyle w:val="IT"/>
+        <w:rPr>
+          <w:lang/>
+        </w:rPr>
+      </w:pPr>
+      <w:r>
+        <w:rPr>
+          <w:b/>
+          <w:bCs/>
+          <w:lang/>
+        </w:rPr>
+        <w:t>4. Medicines</w:t>
+      </w:r>
+    </w:p>
+    <w:p>
+      <w:pPr>
+        <w:pStyle w:val="IT"/>
+        <w:rPr>
+          <w:lang/>
+        </w:rPr>
+      </w:pPr>
+      <w:r>
+        <w:rPr>
+          <w:lang/>
+        </w:rPr>
+        <w:t>Maintains information about medicines that may be prescribed during treatment.</w:t>
+      </w:r>
+    </w:p>
+    <w:tbl>
+      <w:tblPr>
+        <w:tblStyle w:val="GridTable3-Accent1"/>
+        <w:tblW w:w="0" w:type="auto"/>
+        <w:tblLook w:val="04A0" w:firstRow="1" w:lastRow="0" w:firstColumn="1" w:lastColumn="0" w:noHBand="0" w:noVBand="1"/>
+      </w:tblPr>
+      <w:tblGrid>
+        <w:gridCol w:w="1723"/>
+        <w:gridCol w:w="1890"/>
+        <w:gridCol w:w="2953"/>
+      </w:tblGrid>
+      <w:tr>
+        <w:trPr>
+          <w:cnfStyle w:val="100000000000" w:firstRow="1" w:lastRow="0" w:firstColumn="0" w:lastColumn="0" w:oddVBand="0" w:evenVBand="0" w:oddHBand="0" w:evenHBand="0" w:firstRowFirstColumn="0" w:firstRowLastColumn="0" w:lastRowFirstColumn="0" w:lastRowLastColumn="0"/>
+        </w:trPr>
+        <w:tc>
+          <w:tcPr>
+            <w:cnfStyle w:val="001000000100" w:firstRow="0" w:lastRow="0" w:firstColumn="1" w:lastColumn="0" w:oddVBand="0" w:evenVBand="0" w:oddHBand="0" w:evenHBand="0" w:firstRowFirstColumn="1" w:firstRowLastColumn="0" w:lastRowFirstColumn="0" w:lastRowLastColumn="0"/>
+            <w:tcW w:w="0" w:type="auto"/>
+            <w:hideMark/>
+          </w:tcPr>
+          <w:p>
+            <w:pPr>
+              <w:pStyle w:val="IT"/>
+              <w:rPr>
+                <w:lang/>
+              </w:rPr>
+            </w:pPr>
+            <w:r>
+              <w:rPr>
+                <w:lang/>
+              </w:rPr>
+              <w:t>Attribute</w:t>
+            </w:r>
+          </w:p>
+        </w:tc>
+        <w:tc>
+          <w:tcPr>
+            <w:tcW w:w="0" w:type="auto"/>
+            <w:hideMark/>
+          </w:tcPr>
+          <w:p>
+            <w:pPr>
+              <w:pStyle w:val="IT"/>
+              <w:cnfStyle w:val="100000000000" w:firstRow="1" w:lastRow="0" w:firstColumn="0" w:lastColumn="0" w:oddVBand="0" w:evenVBand="0" w:oddHBand="0" w:evenHBand="0" w:firstRowFirstColumn="0" w:firstRowLastColumn="0" w:lastRowFirstColumn="0" w:lastRowLastColumn="0"/>
+              <w:rPr>
+                <w:lang/>
+              </w:rPr>
+            </w:pPr>
+            <w:r>
+              <w:rPr>
+                <w:lang/>
+              </w:rPr>
+              <w:t>Data Type</w:t>
+            </w:r>
+          </w:p>
+        </w:tc>
+        <w:tc>
+          <w:tcPr>
+            <w:tcW w:w="0" w:type="auto"/>
+            <w:hideMark/>
+          </w:tcPr>
+          <w:p>
+            <w:pPr>
+              <w:pStyle w:val="IT"/>
+              <w:cnfStyle w:val="100000000000" w:firstRow="1" w:lastRow="0" w:firstColumn="0" w:lastColumn="0" w:oddVBand="0" w:evenVBand="0" w:oddHBand="0" w:evenHBand="0" w:firstRowFirstColumn="0" w:firstRowLastColumn="0" w:lastRowFirstColumn="0" w:lastRowLastColumn="0"/>
+              <w:rPr>
+                <w:lang/>
+              </w:rPr>
+            </w:pPr>
+            <w:r>
+              <w:rPr>
+                <w:lang/>
+              </w:rPr>
+              <w:t>Constraint</w:t>
+            </w:r>
+          </w:p>
+        </w:tc>
+      </w:tr>
+      <w:tr>
+        <w:trPr>
+          <w:cnfStyle w:val="000000100000" w:firstRow="0" w:lastRow="0" w:firstColumn="0" w:lastColumn="0" w:oddVBand="0" w:evenVBand="0" w:oddHBand="1" w:evenHBand="0" w:firstRowFirstColumn="0" w:firstRowLastColumn="0" w:lastRowFirstColumn="0" w:lastRowLastColumn="0"/>
+        </w:trPr>
+        <w:tc>
+          <w:tcPr>
+            <w:cnfStyle w:val="001000000000" w:firstRow="0" w:lastRow="0" w:firstColumn="1" w:lastColumn="0" w:oddVBand="0" w:evenVBand="0" w:oddHBand="0" w:evenHBand="0" w:firstRowFirstColumn="0" w:firstRowLastColumn="0" w:lastRowFirstColumn="0" w:lastRowLastColumn="0"/>
+            <w:tcW w:w="0" w:type="auto"/>
+            <w:hideMark/>
+          </w:tcPr>
+          <w:p>
+            <w:pPr>
+              <w:pStyle w:val="IT"/>
+              <w:rPr>
+                <w:lang/>
+              </w:rPr>
+            </w:pPr>
+            <w:r>
+              <w:rPr>
+                <w:lang/>
+              </w:rPr>
+              <w:t>medicine_id</w:t>
+            </w:r>
+          </w:p>
+        </w:tc>
+        <w:tc>
+          <w:tcPr>
+            <w:tcW w:w="0" w:type="auto"/>
+            <w:hideMark/>
+          </w:tcPr>
+          <w:p>
+            <w:pPr>
+              <w:pStyle w:val="IT"/>
+              <w:cnfStyle w:val="000000100000" w:firstRow="0" w:lastRow="0" w:firstColumn="0" w:lastColumn="0" w:oddVBand="0" w:evenVBand="0" w:oddHBand="1" w:evenHBand="0" w:firstRowFirstColumn="0" w:firstRowLastColumn="0" w:lastRowFirstColumn="0" w:lastRowLastColumn="0"/>
+              <w:rPr>
+                <w:lang/>
+              </w:rPr>
+            </w:pPr>
+            <w:r>
+              <w:rPr>
+                <w:lang/>
+              </w:rPr>
+              <w:t>INT</w:t>
+            </w:r>
+          </w:p>
+        </w:tc>
+        <w:tc>
+          <w:tcPr>
+            <w:tcW w:w="0" w:type="auto"/>
+            <w:hideMark/>
+          </w:tcPr>
+          <w:p>
+            <w:pPr>
+              <w:pStyle w:val="IT"/>
+              <w:cnfStyle w:val="000000100000" w:firstRow="0" w:lastRow="0" w:firstColumn="0" w:lastColumn="0" w:oddVBand="0" w:evenVBand="0" w:oddHBand="1" w:evenHBand="0" w:firstRowFirstColumn="0" w:firstRowLastColumn="0" w:lastRowFirstColumn="0" w:lastRowLastColumn="0"/>
+              <w:rPr>
+                <w:lang/>
+              </w:rPr>
+            </w:pPr>
+            <w:r>
+              <w:rPr>
+                <w:lang/>
+              </w:rPr>
+              <w:t>Primary key, auto-increment</w:t>
+            </w:r>
+          </w:p>
+        </w:tc>
+      </w:tr>
+      <w:tr>
+        <w:tc>
+          <w:tcPr>
+            <w:cnfStyle w:val="001000000000" w:firstRow="0" w:lastRow="0" w:firstColumn="1" w:lastColumn="0" w:oddVBand="0" w:evenVBand="0" w:oddHBand="0" w:evenHBand="0" w:firstRowFirstColumn="0" w:firstRowLastColumn="0" w:lastRowFirstColumn="0" w:lastRowLastColumn="0"/>
+            <w:tcW w:w="0" w:type="auto"/>
+            <w:hideMark/>
+          </w:tcPr>
+          <w:p>
+            <w:pPr>
+              <w:pStyle w:val="IT"/>
+              <w:rPr>
+                <w:lang/>
+              </w:rPr>
+            </w:pPr>
+            <w:r>
+              <w:rPr>
+                <w:lang/>
+              </w:rPr>
+              <w:t>medicine_name</w:t>
+            </w:r>
+          </w:p>
+        </w:tc>
+        <w:tc>
+          <w:tcPr>
+            <w:tcW w:w="0" w:type="auto"/>
+            <w:hideMark/>
+          </w:tcPr>
+          <w:p>
+            <w:pPr>
+              <w:pStyle w:val="IT"/>
+              <w:cnfStyle w:val="000000000000" w:firstRow="0" w:lastRow="0" w:firstColumn="0" w:lastColumn="0" w:oddVBand="0" w:evenVBand="0" w:oddHBand="0" w:evenHBand="0" w:firstRowFirstColumn="0" w:firstRowLastColumn="0" w:lastRowFirstColumn="0" w:lastRowLastColumn="0"/>
+              <w:rPr>
+                <w:lang/>
+              </w:rPr>
+            </w:pPr>
+            <w:r>
+              <w:rPr>
+                <w:lang/>
+              </w:rPr>
+              <w:t>VARCHAR(100)</w:t>
+            </w:r>
+          </w:p>
+        </w:tc>
+        <w:tc>
+          <w:tcPr>
+            <w:tcW w:w="0" w:type="auto"/>
+            <w:hideMark/>
+          </w:tcPr>
+          <w:p>
+            <w:pPr>
+              <w:pStyle w:val="IT"/>
+              <w:cnfStyle w:val="000000000000" w:firstRow="0" w:lastRow="0" w:firstColumn="0" w:lastColumn="0" w:oddVBand="0" w:evenVBand="0" w:oddHBand="0" w:evenHBand="0" w:firstRowFirstColumn="0" w:firstRowLastColumn="0" w:lastRowFirstColumn="0" w:lastRowLastColumn="0"/>
+              <w:rPr>
+                <w:lang/>
+              </w:rPr>
+            </w:pPr>
+            <w:r>
+              <w:rPr>
+                <w:lang/>
+              </w:rPr>
+              <w:t>Unique, not null</w:t>
+            </w:r>
+          </w:p>
+        </w:tc>
+      </w:tr>
+      <w:tr>
+        <w:trPr>
+          <w:cnfStyle w:val="000000100000" w:firstRow="0" w:lastRow="0" w:firstColumn="0" w:lastColumn="0" w:oddVBand="0" w:evenVBand="0" w:oddHBand="1" w:evenHBand="0" w:firstRowFirstColumn="0" w:firstRowLastColumn="0" w:lastRowFirstColumn="0" w:lastRowLastColumn="0"/>
+        </w:trPr>
+        <w:tc>
+          <w:tcPr>
+            <w:cnfStyle w:val="001000000000" w:firstRow="0" w:lastRow="0" w:firstColumn="1" w:lastColumn="0" w:oddVBand="0" w:evenVBand="0" w:oddHBand="0" w:evenHBand="0" w:firstRowFirstColumn="0" w:firstRowLastColumn="0" w:lastRowFirstColumn="0" w:lastRowLastColumn="0"/>
+            <w:tcW w:w="0" w:type="auto"/>
+            <w:hideMark/>
+          </w:tcPr>
+          <w:p>
+            <w:pPr>
+              <w:pStyle w:val="IT"/>
+              <w:rPr>
+                <w:lang/>
+              </w:rPr>
+            </w:pPr>
+            <w:r>
+              <w:rPr>
+                <w:lang/>
+              </w:rPr>
+              <w:t>medicine_type</w:t>
+            </w:r>
+          </w:p>
+        </w:tc>
+        <w:tc>
+          <w:tcPr>
+            <w:tcW w:w="0" w:type="auto"/>
+            <w:hideMark/>
+          </w:tcPr>
+          <w:p>
+            <w:pPr>
+              <w:pStyle w:val="IT"/>
+              <w:cnfStyle w:val="000000100000" w:firstRow="0" w:lastRow="0" w:firstColumn="0" w:lastColumn="0" w:oddVBand="0" w:evenVBand="0" w:oddHBand="1" w:evenHBand="0" w:firstRowFirstColumn="0" w:firstRowLastColumn="0" w:lastRowFirstColumn="0" w:lastRowLastColumn="0"/>
+              <w:rPr>
+                <w:lang/>
+              </w:rPr>
+            </w:pPr>
+            <w:r>
+              <w:rPr>
+                <w:lang/>
+              </w:rPr>
+              <w:t>VARCHAR(50)</w:t>
+            </w:r>
+          </w:p>
+        </w:tc>
+        <w:tc>
+          <w:tcPr>
+            <w:tcW w:w="0" w:type="auto"/>
+            <w:hideMark/>
+          </w:tcPr>
+          <w:p>
+            <w:pPr>
+              <w:pStyle w:val="IT"/>
+              <w:cnfStyle w:val="000000100000" w:firstRow="0" w:lastRow="0" w:firstColumn="0" w:lastColumn="0" w:oddVBand="0" w:evenVBand="0" w:oddHBand="1" w:evenHBand="0" w:firstRowFirstColumn="0" w:firstRowLastColumn="0" w:lastRowFirstColumn="0" w:lastRowLastColumn="0"/>
+              <w:rPr>
+                <w:lang/>
+              </w:rPr>
+            </w:pPr>
+            <w:r>
+              <w:rPr>
+                <w:lang/>
+              </w:rPr>
+              <w:t>Not null</w:t>
+            </w:r>
+          </w:p>
+        </w:tc>
+      </w:tr>
+      <w:tr>
+        <w:tc>
+          <w:tcPr>
+            <w:cnfStyle w:val="001000000000" w:firstRow="0" w:lastRow="0" w:firstColumn="1" w:lastColumn="0" w:oddVBand="0" w:evenVBand="0" w:oddHBand="0" w:evenHBand="0" w:firstRowFirstColumn="0" w:firstRowLastColumn="0" w:lastRowFirstColumn="0" w:lastRowLastColumn="0"/>
+            <w:tcW w:w="0" w:type="auto"/>
+            <w:hideMark/>
+          </w:tcPr>
+          <w:p>
+            <w:pPr>
+              <w:pStyle w:val="IT"/>
+              <w:rPr>
+                <w:lang/>
+              </w:rPr>
+            </w:pPr>
+            <w:r>
+              <w:rPr>
+                <w:lang/>
+              </w:rPr>
+              <w:t>unit_price</w:t>
+            </w:r>
+          </w:p>
+        </w:tc>
+        <w:tc>
+          <w:tcPr>
+            <w:tcW w:w="0" w:type="auto"/>
+            <w:hideMark/>
+          </w:tcPr>
+          <w:p>
+            <w:pPr>
+              <w:pStyle w:val="IT"/>
+              <w:cnfStyle w:val="000000000000" w:firstRow="0" w:lastRow="0" w:firstColumn="0" w:lastColumn="0" w:oddVBand="0" w:evenVBand="0" w:oddHBand="0" w:evenHBand="0" w:firstRowFirstColumn="0" w:firstRowLastColumn="0" w:lastRowFirstColumn="0" w:lastRowLastColumn="0"/>
+              <w:rPr>
+                <w:lang/>
+              </w:rPr>
+            </w:pPr>
+            <w:r>
+              <w:rPr>
+                <w:lang/>
+              </w:rPr>
+              <w:t>DECIMAL(10,2)</w:t>
+            </w:r>
+          </w:p>
+        </w:tc>
+        <w:tc>
+          <w:tcPr>
+            <w:tcW w:w="0" w:type="auto"/>
+            <w:hideMark/>
+          </w:tcPr>
+          <w:p>
+            <w:pPr>
+              <w:pStyle w:val="IT"/>
+              <w:cnfStyle w:val="000000000000" w:firstRow="0" w:lastRow="0" w:firstColumn="0" w:lastColumn="0" w:oddVBand="0" w:evenVBand="0" w:oddHBand="0" w:evenHBand="0" w:firstRowFirstColumn="0" w:firstRowLastColumn="0" w:lastRowFirstColumn="0" w:lastRowLastColumn="0"/>
+              <w:rPr>
+                <w:lang/>
+              </w:rPr>
+            </w:pPr>
+            <w:r>
+              <w:rPr>
+                <w:lang/>
+              </w:rPr>
+              <w:t>Not null</w:t>
+            </w:r>
+          </w:p>
+        </w:tc>
+      </w:tr>
+      <w:tr>
+        <w:trPr>
+          <w:cnfStyle w:val="000000100000" w:firstRow="0" w:lastRow="0" w:firstColumn="0" w:lastColumn="0" w:oddVBand="0" w:evenVBand="0" w:oddHBand="1" w:evenHBand="0" w:firstRowFirstColumn="0" w:firstRowLastColumn="0" w:lastRowFirstColumn="0" w:lastRowLastColumn="0"/>
+        </w:trPr>
+        <w:tc>
+          <w:tcPr>
+            <w:cnfStyle w:val="001000000000" w:firstRow="0" w:lastRow="0" w:firstColumn="1" w:lastColumn="0" w:oddVBand="0" w:evenVBand="0" w:oddHBand="0" w:evenHBand="0" w:firstRowFirstColumn="0" w:firstRowLastColumn="0" w:lastRowFirstColumn="0" w:lastRowLastColumn="0"/>
+            <w:tcW w:w="0" w:type="auto"/>
+            <w:hideMark/>
+          </w:tcPr>
+          <w:p>
+            <w:pPr>
+              <w:pStyle w:val="IT"/>
+              <w:rPr>
+                <w:lang/>
+              </w:rPr>
+            </w:pPr>
+            <w:r>
+              <w:rPr>
+                <w:lang/>
+              </w:rPr>
+              <w:t>stock_quantity</w:t>
+            </w:r>
+          </w:p>
+        </w:tc>
+        <w:tc>
+          <w:tcPr>
+            <w:tcW w:w="0" w:type="auto"/>
+            <w:hideMark/>
+          </w:tcPr>
+          <w:p>
+            <w:pPr>
+              <w:pStyle w:val="IT"/>
+              <w:cnfStyle w:val="000000100000" w:firstRow="0" w:lastRow="0" w:firstColumn="0" w:lastColumn="0" w:oddVBand="0" w:evenVBand="0" w:oddHBand="1" w:evenHBand="0" w:firstRowFirstColumn="0" w:firstRowLastColumn="0" w:lastRowFirstColumn="0" w:lastRowLastColumn="0"/>
+              <w:rPr>
+                <w:lang/>
+              </w:rPr>
+            </w:pPr>
+            <w:r>
+              <w:rPr>
+                <w:lang/>
+              </w:rPr>
+              <w:t>INT</w:t>
+            </w:r>
+          </w:p>
+        </w:tc>
+        <w:tc>
+          <w:tcPr>
+            <w:tcW w:w="0" w:type="auto"/>
+            <w:hideMark/>
+          </w:tcPr>
+          <w:p>
+            <w:pPr>
+              <w:pStyle w:val="IT"/>
+              <w:cnfStyle w:val="000000100000" w:firstRow="0" w:lastRow="0" w:firstColumn="0" w:lastColumn="0" w:oddVBand="0" w:evenVBand="0" w:oddHBand="1" w:evenHBand="0" w:firstRowFirstColumn="0" w:firstRowLastColumn="0" w:lastRowFirstColumn="0" w:lastRowLastColumn="0"/>
+              <w:rPr>
+                <w:lang/>
+              </w:rPr>
+            </w:pPr>
+            <w:r>
+              <w:rPr>
+                <w:lang/>
+              </w:rPr>
+              <w:t>Not null</w:t>
+            </w:r>
+          </w:p>
+        </w:tc>
+      </w:tr>
+      <w:tr>
+        <w:tc>
+          <w:tcPr>
+            <w:cnfStyle w:val="001000000000" w:firstRow="0" w:lastRow="0" w:firstColumn="1" w:lastColumn="0" w:oddVBand="0" w:evenVBand="0" w:oddHBand="0" w:evenHBand="0" w:firstRowFirstColumn="0" w:firstRowLastColumn="0" w:lastRowFirstColumn="0" w:lastRowLastColumn="0"/>
+            <w:tcW w:w="0" w:type="auto"/>
+            <w:hideMark/>
+          </w:tcPr>
+          <w:p>
+            <w:pPr>
+              <w:pStyle w:val="IT"/>
+              <w:rPr>
+                <w:lang/>
+              </w:rPr>
+            </w:pPr>
+            <w:r>
+              <w:rPr>
+                <w:lang/>
+              </w:rPr>
+              <w:t>expiry_date</w:t>
+            </w:r>
+          </w:p>
+        </w:tc>
+        <w:tc>
+          <w:tcPr>
+            <w:tcW w:w="0" w:type="auto"/>
+            <w:hideMark/>
+          </w:tcPr>
+          <w:p>
+            <w:pPr>
+              <w:pStyle w:val="IT"/>
+              <w:cnfStyle w:val="000000000000" w:firstRow="0" w:lastRow="0" w:firstColumn="0" w:lastColumn="0" w:oddVBand="0" w:evenVBand="0" w:oddHBand="0" w:evenHBand="0" w:firstRowFirstColumn="0" w:firstRowLastColumn="0" w:lastRowFirstColumn="0" w:lastRowLastColumn="0"/>
+              <w:rPr>
+                <w:lang/>
+              </w:rPr>
+            </w:pPr>
+            <w:r>
+              <w:rPr>
+                <w:lang/>
+              </w:rPr>
+              <w:t>DATE</w:t>
+            </w:r>
+          </w:p>
+        </w:tc>
+        <w:tc>
+          <w:tcPr>
+            <w:tcW w:w="0" w:type="auto"/>
+            <w:hideMark/>
+          </w:tcPr>
+          <w:p>
+            <w:pPr>
+              <w:pStyle w:val="IT"/>
+              <w:cnfStyle w:val="000000000000" w:firstRow="0" w:lastRow="0" w:firstColumn="0" w:lastColumn="0" w:oddVBand="0" w:evenVBand="0" w:oddHBand="0" w:evenHBand="0" w:firstRowFirstColumn="0" w:firstRowLastColumn="0" w:lastRowFirstColumn="0" w:lastRowLastColumn="0"/>
+              <w:rPr>
+                <w:lang/>
+              </w:rPr>
+            </w:pPr>
+            <w:r>
+              <w:rPr>
+                <w:lang/>
+              </w:rPr>
+              <w:t>Not null</w:t>
+            </w:r>
+          </w:p>
+        </w:tc>
+      </w:tr>
+    </w:tbl>
+    <w:p>
+      <w:pPr>
+        <w:pStyle w:val="IT"/>
+        <w:rPr>
+          <w:lang/>
+        </w:rPr>
+      </w:pPr>
+      <w:r>
+        <w:rPr>
+          <w:b/>
+          <w:bCs/>
+          <w:lang/>
+        </w:rPr>
+        <w:t>5. Treatments</w:t>
+      </w:r>
+    </w:p>
+    <w:p>
+      <w:pPr>
+        <w:pStyle w:val="IT"/>
+        <w:rPr>
+          <w:lang/>
+        </w:rPr>
+      </w:pPr>
+      <w:r>
+        <w:rPr>
+          <w:lang/>
+        </w:rPr>
+        <w:t>Stores diagnoses, procedures, and prescribed medicine associated with completed appointments.</w:t>
+      </w:r>
+    </w:p>
+    <w:tbl>
+      <w:tblPr>
+        <w:tblStyle w:val="GridTable3-Accent1"/>
+        <w:tblW w:w="0" w:type="auto"/>
+        <w:tblLook w:val="04A0" w:firstRow="1" w:lastRow="0" w:firstColumn="1" w:lastColumn="0" w:noHBand="0" w:noVBand="1"/>
+      </w:tblPr>
+      <w:tblGrid>
+        <w:gridCol w:w="1825"/>
+        <w:gridCol w:w="1890"/>
+        <w:gridCol w:w="2953"/>
+      </w:tblGrid>
+      <w:tr>
+        <w:trPr>
+          <w:cnfStyle w:val="100000000000" w:firstRow="1" w:lastRow="0" w:firstColumn="0" w:lastColumn="0" w:oddVBand="0" w:evenVBand="0" w:oddHBand="0" w:evenHBand="0" w:firstRowFirstColumn="0" w:firstRowLastColumn="0" w:lastRowFirstColumn="0" w:lastRowLastColumn="0"/>
+        </w:trPr>
+        <w:tc>
+          <w:tcPr>
+            <w:cnfStyle w:val="001000000100" w:firstRow="0" w:lastRow="0" w:firstColumn="1" w:lastColumn="0" w:oddVBand="0" w:evenVBand="0" w:oddHBand="0" w:evenHBand="0" w:firstRowFirstColumn="1" w:firstRowLastColumn="0" w:lastRowFirstColumn="0" w:lastRowLastColumn="0"/>
+            <w:tcW w:w="0" w:type="auto"/>
+            <w:hideMark/>
+          </w:tcPr>
+          <w:p>
+            <w:pPr>
+              <w:pStyle w:val="IT"/>
+              <w:rPr>
+                <w:lang/>
+              </w:rPr>
+            </w:pPr>
+            <w:r>
+              <w:rPr>
+                <w:lang/>
+              </w:rPr>
+              <w:t>Attribute</w:t>
+            </w:r>
+          </w:p>
+        </w:tc>
+        <w:tc>
+          <w:tcPr>
+            <w:tcW w:w="0" w:type="auto"/>
+            <w:hideMark/>
+          </w:tcPr>
+          <w:p>
+            <w:pPr>
+              <w:pStyle w:val="IT"/>
+              <w:cnfStyle w:val="100000000000" w:firstRow="1" w:lastRow="0" w:firstColumn="0" w:lastColumn="0" w:oddVBand="0" w:evenVBand="0" w:oddHBand="0" w:evenHBand="0" w:firstRowFirstColumn="0" w:firstRowLastColumn="0" w:lastRowFirstColumn="0" w:lastRowLastColumn="0"/>
+              <w:rPr>
+                <w:lang/>
+              </w:rPr>
+            </w:pPr>
+            <w:r>
+              <w:rPr>
+                <w:lang/>
+              </w:rPr>
+              <w:t>Data Type</w:t>
+            </w:r>
+          </w:p>
+        </w:tc>
+        <w:tc>
+          <w:tcPr>
+            <w:tcW w:w="0" w:type="auto"/>
+            <w:hideMark/>
+          </w:tcPr>
+          <w:p>
+            <w:pPr>
+              <w:pStyle w:val="IT"/>
+              <w:cnfStyle w:val="100000000000" w:firstRow="1" w:lastRow="0" w:firstColumn="0" w:lastColumn="0" w:oddVBand="0" w:evenVBand="0" w:oddHBand="0" w:evenHBand="0" w:firstRowFirstColumn="0" w:firstRowLastColumn="0" w:lastRowFirstColumn="0" w:lastRowLastColumn="0"/>
+              <w:rPr>
+                <w:lang/>
+              </w:rPr>
+            </w:pPr>
+            <w:r>
+              <w:rPr>
+                <w:lang/>
+              </w:rPr>
+              <w:t>Constraint</w:t>
+            </w:r>
+          </w:p>
+        </w:tc>
+      </w:tr>
+      <w:tr>
+        <w:trPr>
+          <w:cnfStyle w:val="000000100000" w:firstRow="0" w:lastRow="0" w:firstColumn="0" w:lastColumn="0" w:oddVBand="0" w:evenVBand="0" w:oddHBand="1" w:evenHBand="0" w:firstRowFirstColumn="0" w:firstRowLastColumn="0" w:lastRowFirstColumn="0" w:lastRowLastColumn="0"/>
+        </w:trPr>
+        <w:tc>
+          <w:tcPr>
+            <w:cnfStyle w:val="001000000000" w:firstRow="0" w:lastRow="0" w:firstColumn="1" w:lastColumn="0" w:oddVBand="0" w:evenVBand="0" w:oddHBand="0" w:evenHBand="0" w:firstRowFirstColumn="0" w:firstRowLastColumn="0" w:lastRowFirstColumn="0" w:lastRowLastColumn="0"/>
+            <w:tcW w:w="0" w:type="auto"/>
+            <w:hideMark/>
+          </w:tcPr>
+          <w:p>
+            <w:pPr>
+              <w:pStyle w:val="IT"/>
+              <w:rPr>
+                <w:lang/>
+              </w:rPr>
+            </w:pPr>
+            <w:r>
+              <w:rPr>
+                <w:lang/>
+              </w:rPr>
+              <w:t>treatment_id</w:t>
+            </w:r>
+          </w:p>
+        </w:tc>
+        <w:tc>
+          <w:tcPr>
+            <w:tcW w:w="0" w:type="auto"/>
+            <w:hideMark/>
+          </w:tcPr>
+          <w:p>
+            <w:pPr>
+              <w:pStyle w:val="IT"/>
+              <w:cnfStyle w:val="000000100000" w:firstRow="0" w:lastRow="0" w:firstColumn="0" w:lastColumn="0" w:oddVBand="0" w:evenVBand="0" w:oddHBand="1" w:evenHBand="0" w:firstRowFirstColumn="0" w:firstRowLastColumn="0" w:lastRowFirstColumn="0" w:lastRowLastColumn="0"/>
+              <w:rPr>
+                <w:lang/>
+              </w:rPr>
+            </w:pPr>
+            <w:r>
+              <w:rPr>
+                <w:lang/>
+              </w:rPr>
+              <w:t>INT</w:t>
+            </w:r>
+          </w:p>
+        </w:tc>
+        <w:tc>
+          <w:tcPr>
+            <w:tcW w:w="0" w:type="auto"/>
+            <w:hideMark/>
+          </w:tcPr>
+          <w:p>
+            <w:pPr>
+              <w:pStyle w:val="IT"/>
+              <w:cnfStyle w:val="000000100000" w:firstRow="0" w:lastRow="0" w:firstColumn="0" w:lastColumn="0" w:oddVBand="0" w:evenVBand="0" w:oddHBand="1" w:evenHBand="0" w:firstRowFirstColumn="0" w:firstRowLastColumn="0" w:lastRowFirstColumn="0" w:lastRowLastColumn="0"/>
+              <w:rPr>
+                <w:lang/>
+              </w:rPr>
+            </w:pPr>
+            <w:r>
+              <w:rPr>
+                <w:lang/>
+              </w:rPr>
+              <w:t>Primary key, auto-increment</w:t>
+            </w:r>
+          </w:p>
+        </w:tc>
+      </w:tr>
+      <w:tr>
+        <w:tc>
+          <w:tcPr>
+            <w:cnfStyle w:val="001000000000" w:firstRow="0" w:lastRow="0" w:firstColumn="1" w:lastColumn="0" w:oddVBand="0" w:evenVBand="0" w:oddHBand="0" w:evenHBand="0" w:firstRowFirstColumn="0" w:firstRowLastColumn="0" w:lastRowFirstColumn="0" w:lastRowLastColumn="0"/>
+            <w:tcW w:w="0" w:type="auto"/>
+            <w:hideMark/>
+          </w:tcPr>
+          <w:p>
+            <w:pPr>
+              <w:pStyle w:val="IT"/>
+              <w:rPr>
+                <w:lang/>
+              </w:rPr>
+            </w:pPr>
+            <w:r>
+              <w:rPr>
+                <w:lang/>
+              </w:rPr>
+              <w:t>appointment_id</w:t>
+            </w:r>
+          </w:p>
+        </w:tc>
+        <w:tc>
+          <w:tcPr>
+            <w:tcW w:w="0" w:type="auto"/>
+            <w:hideMark/>
+          </w:tcPr>
+          <w:p>
+            <w:pPr>
+              <w:pStyle w:val="IT"/>
+              <w:cnfStyle w:val="000000000000" w:firstRow="0" w:lastRow="0" w:firstColumn="0" w:lastColumn="0" w:oddVBand="0" w:evenVBand="0" w:oddHBand="0" w:evenHBand="0" w:firstRowFirstColumn="0" w:firstRowLastColumn="0" w:lastRowFirstColumn="0" w:lastRowLastColumn="0"/>
+              <w:rPr>
+                <w:lang/>
+              </w:rPr>
+            </w:pPr>
+            <w:r>
+              <w:rPr>
+                <w:lang/>
+              </w:rPr>
+              <w:t>INT</w:t>
+            </w:r>
+          </w:p>
+        </w:tc>
+        <w:tc>
+          <w:tcPr>
+            <w:tcW w:w="0" w:type="auto"/>
+            <w:hideMark/>
+          </w:tcPr>
+          <w:p>
+            <w:pPr>
+              <w:pStyle w:val="IT"/>
+              <w:cnfStyle w:val="000000000000" w:firstRow="0" w:lastRow="0" w:firstColumn="0" w:lastColumn="0" w:oddVBand="0" w:evenVBand="0" w:oddHBand="0" w:evenHBand="0" w:firstRowFirstColumn="0" w:firstRowLastColumn="0" w:lastRowFirstColumn="0" w:lastRowLastColumn="0"/>
+              <w:rPr>
+                <w:lang/>
+              </w:rPr>
+            </w:pPr>
+            <w:r>
+              <w:rPr>
+                <w:lang/>
+              </w:rPr>
+              <w:t>Foreign key</w:t>
+            </w:r>
+          </w:p>
+        </w:tc>
+      </w:tr>
+      <w:tr>
+        <w:trPr>
+          <w:cnfStyle w:val="000000100000" w:firstRow="0" w:lastRow="0" w:firstColumn="0" w:lastColumn="0" w:oddVBand="0" w:evenVBand="0" w:oddHBand="1" w:evenHBand="0" w:firstRowFirstColumn="0" w:firstRowLastColumn="0" w:lastRowFirstColumn="0" w:lastRowLastColumn="0"/>
+        </w:trPr>
+        <w:tc>
+          <w:tcPr>
+            <w:cnfStyle w:val="001000000000" w:firstRow="0" w:lastRow="0" w:firstColumn="1" w:lastColumn="0" w:oddVBand="0" w:evenVBand="0" w:oddHBand="0" w:evenHBand="0" w:firstRowFirstColumn="0" w:firstRowLastColumn="0" w:lastRowFirstColumn="0" w:lastRowLastColumn="0"/>
+            <w:tcW w:w="0" w:type="auto"/>
+            <w:hideMark/>
+          </w:tcPr>
+          <w:p>
+            <w:pPr>
+              <w:pStyle w:val="IT"/>
+              <w:rPr>
+                <w:lang/>
+              </w:rPr>
+            </w:pPr>
+            <w:r>
+              <w:rPr>
+                <w:lang/>
+              </w:rPr>
+              <w:lastRenderedPageBreak/>
+              <w:t>medicine_id</w:t>
+            </w:r>
+          </w:p>
+        </w:tc>
+        <w:tc>
+          <w:tcPr>
+            <w:tcW w:w="0" w:type="auto"/>
+            <w:hideMark/>
+          </w:tcPr>
+          <w:p>
+            <w:pPr>
+              <w:pStyle w:val="IT"/>
+              <w:cnfStyle w:val="000000100000" w:firstRow="0" w:lastRow="0" w:firstColumn="0" w:lastColumn="0" w:oddVBand="0" w:evenVBand="0" w:oddHBand="1" w:evenHBand="0" w:firstRowFirstColumn="0" w:firstRowLastColumn="0" w:lastRowFirstColumn="0" w:lastRowLastColumn="0"/>
+              <w:rPr>
+                <w:lang/>
+              </w:rPr>
+            </w:pPr>
+            <w:r>
+              <w:rPr>
+                <w:lang/>
+              </w:rPr>
+              <w:t>INT</w:t>
+            </w:r>
+          </w:p>
+        </w:tc>
+        <w:tc>
+          <w:tcPr>
+            <w:tcW w:w="0" w:type="auto"/>
+            <w:hideMark/>
+          </w:tcPr>
+          <w:p>
+            <w:pPr>
+              <w:pStyle w:val="IT"/>
+              <w:cnfStyle w:val="000000100000" w:firstRow="0" w:lastRow="0" w:firstColumn="0" w:lastColumn="0" w:oddVBand="0" w:evenVBand="0" w:oddHBand="1" w:evenHBand="0" w:firstRowFirstColumn="0" w:firstRowLastColumn="0" w:lastRowFirstColumn="0" w:lastRowLastColumn="0"/>
+              <w:rPr>
+                <w:lang/>
+              </w:rPr>
+            </w:pPr>
+            <w:r>
+              <w:rPr>
+                <w:lang/>
+              </w:rPr>
+              <w:t>Foreign key, optional</w:t>
+            </w:r>
+          </w:p>
+        </w:tc>
+      </w:tr>
+      <w:tr>
+        <w:tc>
+          <w:tcPr>
+            <w:cnfStyle w:val="001000000000" w:firstRow="0" w:lastRow="0" w:firstColumn="1" w:lastColumn="0" w:oddVBand="0" w:evenVBand="0" w:oddHBand="0" w:evenHBand="0" w:firstRowFirstColumn="0" w:firstRowLastColumn="0" w:lastRowFirstColumn="0" w:lastRowLastColumn="0"/>
+            <w:tcW w:w="0" w:type="auto"/>
+            <w:hideMark/>
+          </w:tcPr>
+          <w:p>
+            <w:pPr>
+              <w:pStyle w:val="IT"/>
+              <w:rPr>
+                <w:lang/>
+              </w:rPr>
+            </w:pPr>
+            <w:r>
+              <w:rPr>
+                <w:lang/>
+              </w:rPr>
+              <w:t>diagnosis</w:t>
+            </w:r>
+          </w:p>
+        </w:tc>
+        <w:tc>
+          <w:tcPr>
+            <w:tcW w:w="0" w:type="auto"/>
+            <w:hideMark/>
+          </w:tcPr>
+          <w:p>
+            <w:pPr>
+              <w:pStyle w:val="IT"/>
+              <w:cnfStyle w:val="000000000000" w:firstRow="0" w:lastRow="0" w:firstColumn="0" w:lastColumn="0" w:oddVBand="0" w:evenVBand="0" w:oddHBand="0" w:evenHBand="0" w:firstRowFirstColumn="0" w:firstRowLastColumn="0" w:lastRowFirstColumn="0" w:lastRowLastColumn="0"/>
+              <w:rPr>
+                <w:lang/>
+              </w:rPr>
+            </w:pPr>
+            <w:r>
+              <w:rPr>
+                <w:lang/>
+              </w:rPr>
+              <w:t>VARCHAR(255)</w:t>
+            </w:r>
+          </w:p>
+        </w:tc>
+        <w:tc>
+          <w:tcPr>
+            <w:tcW w:w="0" w:type="auto"/>
+            <w:hideMark/>
+          </w:tcPr>
+          <w:p>
+            <w:pPr>
+              <w:pStyle w:val="IT"/>
+              <w:cnfStyle w:val="000000000000" w:firstRow="0" w:lastRow="0" w:firstColumn="0" w:lastColumn="0" w:oddVBand="0" w:evenVBand="0" w:oddHBand="0" w:evenHBand="0" w:firstRowFirstColumn="0" w:firstRowLastColumn="0" w:lastRowFirstColumn="0" w:lastRowLastColumn="0"/>
+              <w:rPr>
+                <w:lang/>
+              </w:rPr>
+            </w:pPr>
+            <w:r>
+              <w:rPr>
+                <w:lang/>
+              </w:rPr>
+              <w:t>Not null</w:t>
+            </w:r>
+          </w:p>
+        </w:tc>
+      </w:tr>
+      <w:tr>
+        <w:trPr>
+          <w:cnfStyle w:val="000000100000" w:firstRow="0" w:lastRow="0" w:firstColumn="0" w:lastColumn="0" w:oddVBand="0" w:evenVBand="0" w:oddHBand="1" w:evenHBand="0" w:firstRowFirstColumn="0" w:firstRowLastColumn="0" w:lastRowFirstColumn="0" w:lastRowLastColumn="0"/>
+        </w:trPr>
+        <w:tc>
+          <w:tcPr>
+            <w:cnfStyle w:val="001000000000" w:firstRow="0" w:lastRow="0" w:firstColumn="1" w:lastColumn="0" w:oddVBand="0" w:evenVBand="0" w:oddHBand="0" w:evenHBand="0" w:firstRowFirstColumn="0" w:firstRowLastColumn="0" w:lastRowFirstColumn="0" w:lastRowLastColumn="0"/>
+            <w:tcW w:w="0" w:type="auto"/>
+            <w:hideMark/>
+          </w:tcPr>
+          <w:p>
+            <w:pPr>
+              <w:pStyle w:val="IT"/>
+              <w:rPr>
+                <w:lang/>
+              </w:rPr>
+            </w:pPr>
+            <w:r>
+              <w:rPr>
+                <w:lang/>
+              </w:rPr>
+              <w:t>procedure_name</w:t>
+            </w:r>
+          </w:p>
+        </w:tc>
+        <w:tc>
+          <w:tcPr>
+            <w:tcW w:w="0" w:type="auto"/>
+            <w:hideMark/>
+          </w:tcPr>
+          <w:p>
+            <w:pPr>
+              <w:pStyle w:val="IT"/>
+              <w:cnfStyle w:val="000000100000" w:firstRow="0" w:lastRow="0" w:firstColumn="0" w:lastColumn="0" w:oddVBand="0" w:evenVBand="0" w:oddHBand="1" w:evenHBand="0" w:firstRowFirstColumn="0" w:firstRowLastColumn="0" w:lastRowFirstColumn="0" w:lastRowLastColumn="0"/>
+              <w:rPr>
+                <w:lang/>
+              </w:rPr>
+            </w:pPr>
+            <w:r>
+              <w:rPr>
+                <w:lang/>
+              </w:rPr>
+              <w:t>VARCHAR(150)</w:t>
+            </w:r>
+          </w:p>
+        </w:tc>
+        <w:tc>
+          <w:tcPr>
+            <w:tcW w:w="0" w:type="auto"/>
+            <w:hideMark/>
+          </w:tcPr>
+          <w:p>
+            <w:pPr>
+              <w:pStyle w:val="IT"/>
+              <w:cnfStyle w:val="000000100000" w:firstRow="0" w:lastRow="0" w:firstColumn="0" w:lastColumn="0" w:oddVBand="0" w:evenVBand="0" w:oddHBand="1" w:evenHBand="0" w:firstRowFirstColumn="0" w:firstRowLastColumn="0" w:lastRowFirstColumn="0" w:lastRowLastColumn="0"/>
+              <w:rPr>
+                <w:lang/>
+              </w:rPr>
+            </w:pPr>
+            <w:r>
+              <w:rPr>
+                <w:lang/>
+              </w:rPr>
+              <w:t>Optional</w:t>
+            </w:r>
+          </w:p>
+        </w:tc>
+      </w:tr>
+      <w:tr>
+        <w:tc>
+          <w:tcPr>
+            <w:cnfStyle w:val="001000000000" w:firstRow="0" w:lastRow="0" w:firstColumn="1" w:lastColumn="0" w:oddVBand="0" w:evenVBand="0" w:oddHBand="0" w:evenHBand="0" w:firstRowFirstColumn="0" w:firstRowLastColumn="0" w:lastRowFirstColumn="0" w:lastRowLastColumn="0"/>
+            <w:tcW w:w="0" w:type="auto"/>
+            <w:hideMark/>
+          </w:tcPr>
+          <w:p>
+            <w:pPr>
+              <w:pStyle w:val="IT"/>
+              <w:rPr>
+                <w:lang/>
+              </w:rPr>
+            </w:pPr>
+            <w:r>
+              <w:rPr>
+                <w:lang/>
+              </w:rPr>
+              <w:t>dosage</w:t>
+            </w:r>
+          </w:p>
+        </w:tc>
+        <w:tc>
+          <w:tcPr>
+            <w:tcW w:w="0" w:type="auto"/>
+            <w:hideMark/>
+          </w:tcPr>
+          <w:p>
+            <w:pPr>
+              <w:pStyle w:val="IT"/>
+              <w:cnfStyle w:val="000000000000" w:firstRow="0" w:lastRow="0" w:firstColumn="0" w:lastColumn="0" w:oddVBand="0" w:evenVBand="0" w:oddHBand="0" w:evenHBand="0" w:firstRowFirstColumn="0" w:firstRowLastColumn="0" w:lastRowFirstColumn="0" w:lastRowLastColumn="0"/>
+              <w:rPr>
+                <w:lang/>
+              </w:rPr>
+            </w:pPr>
+            <w:r>
+              <w:rPr>
+                <w:lang/>
+              </w:rPr>
+              <w:t>VARCHAR(100)</w:t>
+            </w:r>
+          </w:p>
+        </w:tc>
+        <w:tc>
+          <w:tcPr>
+            <w:tcW w:w="0" w:type="auto"/>
+            <w:hideMark/>
+          </w:tcPr>
+          <w:p>
+            <w:pPr>
+              <w:pStyle w:val="IT"/>
+              <w:cnfStyle w:val="000000000000" w:firstRow="0" w:lastRow="0" w:firstColumn="0" w:lastColumn="0" w:oddVBand="0" w:evenVBand="0" w:oddHBand="0" w:evenHBand="0" w:firstRowFirstColumn="0" w:firstRowLastColumn="0" w:lastRowFirstColumn="0" w:lastRowLastColumn="0"/>
+              <w:rPr>
+                <w:lang/>
+              </w:rPr>
+            </w:pPr>
+            <w:r>
+              <w:rPr>
+                <w:lang/>
+              </w:rPr>
+              <w:t>Optional</w:t>
+            </w:r>
+          </w:p>
+        </w:tc>
+      </w:tr>
+      <w:tr>
+        <w:trPr>
+          <w:cnfStyle w:val="000000100000" w:firstRow="0" w:lastRow="0" w:firstColumn="0" w:lastColumn="0" w:oddVBand="0" w:evenVBand="0" w:oddHBand="1" w:evenHBand="0" w:firstRowFirstColumn="0" w:firstRowLastColumn="0" w:lastRowFirstColumn="0" w:lastRowLastColumn="0"/>
+        </w:trPr>
+        <w:tc>
+          <w:tcPr>
+            <w:cnfStyle w:val="001000000000" w:firstRow="0" w:lastRow="0" w:firstColumn="1" w:lastColumn="0" w:oddVBand="0" w:evenVBand="0" w:oddHBand="0" w:evenHBand="0" w:firstRowFirstColumn="0" w:firstRowLastColumn="0" w:lastRowFirstColumn="0" w:lastRowLastColumn="0"/>
+            <w:tcW w:w="0" w:type="auto"/>
+            <w:hideMark/>
+          </w:tcPr>
+          <w:p>
+            <w:pPr>
+              <w:pStyle w:val="IT"/>
+              <w:rPr>
+                <w:lang/>
+              </w:rPr>
+            </w:pPr>
+            <w:r>
+              <w:rPr>
+                <w:lang/>
+              </w:rPr>
+              <w:t>treatment_date</w:t>
+            </w:r>
+          </w:p>
+        </w:tc>
+        <w:tc>
+          <w:tcPr>
+            <w:tcW w:w="0" w:type="auto"/>
+            <w:hideMark/>
+          </w:tcPr>
+          <w:p>
+            <w:pPr>
+              <w:pStyle w:val="IT"/>
+              <w:cnfStyle w:val="000000100000" w:firstRow="0" w:lastRow="0" w:firstColumn="0" w:lastColumn="0" w:oddVBand="0" w:evenVBand="0" w:oddHBand="1" w:evenHBand="0" w:firstRowFirstColumn="0" w:firstRowLastColumn="0" w:lastRowFirstColumn="0" w:lastRowLastColumn="0"/>
+              <w:rPr>
+                <w:lang/>
+              </w:rPr>
+            </w:pPr>
+            <w:r>
+              <w:rPr>
+                <w:lang/>
+              </w:rPr>
+              <w:t>DATE</w:t>
+            </w:r>
+          </w:p>
+        </w:tc>
+        <w:tc>
+          <w:tcPr>
+            <w:tcW w:w="0" w:type="auto"/>
+            <w:hideMark/>
+          </w:tcPr>
+          <w:p>
+            <w:pPr>
+              <w:pStyle w:val="IT"/>
+              <w:cnfStyle w:val="000000100000" w:firstRow="0" w:lastRow="0" w:firstColumn="0" w:lastColumn="0" w:oddVBand="0" w:evenVBand="0" w:oddHBand="1" w:evenHBand="0" w:firstRowFirstColumn="0" w:firstRowLastColumn="0" w:lastRowFirstColumn="0" w:lastRowLastColumn="0"/>
+              <w:rPr>
+                <w:lang/>
+              </w:rPr>
+            </w:pPr>
+            <w:r>
+              <w:rPr>
+                <w:lang/>
+              </w:rPr>
+              <w:t>Not null</w:t>
+            </w:r>
+          </w:p>
+        </w:tc>
+      </w:tr>
+      <w:tr>
+        <w:tc>
+          <w:tcPr>
+            <w:cnfStyle w:val="001000000000" w:firstRow="0" w:lastRow="0" w:firstColumn="1" w:lastColumn="0" w:oddVBand="0" w:evenVBand="0" w:oddHBand="0" w:evenHBand="0" w:firstRowFirstColumn="0" w:firstRowLastColumn="0" w:lastRowFirstColumn="0" w:lastRowLastColumn="0"/>
+            <w:tcW w:w="0" w:type="auto"/>
+            <w:hideMark/>
+          </w:tcPr>
+          <w:p>
+            <w:pPr>
+              <w:pStyle w:val="IT"/>
+              <w:rPr>
+                <w:lang/>
+              </w:rPr>
+            </w:pPr>
+            <w:r>
+              <w:rPr>
+                <w:lang/>
+              </w:rPr>
+              <w:t>treatment_cost</w:t>
+            </w:r>
+          </w:p>
+        </w:tc>
+        <w:tc>
+          <w:tcPr>
+            <w:tcW w:w="0" w:type="auto"/>
+            <w:hideMark/>
+          </w:tcPr>
+          <w:p>
+            <w:pPr>
+              <w:pStyle w:val="IT"/>
+              <w:cnfStyle w:val="000000000000" w:firstRow="0" w:lastRow="0" w:firstColumn="0" w:lastColumn="0" w:oddVBand="0" w:evenVBand="0" w:oddHBand="0" w:evenHBand="0" w:firstRowFirstColumn="0" w:firstRowLastColumn="0" w:lastRowFirstColumn="0" w:lastRowLastColumn="0"/>
+              <w:rPr>
+                <w:lang/>
+              </w:rPr>
+            </w:pPr>
+            <w:r>
+              <w:rPr>
+                <w:lang/>
+              </w:rPr>
+              <w:t>DECIMAL(10,2)</w:t>
+            </w:r>
+          </w:p>
+        </w:tc>
+        <w:tc>
+          <w:tcPr>
+            <w:tcW w:w="0" w:type="auto"/>
+            <w:hideMark/>
+          </w:tcPr>
+          <w:p>
+            <w:pPr>
+              <w:pStyle w:val="IT"/>
+              <w:cnfStyle w:val="000000000000" w:firstRow="0" w:lastRow="0" w:firstColumn="0" w:lastColumn="0" w:oddVBand="0" w:evenVBand="0" w:oddHBand="0" w:evenHBand="0" w:firstRowFirstColumn="0" w:firstRowLastColumn="0" w:lastRowFirstColumn="0" w:lastRowLastColumn="0"/>
+              <w:rPr>
+                <w:lang/>
+              </w:rPr>
+            </w:pPr>
+            <w:r>
+              <w:rPr>
+                <w:lang/>
+              </w:rPr>
+              <w:t>Not null</w:t>
+            </w:r>
+          </w:p>
+        </w:tc>
+      </w:tr>
+    </w:tbl>
+    <w:p>
+      <w:pPr>
+        <w:pStyle w:val="IT"/>
+        <w:rPr>
+          <w:lang/>
+        </w:rPr>
+      </w:pPr>
+      <w:r>
+        <w:rPr>
+          <w:lang/>
+        </w:rPr>
+        <w:t>A treatment record may refer to one medicine. When several medicines are prescribed during the same appointment, a separate treatment record can be entered for each medicine.</w:t>
+      </w:r>
+    </w:p>
+    <w:p>
+      <w:pPr>
+        <w:pStyle w:val="IT"/>
+        <w:rPr>
+          <w:lang/>
+        </w:rPr>
+      </w:pPr>
+      <w:r>
+        <w:rPr>
+          <w:b/>
+          <w:bCs/>
+          <w:lang/>
+        </w:rPr>
+        <w:t>6. Payments</w:t>
+      </w:r>
+    </w:p>
+    <w:p>
+      <w:pPr>
+        <w:pStyle w:val="IT"/>
+        <w:rPr>
+          <w:lang/>
+        </w:rPr>
+      </w:pPr>
+      <w:r>
+        <w:rPr>
+          <w:lang/>
+        </w:rPr>
+        <w:t>Records the financial transactions made for appointments and treatments.</w:t>
+      </w:r>
+    </w:p>
+    <w:tbl>
+      <w:tblPr>
+        <w:tblStyle w:val="GridTable3-Accent1"/>
+        <w:tblW w:w="0" w:type="auto"/>
+        <w:tblLook w:val="04A0" w:firstRow="1" w:lastRow="0" w:firstColumn="1" w:lastColumn="0" w:noHBand="0" w:noVBand="1"/>
+      </w:tblPr>
+      <w:tblGrid>
+        <w:gridCol w:w="1958"/>
+        <w:gridCol w:w="1890"/>
+        <w:gridCol w:w="2953"/>
+      </w:tblGrid>
+      <w:tr>
+        <w:trPr>
+          <w:cnfStyle w:val="100000000000" w:firstRow="1" w:lastRow="0" w:firstColumn="0" w:lastColumn="0" w:oddVBand="0" w:evenVBand="0" w:oddHBand="0" w:evenHBand="0" w:firstRowFirstColumn="0" w:firstRowLastColumn="0" w:lastRowFirstColumn="0" w:lastRowLastColumn="0"/>
+        </w:trPr>
+        <w:tc>
+          <w:tcPr>
+            <w:cnfStyle w:val="001000000100" w:firstRow="0" w:lastRow="0" w:firstColumn="1" w:lastColumn="0" w:oddVBand="0" w:evenVBand="0" w:oddHBand="0" w:evenHBand="0" w:firstRowFirstColumn="1" w:firstRowLastColumn="0" w:lastRowFirstColumn="0" w:lastRowLastColumn="0"/>
+            <w:tcW w:w="0" w:type="auto"/>
+            <w:hideMark/>
+          </w:tcPr>
+          <w:p>
+            <w:pPr>
+              <w:pStyle w:val="IT"/>
+              <w:rPr>
+                <w:lang/>
+              </w:rPr>
+            </w:pPr>
+            <w:r>
+              <w:rPr>
+                <w:lang/>
+              </w:rPr>
+              <w:t>Attribute</w:t>
+            </w:r>
+          </w:p>
+        </w:tc>
+        <w:tc>
+          <w:tcPr>
+            <w:tcW w:w="0" w:type="auto"/>
+            <w:hideMark/>
+          </w:tcPr>
+          <w:p>
+            <w:pPr>
+              <w:pStyle w:val="IT"/>
+              <w:cnfStyle w:val="100000000000" w:firstRow="1" w:lastRow="0" w:firstColumn="0" w:lastColumn="0" w:oddVBand="0" w:evenVBand="0" w:oddHBand="0" w:evenHBand="0" w:firstRowFirstColumn="0" w:firstRowLastColumn="0" w:lastRowFirstColumn="0" w:lastRowLastColumn="0"/>
+              <w:rPr>
+                <w:lang/>
+              </w:rPr>
+            </w:pPr>
+            <w:r>
+              <w:rPr>
+                <w:lang/>
+              </w:rPr>
+              <w:t>Data Type</w:t>
+            </w:r>
+          </w:p>
+        </w:tc>
+        <w:tc>
+          <w:tcPr>
+            <w:tcW w:w="0" w:type="auto"/>
+            <w:hideMark/>
+          </w:tcPr>
+          <w:p>
+            <w:pPr>
+              <w:pStyle w:val="IT"/>
+              <w:cnfStyle w:val="100000000000" w:firstRow="1" w:lastRow="0" w:firstColumn="0" w:lastColumn="0" w:oddVBand="0" w:evenVBand="0" w:oddHBand="0" w:evenHBand="0" w:firstRowFirstColumn="0" w:firstRowLastColumn="0" w:lastRowFirstColumn="0" w:lastRowLastColumn="0"/>
+              <w:rPr>
+                <w:lang/>
+              </w:rPr>
+            </w:pPr>
+            <w:r>
+              <w:rPr>
+                <w:lang/>
+              </w:rPr>
+              <w:t>Constraint</w:t>
+            </w:r>
+          </w:p>
+        </w:tc>
+      </w:tr>
+      <w:tr>
+        <w:trPr>
+          <w:cnfStyle w:val="000000100000" w:firstRow="0" w:lastRow="0" w:firstColumn="0" w:lastColumn="0" w:oddVBand="0" w:evenVBand="0" w:oddHBand="1" w:evenHBand="0" w:firstRowFirstColumn="0" w:firstRowLastColumn="0" w:lastRowFirstColumn="0" w:lastRowLastColumn="0"/>
+        </w:trPr>
+        <w:tc>
+          <w:tcPr>
+            <w:cnfStyle w:val="001000000000" w:firstRow="0" w:lastRow="0" w:firstColumn="1" w:lastColumn="0" w:oddVBand="0" w:evenVBand="0" w:oddHBand="0" w:evenHBand="0" w:firstRowFirstColumn="0" w:firstRowLastColumn="0" w:lastRowFirstColumn="0" w:lastRowLastColumn="0"/>
+            <w:tcW w:w="0" w:type="auto"/>
+            <w:hideMark/>
+          </w:tcPr>
+          <w:p>
+            <w:pPr>
+              <w:pStyle w:val="IT"/>
+              <w:rPr>
+                <w:lang/>
+              </w:rPr>
+            </w:pPr>
+            <w:r>
+              <w:rPr>
+                <w:lang/>
+              </w:rPr>
+              <w:t>payment_id</w:t>
+            </w:r>
+          </w:p>
+        </w:tc>
+        <w:tc>
+          <w:tcPr>
+            <w:tcW w:w="0" w:type="auto"/>
+            <w:hideMark/>
+          </w:tcPr>
+          <w:p>
+            <w:pPr>
+              <w:pStyle w:val="IT"/>
+              <w:cnfStyle w:val="000000100000" w:firstRow="0" w:lastRow="0" w:firstColumn="0" w:lastColumn="0" w:oddVBand="0" w:evenVBand="0" w:oddHBand="1" w:evenHBand="0" w:firstRowFirstColumn="0" w:firstRowLastColumn="0" w:lastRowFirstColumn="0" w:lastRowLastColumn="0"/>
+              <w:rPr>
+                <w:lang/>
+              </w:rPr>
+            </w:pPr>
+            <w:r>
+              <w:rPr>
+                <w:lang/>
+              </w:rPr>
+              <w:t>INT</w:t>
+            </w:r>
+          </w:p>
+        </w:tc>
+        <w:tc>
+          <w:tcPr>
+            <w:tcW w:w="0" w:type="auto"/>
+            <w:hideMark/>
+          </w:tcPr>
+          <w:p>
+            <w:pPr>
+              <w:pStyle w:val="IT"/>
+              <w:cnfStyle w:val="000000100000" w:firstRow="0" w:lastRow="0" w:firstColumn="0" w:lastColumn="0" w:oddVBand="0" w:evenVBand="0" w:oddHBand="1" w:evenHBand="0" w:firstRowFirstColumn="0" w:firstRowLastColumn="0" w:lastRowFirstColumn="0" w:lastRowLastColumn="0"/>
+              <w:rPr>
+                <w:lang/>
+              </w:rPr>
+            </w:pPr>
+            <w:r>
+              <w:rPr>
+                <w:lang/>
+              </w:rPr>
+              <w:t>Primary key, auto-increment</w:t>
+            </w:r>
+          </w:p>
+        </w:tc>
+      </w:tr>
+      <w:tr>
+        <w:tc>
+          <w:tcPr>
+            <w:cnfStyle w:val="001000000000" w:firstRow="0" w:lastRow="0" w:firstColumn="1" w:lastColumn="0" w:oddVBand="0" w:evenVBand="0" w:oddHBand="0" w:evenHBand="0" w:firstRowFirstColumn="0" w:firstRowLastColumn="0" w:lastRowFirstColumn="0" w:lastRowLastColumn="0"/>
+            <w:tcW w:w="0" w:type="auto"/>
+            <w:hideMark/>
+          </w:tcPr>
+          <w:p>
+            <w:pPr>
+              <w:pStyle w:val="IT"/>
+              <w:rPr>
+                <w:lang/>
+              </w:rPr>
+            </w:pPr>
+            <w:r>
+              <w:rPr>
+                <w:lang/>
+              </w:rPr>
+              <w:t>appointment_id</w:t>
+            </w:r>
+          </w:p>
+        </w:tc>
+        <w:tc>
+          <w:tcPr>
+            <w:tcW w:w="0" w:type="auto"/>
+            <w:hideMark/>
+          </w:tcPr>
+          <w:p>
+            <w:pPr>
+              <w:pStyle w:val="IT"/>
+              <w:cnfStyle w:val="000000000000" w:firstRow="0" w:lastRow="0" w:firstColumn="0" w:lastColumn="0" w:oddVBand="0" w:evenVBand="0" w:oddHBand="0" w:evenHBand="0" w:firstRowFirstColumn="0" w:firstRowLastColumn="0" w:lastRowFirstColumn="0" w:lastRowLastColumn="0"/>
+              <w:rPr>
+                <w:lang/>
+              </w:rPr>
+            </w:pPr>
+            <w:r>
+              <w:rPr>
+                <w:lang/>
+              </w:rPr>
+              <w:t>INT</w:t>
+            </w:r>
+          </w:p>
+        </w:tc>
+        <w:tc>
+          <w:tcPr>
+            <w:tcW w:w="0" w:type="auto"/>
+            <w:hideMark/>
+          </w:tcPr>
+          <w:p>
+            <w:pPr>
+              <w:pStyle w:val="IT"/>
+              <w:cnfStyle w:val="000000000000" w:firstRow="0" w:lastRow="0" w:firstColumn="0" w:lastColumn="0" w:oddVBand="0" w:evenVBand="0" w:oddHBand="0" w:evenHBand="0" w:firstRowFirstColumn="0" w:firstRowLastColumn="0" w:lastRowFirstColumn="0" w:lastRowLastColumn="0"/>
+              <w:rPr>
+                <w:lang/>
+              </w:rPr>
+            </w:pPr>
+            <w:r>
+              <w:rPr>
+                <w:lang/>
+              </w:rPr>
+              <w:t>Foreign key</w:t>
+            </w:r>
+          </w:p>
+        </w:tc>
+      </w:tr>
+      <w:tr>
+        <w:trPr>
+          <w:cnfStyle w:val="000000100000" w:firstRow="0" w:lastRow="0" w:firstColumn="0" w:lastColumn="0" w:oddVBand="0" w:evenVBand="0" w:oddHBand="1" w:evenHBand="0" w:firstRowFirstColumn="0" w:firstRowLastColumn="0" w:lastRowFirstColumn="0" w:lastRowLastColumn="0"/>
+        </w:trPr>
+        <w:tc>
+          <w:tcPr>
+            <w:cnfStyle w:val="001000000000" w:firstRow="0" w:lastRow="0" w:firstColumn="1" w:lastColumn="0" w:oddVBand="0" w:evenVBand="0" w:oddHBand="0" w:evenHBand="0" w:firstRowFirstColumn="0" w:firstRowLastColumn="0" w:lastRowFirstColumn="0" w:lastRowLastColumn="0"/>
+            <w:tcW w:w="0" w:type="auto"/>
+            <w:hideMark/>
+          </w:tcPr>
+          <w:p>
+            <w:pPr>
+              <w:pStyle w:val="IT"/>
+              <w:rPr>
+                <w:lang/>
+              </w:rPr>
+            </w:pPr>
+            <w:r>
+              <w:rPr>
+                <w:lang/>
+              </w:rPr>
+              <w:t>payment_date</w:t>
+            </w:r>
+          </w:p>
+        </w:tc>
+        <w:tc>
+          <w:tcPr>
+            <w:tcW w:w="0" w:type="auto"/>
+            <w:hideMark/>
+          </w:tcPr>
+          <w:p>
+            <w:pPr>
+              <w:pStyle w:val="IT"/>
+              <w:cnfStyle w:val="000000100000" w:firstRow="0" w:lastRow="0" w:firstColumn="0" w:lastColumn="0" w:oddVBand="0" w:evenVBand="0" w:oddHBand="1" w:evenHBand="0" w:firstRowFirstColumn="0" w:firstRowLastColumn="0" w:lastRowFirstColumn="0" w:lastRowLastColumn="0"/>
+              <w:rPr>
+                <w:lang/>
+              </w:rPr>
+            </w:pPr>
+            <w:r>
+              <w:rPr>
+                <w:lang/>
+              </w:rPr>
+              <w:t>DATE</w:t>
+            </w:r>
+          </w:p>
+        </w:tc>
+        <w:tc>
+          <w:tcPr>
+            <w:tcW w:w="0" w:type="auto"/>
+            <w:hideMark/>
+          </w:tcPr>
+          <w:p>
+            <w:pPr>
+              <w:pStyle w:val="IT"/>
+              <w:cnfStyle w:val="000000100000" w:firstRow="0" w:lastRow="0" w:firstColumn="0" w:lastColumn="0" w:oddVBand="0" w:evenVBand="0" w:oddHBand="1" w:evenHBand="0" w:firstRowFirstColumn="0" w:firstRowLastColumn="0" w:lastRowFirstColumn="0" w:lastRowLastColumn="0"/>
+              <w:rPr>
+                <w:lang/>
+              </w:rPr>
+            </w:pPr>
+            <w:r>
+              <w:rPr>
+                <w:lang/>
+              </w:rPr>
+              <w:t>Not null</w:t>
+            </w:r>
+          </w:p>
+        </w:tc>
+      </w:tr>
+      <w:tr>
+        <w:tc>
+          <w:tcPr>
+            <w:cnfStyle w:val="001000000000" w:firstRow="0" w:lastRow="0" w:firstColumn="1" w:lastColumn="0" w:oddVBand="0" w:evenVBand="0" w:oddHBand="0" w:evenHBand="0" w:firstRowFirstColumn="0" w:firstRowLastColumn="0" w:lastRowFirstColumn="0" w:lastRowLastColumn="0"/>
+            <w:tcW w:w="0" w:type="auto"/>
+            <w:hideMark/>
+          </w:tcPr>
+          <w:p>
+            <w:pPr>
+              <w:pStyle w:val="IT"/>
+              <w:rPr>
+                <w:lang/>
+              </w:rPr>
+            </w:pPr>
+            <w:r>
+              <w:rPr>
+                <w:lang/>
+              </w:rPr>
+              <w:t>amount</w:t>
+            </w:r>
+          </w:p>
+        </w:tc>
+        <w:tc>
+          <w:tcPr>
+            <w:tcW w:w="0" w:type="auto"/>
+            <w:hideMark/>
+          </w:tcPr>
+          <w:p>
+            <w:pPr>
+              <w:pStyle w:val="IT"/>
+              <w:cnfStyle w:val="000000000000" w:firstRow="0" w:lastRow="0" w:firstColumn="0" w:lastColumn="0" w:oddVBand="0" w:evenVBand="0" w:oddHBand="0" w:evenHBand="0" w:firstRowFirstColumn="0" w:firstRowLastColumn="0" w:lastRowFirstColumn="0" w:lastRowLastColumn="0"/>
+              <w:rPr>
+                <w:lang/>
+              </w:rPr>
+            </w:pPr>
+            <w:r>
+              <w:rPr>
+                <w:lang/>
+              </w:rPr>
+              <w:t>DECIMAL(10,2)</w:t>
+            </w:r>
+          </w:p>
+        </w:tc>
+        <w:tc>
+          <w:tcPr>
+            <w:tcW w:w="0" w:type="auto"/>
+            <w:hideMark/>
+          </w:tcPr>
+          <w:p>
+            <w:pPr>
+              <w:pStyle w:val="IT"/>
+              <w:cnfStyle w:val="000000000000" w:firstRow="0" w:lastRow="0" w:firstColumn="0" w:lastColumn="0" w:oddVBand="0" w:evenVBand="0" w:oddHBand="0" w:evenHBand="0" w:firstRowFirstColumn="0" w:firstRowLastColumn="0" w:lastRowFirstColumn="0" w:lastRowLastColumn="0"/>
+              <w:rPr>
+                <w:lang/>
+              </w:rPr>
+            </w:pPr>
+            <w:r>
+              <w:rPr>
+                <w:lang/>
+              </w:rPr>
+              <w:t>Not null</w:t>
+            </w:r>
+          </w:p>
+        </w:tc>
+      </w:tr>
+      <w:tr>
+        <w:trPr>
+          <w:cnfStyle w:val="000000100000" w:firstRow="0" w:lastRow="0" w:firstColumn="0" w:lastColumn="0" w:oddVBand="0" w:evenVBand="0" w:oddHBand="1" w:evenHBand="0" w:firstRowFirstColumn="0" w:firstRowLastColumn="0" w:lastRowFirstColumn="0" w:lastRowLastColumn="0"/>
+        </w:trPr>
+        <w:tc>
+          <w:tcPr>
+            <w:cnfStyle w:val="001000000000" w:firstRow="0" w:lastRow="0" w:firstColumn="1" w:lastColumn="0" w:oddVBand="0" w:evenVBand="0" w:oddHBand="0" w:evenHBand="0" w:firstRowFirstColumn="0" w:firstRowLastColumn="0" w:lastRowFirstColumn="0" w:lastRowLastColumn="0"/>
+            <w:tcW w:w="0" w:type="auto"/>
+            <w:hideMark/>
+          </w:tcPr>
+          <w:p>
+            <w:pPr>
+              <w:pStyle w:val="IT"/>
+              <w:rPr>
+                <w:lang/>
+              </w:rPr>
+            </w:pPr>
+            <w:r>
+              <w:rPr>
+                <w:lang/>
+              </w:rPr>
+              <w:t>payment_method</w:t>
+            </w:r>
+          </w:p>
+        </w:tc>
+        <w:tc>
+          <w:tcPr>
+            <w:tcW w:w="0" w:type="auto"/>
+            <w:hideMark/>
+          </w:tcPr>
+          <w:p>
+            <w:pPr>
+              <w:pStyle w:val="IT"/>
+              <w:cnfStyle w:val="000000100000" w:firstRow="0" w:lastRow="0" w:firstColumn="0" w:lastColumn="0" w:oddVBand="0" w:evenVBand="0" w:oddHBand="1" w:evenHBand="0" w:firstRowFirstColumn="0" w:firstRowLastColumn="0" w:lastRowFirstColumn="0" w:lastRowLastColumn="0"/>
+              <w:rPr>
+                <w:lang/>
+              </w:rPr>
+            </w:pPr>
+            <w:r>
+              <w:rPr>
+                <w:lang/>
+              </w:rPr>
+              <w:t>ENUM</w:t>
+            </w:r>
+          </w:p>
+        </w:tc>
+        <w:tc>
+          <w:tcPr>
+            <w:tcW w:w="0" w:type="auto"/>
+            <w:hideMark/>
+          </w:tcPr>
+          <w:p>
+            <w:pPr>
+              <w:pStyle w:val="IT"/>
+              <w:cnfStyle w:val="000000100000" w:firstRow="0" w:lastRow="0" w:firstColumn="0" w:lastColumn="0" w:oddVBand="0" w:evenVBand="0" w:oddHBand="1" w:evenHBand="0" w:firstRowFirstColumn="0" w:firstRowLastColumn="0" w:lastRowFirstColumn="0" w:lastRowLastColumn="0"/>
+              <w:rPr>
+                <w:lang/>
+              </w:rPr>
+            </w:pPr>
+            <w:r>
+              <w:rPr>
+                <w:lang/>
+              </w:rPr>
+              <w:t>Not null</w:t>
+            </w:r>
+          </w:p>
+        </w:tc>
+      </w:tr>
+      <w:tr>
+        <w:tc>
+          <w:tcPr>
+            <w:cnfStyle w:val="001000000000" w:firstRow="0" w:lastRow="0" w:firstColumn="1" w:lastColumn="0" w:oddVBand="0" w:evenVBand="0" w:oddHBand="0" w:evenHBand="0" w:firstRowFirstColumn="0" w:firstRowLastColumn="0" w:lastRowFirstColumn="0" w:lastRowLastColumn="0"/>
+            <w:tcW w:w="0" w:type="auto"/>
+            <w:hideMark/>
+          </w:tcPr>
+          <w:p>
+            <w:pPr>
+              <w:pStyle w:val="IT"/>
+              <w:rPr>
+                <w:lang/>
+              </w:rPr>
+            </w:pPr>
+            <w:r>
+              <w:rPr>
+                <w:lang/>
+              </w:rPr>
+              <w:t>payment_status</w:t>
+            </w:r>
+          </w:p>
+        </w:tc>
+        <w:tc>
+          <w:tcPr>
+            <w:tcW w:w="0" w:type="auto"/>
+            <w:hideMark/>
+          </w:tcPr>
+          <w:p>
+            <w:pPr>
+              <w:pStyle w:val="IT"/>
+              <w:cnfStyle w:val="000000000000" w:firstRow="0" w:lastRow="0" w:firstColumn="0" w:lastColumn="0" w:oddVBand="0" w:evenVBand="0" w:oddHBand="0" w:evenHBand="0" w:firstRowFirstColumn="0" w:firstRowLastColumn="0" w:lastRowFirstColumn="0" w:lastRowLastColumn="0"/>
+              <w:rPr>
+                <w:lang/>
+              </w:rPr>
+            </w:pPr>
+            <w:r>
+              <w:rPr>
+                <w:lang/>
+              </w:rPr>
+              <w:t>ENUM</w:t>
+            </w:r>
+          </w:p>
+        </w:tc>
+        <w:tc>
+          <w:tcPr>
+            <w:tcW w:w="0" w:type="auto"/>
+            <w:hideMark/>
+          </w:tcPr>
+          <w:p>
+            <w:pPr>
+              <w:pStyle w:val="IT"/>
+              <w:cnfStyle w:val="000000000000" w:firstRow="0" w:lastRow="0" w:firstColumn="0" w:lastColumn="0" w:oddVBand="0" w:evenVBand="0" w:oddHBand="0" w:evenHBand="0" w:firstRowFirstColumn="0" w:firstRowLastColumn="0" w:lastRowFirstColumn="0" w:lastRowLastColumn="0"/>
+              <w:rPr>
+                <w:lang/>
+              </w:rPr>
+            </w:pPr>
+            <w:r>
+              <w:rPr>
+                <w:lang/>
+              </w:rPr>
+              <w:t>Not null</w:t>
+            </w:r>
+          </w:p>
+        </w:tc>
+      </w:tr>
+      <w:tr>
+        <w:trPr>
+          <w:cnfStyle w:val="000000100000" w:firstRow="0" w:lastRow="0" w:firstColumn="0" w:lastColumn="0" w:oddVBand="0" w:evenVBand="0" w:oddHBand="1" w:evenHBand="0" w:firstRowFirstColumn="0" w:firstRowLastColumn="0" w:lastRowFirstColumn="0" w:lastRowLastColumn="0"/>
+        </w:trPr>
+        <w:tc>
+          <w:tcPr>
+            <w:cnfStyle w:val="001000000000" w:firstRow="0" w:lastRow="0" w:firstColumn="1" w:lastColumn="0" w:oddVBand="0" w:evenVBand="0" w:oddHBand="0" w:evenHBand="0" w:firstRowFirstColumn="0" w:firstRowLastColumn="0" w:lastRowFirstColumn="0" w:lastRowLastColumn="0"/>
+            <w:tcW w:w="0" w:type="auto"/>
+            <w:hideMark/>
+          </w:tcPr>
+          <w:p>
+            <w:pPr>
+              <w:pStyle w:val="IT"/>
+              <w:rPr>
+                <w:lang/>
+              </w:rPr>
+            </w:pPr>
+            <w:r>
+              <w:rPr>
+                <w:lang/>
+              </w:rPr>
+              <w:t>reference_number</w:t>
+            </w:r>
+          </w:p>
+        </w:tc>
+        <w:tc>
+          <w:tcPr>
+            <w:tcW w:w="0" w:type="auto"/>
+            <w:hideMark/>
+          </w:tcPr>
+          <w:p>
+            <w:pPr>
+              <w:pStyle w:val="IT"/>
+              <w:cnfStyle w:val="000000100000" w:firstRow="0" w:lastRow="0" w:firstColumn="0" w:lastColumn="0" w:oddVBand="0" w:evenVBand="0" w:oddHBand="1" w:evenHBand="0" w:firstRowFirstColumn="0" w:firstRowLastColumn="0" w:lastRowFirstColumn="0" w:lastRowLastColumn="0"/>
+              <w:rPr>
+                <w:lang/>
+              </w:rPr>
+            </w:pPr>
+            <w:r>
+              <w:rPr>
+                <w:lang/>
+              </w:rPr>
+              <w:t>VARCHAR(50)</w:t>
+            </w:r>
+          </w:p>
+        </w:tc>
+        <w:tc>
+          <w:tcPr>
+            <w:tcW w:w="0" w:type="auto"/>
+            <w:hideMark/>
+          </w:tcPr>
+          <w:p>
+            <w:pPr>
+              <w:pStyle w:val="IT"/>
+              <w:cnfStyle w:val="000000100000" w:firstRow="0" w:lastRow="0" w:firstColumn="0" w:lastColumn="0" w:oddVBand="0" w:evenVBand="0" w:oddHBand="1" w:evenHBand="0" w:firstRowFirstColumn="0" w:firstRowLastColumn="0" w:lastRowFirstColumn="0" w:lastRowLastColumn="0"/>
+              <w:rPr>
+                <w:lang/>
+              </w:rPr>
+            </w:pPr>
+            <w:r>
+              <w:rPr>
+                <w:lang/>
+              </w:rPr>
+              <w:t>Unique, optional</w:t>
+            </w:r>
+          </w:p>
+        </w:tc>
+      </w:tr>
+    </w:tbl>
+    <w:p>
+      <w:pPr>
+        <w:pStyle w:val="IT"/>
+      </w:pPr>
+    </w:p>
+    <w:bookmarkEnd w:id="6"/>
     <w:p>
       <w:pPr>
         <w:pStyle w:val="Heading1"/>
@@ -5455,7 +9292,25 @@
           <w:sz w:val="24"/>
           <w:szCs w:val="24"/>
         </w:rPr>
-        <w:t xml:space="preserve">If you used any AI tools during this project (e.g., ChatGPT, Claude, Copilot), disclose which tool(s), for what specific purpose (e.g., debugging, grammar checking, brainstorming), and how you verified or modified the output. </w:t>
+        <w:t xml:space="preserve">If you used any AI tools during this project (e.g., </w:t>
+      </w:r>
+      <w:proofErr w:type="spellStart"/>
+      <w:r>
+        <w:rPr>
+          <w:rFonts w:ascii="Times New Roman" w:hAnsi="Times New Roman" w:cs="Times New Roman"/>
+          <w:sz w:val="24"/>
+          <w:szCs w:val="24"/>
+        </w:rPr>
+        <w:t>ChatGPT</w:t>
+      </w:r>
+      <w:proofErr w:type="spellEnd"/>
+      <w:r>
+        <w:rPr>
+          <w:rFonts w:ascii="Times New Roman" w:hAnsi="Times New Roman" w:cs="Times New Roman"/>
+          <w:sz w:val="24"/>
+          <w:szCs w:val="24"/>
+        </w:rPr>
+        <w:t xml:space="preserve">, Claude, Copilot), disclose which tool(s), for what specific purpose (e.g., debugging, grammar checking, brainstorming), and how you verified or modified the output. </w:t>
       </w:r>
     </w:p>
     <w:p>
@@ -5517,8 +9372,6 @@
       <w:pPr>
         <w:pStyle w:val="IT"/>
       </w:pPr>
-      <w:bookmarkStart w:id="5" w:name="_GoBack"/>
-      <w:bookmarkEnd w:id="5"/>
     </w:p>
     <w:p>
       <w:pPr>
@@ -5582,7 +9435,29 @@
           <w:sz w:val="24"/>
           <w:szCs w:val="24"/>
         </w:rPr>
-        <w:t>SQL Script (.sql)</w:t>
+        <w:t>SQL Script (.</w:t>
+      </w:r>
+      <w:proofErr w:type="spellStart"/>
+      <w:r>
+        <w:rPr>
+          <w:rFonts w:ascii="Times New Roman" w:hAnsi="Times New Roman" w:cs="Times New Roman"/>
+          <w:b/>
+          <w:bCs/>
+          <w:sz w:val="24"/>
+          <w:szCs w:val="24"/>
+        </w:rPr>
+        <w:t>sql</w:t>
+      </w:r>
+      <w:proofErr w:type="spellEnd"/>
+      <w:r>
+        <w:rPr>
+          <w:rFonts w:ascii="Times New Roman" w:hAnsi="Times New Roman" w:cs="Times New Roman"/>
+          <w:b/>
+          <w:bCs/>
+          <w:sz w:val="24"/>
+          <w:szCs w:val="24"/>
+        </w:rPr>
+        <w:t>)</w:t>
       </w:r>
       <w:r>
         <w:rPr>
@@ -5730,7 +9605,25 @@
           <w:sz w:val="24"/>
           <w:szCs w:val="24"/>
         </w:rPr>
-        <w:t>GitHub/GitLab repository (with commit history): [link]</w:t>
+        <w:t>GitHub/</w:t>
+      </w:r>
+      <w:proofErr w:type="spellStart"/>
+      <w:r>
+        <w:rPr>
+          <w:rFonts w:ascii="Times New Roman" w:hAnsi="Times New Roman" w:cs="Times New Roman"/>
+          <w:sz w:val="24"/>
+          <w:szCs w:val="24"/>
+        </w:rPr>
+        <w:t>GitLab</w:t>
+      </w:r>
+      <w:proofErr w:type="spellEnd"/>
+      <w:r>
+        <w:rPr>
+          <w:rFonts w:ascii="Times New Roman" w:hAnsi="Times New Roman" w:cs="Times New Roman"/>
+          <w:sz w:val="24"/>
+          <w:szCs w:val="24"/>
+        </w:rPr>
+        <w:t xml:space="preserve"> repository (with commit history): [link]</w:t>
       </w:r>
     </w:p>
     <w:p>
@@ -5752,7 +9645,25 @@
           <w:sz w:val="24"/>
           <w:szCs w:val="24"/>
         </w:rPr>
-        <w:t>Google Colab notebook (if applicable): [link]</w:t>
+        <w:t xml:space="preserve">Google </w:t>
+      </w:r>
+      <w:proofErr w:type="spellStart"/>
+      <w:r>
+        <w:rPr>
+          <w:rFonts w:ascii="Times New Roman" w:hAnsi="Times New Roman" w:cs="Times New Roman"/>
+          <w:sz w:val="24"/>
+          <w:szCs w:val="24"/>
+        </w:rPr>
+        <w:t>Colab</w:t>
+      </w:r>
+      <w:proofErr w:type="spellEnd"/>
+      <w:r>
+        <w:rPr>
+          <w:rFonts w:ascii="Times New Roman" w:hAnsi="Times New Roman" w:cs="Times New Roman"/>
+          <w:sz w:val="24"/>
+          <w:szCs w:val="24"/>
+        </w:rPr>
+        <w:t xml:space="preserve"> notebook (if applicable): [link]</w:t>
       </w:r>
     </w:p>
     <w:p>
@@ -5853,7 +9764,7 @@
               <wp:docPr id="1349517934" name="Text Box 9" descr="Restricted - مقيد ">
                 <a:extLst xmlns:a="http://schemas.openxmlformats.org/drawingml/2006/main">
                   <a:ext uri="{5AE41FA2-C0FF-4470-9BD4-5FADCA87CBE2}">
-                    <aclsh:classification xmlns:aclsh="http://schemas.microsoft.com/office/drawing/2020/classificationShape" xmlns:w16du="http://schemas.microsoft.com/office/word/2023/wordml/word16du" xmlns:w16sdtfl="http://schemas.microsoft.com/office/word/2024/wordml/sdtformatlock" xmlns:w16sdtdh="http://schemas.microsoft.com/office/word/2020/wordml/sdtdatahash" xmlns:w16="http://schemas.microsoft.com/office/word/2018/wordml" xmlns:w16cid="http://schemas.microsoft.com/office/word/2016/wordml/cid" xmlns:w16cex="http://schemas.microsoft.com/office/word/2018/wordml/cex" xmlns:w16cei="http://schemas.microsoft.com/office/word/2026/wordml/cei" xmlns:w="http://schemas.openxmlformats.org/wordprocessingml/2006/main" xmlns:w10="urn:schemas-microsoft-com:office:word" xmlns:v="urn:schemas-microsoft-com:vml" xmlns:o="urn:schemas-microsoft-com:office:office" xmlns:oel="http://schemas.microsoft.com/office/2019/extlst" xmlns:am3d="http://schemas.microsoft.com/office/drawing/2017/model3d" xmlns:aink="http://schemas.microsoft.com/office/drawing/2016/ink" xmlns:cx8="http://schemas.microsoft.com/office/drawing/2016/5/14/chartex" xmlns:cx7="http://schemas.microsoft.com/office/drawing/2016/5/13/chartex" xmlns:cx6="http://schemas.microsoft.com/office/drawing/2016/5/12/chartex" xmlns:cx5="http://schemas.microsoft.com/office/drawing/2016/5/11/chartex" xmlns:cx4="http://schemas.microsoft.com/office/drawing/2016/5/10/chartex" xmlns:cx3="http://schemas.microsoft.com/office/drawing/2016/5/9/chartex" xmlns:cx2="http://schemas.microsoft.com/office/drawing/2015/10/21/chartex" xmlns:cx1="http://schemas.microsoft.com/office/drawing/2015/9/8/chartex" xmlns="" classificationOutcomeType="ftr"/>
+                    <aclsh:classification xmlns="" xmlns:cx1="http://schemas.microsoft.com/office/drawing/2015/9/8/chartex" xmlns:cx2="http://schemas.microsoft.com/office/drawing/2015/10/21/chartex" xmlns:cx3="http://schemas.microsoft.com/office/drawing/2016/5/9/chartex" xmlns:cx4="http://schemas.microsoft.com/office/drawing/2016/5/10/chartex" xmlns:cx5="http://schemas.microsoft.com/office/drawing/2016/5/11/chartex" xmlns:cx6="http://schemas.microsoft.com/office/drawing/2016/5/12/chartex" xmlns:cx7="http://schemas.microsoft.com/office/drawing/2016/5/13/chartex" xmlns:cx8="http://schemas.microsoft.com/office/drawing/2016/5/14/chartex" xmlns:aink="http://schemas.microsoft.com/office/drawing/2016/ink" xmlns:am3d="http://schemas.microsoft.com/office/drawing/2017/model3d" xmlns:oel="http://schemas.microsoft.com/office/2019/extlst" xmlns:o="urn:schemas-microsoft-com:office:office" xmlns:v="urn:schemas-microsoft-com:vml" xmlns:w10="urn:schemas-microsoft-com:office:word" xmlns:w="http://schemas.openxmlformats.org/wordprocessingml/2006/main" xmlns:w16cei="http://schemas.microsoft.com/office/word/2026/wordml/cei" xmlns:w16cex="http://schemas.microsoft.com/office/word/2018/wordml/cex" xmlns:w16cid="http://schemas.microsoft.com/office/word/2016/wordml/cid" xmlns:w16="http://schemas.microsoft.com/office/word/2018/wordml" xmlns:w16sdtdh="http://schemas.microsoft.com/office/word/2020/wordml/sdtdatahash" xmlns:w16sdtfl="http://schemas.microsoft.com/office/word/2024/wordml/sdtformatlock" xmlns:w16du="http://schemas.microsoft.com/office/word/2023/wordml/word16du" xmlns:aclsh="http://schemas.microsoft.com/office/drawing/2020/classificationShape" classificationOutcomeType="ftr"/>
                   </a:ext>
                 </a:extLst>
               </wp:docPr>
@@ -5927,13 +9838,13 @@
             </wp:anchor>
           </w:drawing>
         </mc:Choice>
-        <mc:Fallback xmlns:w16du="http://schemas.microsoft.com/office/word/2023/wordml/word16du" xmlns:w16sdtfl="http://schemas.microsoft.com/office/word/2024/wordml/sdtformatlock" xmlns:w16sdtdh="http://schemas.microsoft.com/office/word/2020/wordml/sdtdatahash" xmlns:w16="http://schemas.microsoft.com/office/word/2018/wordml" xmlns:w16cid="http://schemas.microsoft.com/office/word/2016/wordml/cid" xmlns:w16cex="http://schemas.microsoft.com/office/word/2018/wordml/cex" xmlns:w16cei="http://schemas.microsoft.com/office/word/2026/wordml/cei" xmlns:oel="http://schemas.microsoft.com/office/2019/extlst" xmlns:am3d="http://schemas.microsoft.com/office/drawing/2017/model3d" xmlns:aink="http://schemas.microsoft.com/office/drawing/2016/ink" xmlns:cx8="http://schemas.microsoft.com/office/drawing/2016/5/14/chartex" xmlns:cx7="http://schemas.microsoft.com/office/drawing/2016/5/13/chartex" xmlns:cx6="http://schemas.microsoft.com/office/drawing/2016/5/12/chartex" xmlns:cx5="http://schemas.microsoft.com/office/drawing/2016/5/11/chartex" xmlns:cx4="http://schemas.microsoft.com/office/drawing/2016/5/10/chartex" xmlns:cx3="http://schemas.microsoft.com/office/drawing/2016/5/9/chartex" xmlns:cx2="http://schemas.microsoft.com/office/drawing/2015/10/21/chartex" xmlns:cx1="http://schemas.microsoft.com/office/drawing/2015/9/8/chartex">
+        <mc:Fallback>
           <w:pict>
             <v:shapetype w14:anchorId="0318655A" id="_x0000_t202" coordsize="21600,21600" o:spt="202" path="m,l,21600r21600,l21600,xe">
               <v:stroke joinstyle="miter"/>
               <v:path gradientshapeok="t" o:connecttype="rect"/>
             </v:shapetype>
-            <v:shape id="Text Box 9" o:spid="_x0000_s1033" type="#_x0000_t202" alt="Restricted - مقيد " style="position:absolute;left:0;text-align:left;margin-left:0;margin-top:0;width:84.4pt;height:32.1pt;z-index:251663360;visibility:visible;mso-wrap-style:none;mso-wrap-distance-left:0;mso-wrap-distance-top:0;mso-wrap-distance-right:0;mso-wrap-distance-bottom:0;mso-position-horizontal:left;mso-position-horizontal-relative:page;mso-position-vertical:bottom;mso-position-vertical-relative:page;v-text-anchor:bottom" o:gfxdata="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" filled="f" stroked="f">
+            <v:shape id="Text Box 9" o:spid="_x0000_s1033" type="#_x0000_t202" alt="Restricted - مقيد " style="position:absolute;left:0;text-align:left;margin-left:0;margin-top:0;width:84.4pt;height:32.1pt;z-index:251663360;visibility:visible;mso-wrap-style:none;mso-wrap-distance-left:0;mso-wrap-distance-top:0;mso-wrap-distance-right:0;mso-wrap-distance-bottom:0;mso-position-horizontal:left;mso-position-horizontal-relative:page;mso-position-vertical:bottom;mso-position-vertical-relative:page;v-text-anchor:bottom" o:gfxdata="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" filled="f" stroked="f">
               <v:textbox style="mso-fit-shape-to-text:t" inset="20pt,0,0,15pt">
                 <w:txbxContent>
                   <w:p>
@@ -5955,7 +9866,7 @@
                     </w:r>
                     <w:r>
                       <w:rPr>
-                        <w:rFonts w:ascii="Aptos" w:eastAsia="Aptos" w:hAnsi="Aptos" w:cs="Aptos"/>
+                        <w:rFonts w:ascii="Aptos" w:eastAsia="Aptos" w:hAnsi="Aptos" w:cs="Times New Roman"/>
                         <w:noProof/>
                         <w:color w:val="000000"/>
                         <w:rtl/>
@@ -6011,7 +9922,7 @@
               <wp:docPr id="1992261074" name="Text Box 10" descr="Restricted - مقيد ">
                 <a:extLst xmlns:a="http://schemas.openxmlformats.org/drawingml/2006/main">
                   <a:ext uri="{5AE41FA2-C0FF-4470-9BD4-5FADCA87CBE2}">
-                    <aclsh:classification xmlns:aclsh="http://schemas.microsoft.com/office/drawing/2020/classificationShape" xmlns:w16du="http://schemas.microsoft.com/office/word/2023/wordml/word16du" xmlns:w16sdtfl="http://schemas.microsoft.com/office/word/2024/wordml/sdtformatlock" xmlns:w16sdtdh="http://schemas.microsoft.com/office/word/2020/wordml/sdtdatahash" xmlns:w16="http://schemas.microsoft.com/office/word/2018/wordml" xmlns:w16cid="http://schemas.microsoft.com/office/word/2016/wordml/cid" xmlns:w16cex="http://schemas.microsoft.com/office/word/2018/wordml/cex" xmlns:w16cei="http://schemas.microsoft.com/office/word/2026/wordml/cei" xmlns:w="http://schemas.openxmlformats.org/wordprocessingml/2006/main" xmlns:w10="urn:schemas-microsoft-com:office:word" xmlns:v="urn:schemas-microsoft-com:vml" xmlns:o="urn:schemas-microsoft-com:office:office" xmlns:oel="http://schemas.microsoft.com/office/2019/extlst" xmlns:am3d="http://schemas.microsoft.com/office/drawing/2017/model3d" xmlns:aink="http://schemas.microsoft.com/office/drawing/2016/ink" xmlns:cx8="http://schemas.microsoft.com/office/drawing/2016/5/14/chartex" xmlns:cx7="http://schemas.microsoft.com/office/drawing/2016/5/13/chartex" xmlns:cx6="http://schemas.microsoft.com/office/drawing/2016/5/12/chartex" xmlns:cx5="http://schemas.microsoft.com/office/drawing/2016/5/11/chartex" xmlns:cx4="http://schemas.microsoft.com/office/drawing/2016/5/10/chartex" xmlns:cx3="http://schemas.microsoft.com/office/drawing/2016/5/9/chartex" xmlns:cx2="http://schemas.microsoft.com/office/drawing/2015/10/21/chartex" xmlns:cx1="http://schemas.microsoft.com/office/drawing/2015/9/8/chartex" xmlns="" classificationOutcomeType="ftr"/>
+                    <aclsh:classification xmlns="" xmlns:cx1="http://schemas.microsoft.com/office/drawing/2015/9/8/chartex" xmlns:cx2="http://schemas.microsoft.com/office/drawing/2015/10/21/chartex" xmlns:cx3="http://schemas.microsoft.com/office/drawing/2016/5/9/chartex" xmlns:cx4="http://schemas.microsoft.com/office/drawing/2016/5/10/chartex" xmlns:cx5="http://schemas.microsoft.com/office/drawing/2016/5/11/chartex" xmlns:cx6="http://schemas.microsoft.com/office/drawing/2016/5/12/chartex" xmlns:cx7="http://schemas.microsoft.com/office/drawing/2016/5/13/chartex" xmlns:cx8="http://schemas.microsoft.com/office/drawing/2016/5/14/chartex" xmlns:aink="http://schemas.microsoft.com/office/drawing/2016/ink" xmlns:am3d="http://schemas.microsoft.com/office/drawing/2017/model3d" xmlns:oel="http://schemas.microsoft.com/office/2019/extlst" xmlns:o="urn:schemas-microsoft-com:office:office" xmlns:v="urn:schemas-microsoft-com:vml" xmlns:w10="urn:schemas-microsoft-com:office:word" xmlns:w="http://schemas.openxmlformats.org/wordprocessingml/2006/main" xmlns:w16cei="http://schemas.microsoft.com/office/word/2026/wordml/cei" xmlns:w16cex="http://schemas.microsoft.com/office/word/2018/wordml/cex" xmlns:w16cid="http://schemas.microsoft.com/office/word/2016/wordml/cid" xmlns:w16="http://schemas.microsoft.com/office/word/2018/wordml" xmlns:w16sdtdh="http://schemas.microsoft.com/office/word/2020/wordml/sdtdatahash" xmlns:w16sdtfl="http://schemas.microsoft.com/office/word/2024/wordml/sdtformatlock" xmlns:w16du="http://schemas.microsoft.com/office/word/2023/wordml/word16du" xmlns:aclsh="http://schemas.microsoft.com/office/drawing/2020/classificationShape" classificationOutcomeType="ftr"/>
                   </a:ext>
                 </a:extLst>
               </wp:docPr>
@@ -6085,13 +9996,13 @@
             </wp:anchor>
           </w:drawing>
         </mc:Choice>
-        <mc:Fallback xmlns:w16du="http://schemas.microsoft.com/office/word/2023/wordml/word16du" xmlns:w16sdtfl="http://schemas.microsoft.com/office/word/2024/wordml/sdtformatlock" xmlns:w16sdtdh="http://schemas.microsoft.com/office/word/2020/wordml/sdtdatahash" xmlns:w16="http://schemas.microsoft.com/office/word/2018/wordml" xmlns:w16cid="http://schemas.microsoft.com/office/word/2016/wordml/cid" xmlns:w16cex="http://schemas.microsoft.com/office/word/2018/wordml/cex" xmlns:w16cei="http://schemas.microsoft.com/office/word/2026/wordml/cei" xmlns:oel="http://schemas.microsoft.com/office/2019/extlst" xmlns:am3d="http://schemas.microsoft.com/office/drawing/2017/model3d" xmlns:aink="http://schemas.microsoft.com/office/drawing/2016/ink" xmlns:cx8="http://schemas.microsoft.com/office/drawing/2016/5/14/chartex" xmlns:cx7="http://schemas.microsoft.com/office/drawing/2016/5/13/chartex" xmlns:cx6="http://schemas.microsoft.com/office/drawing/2016/5/12/chartex" xmlns:cx5="http://schemas.microsoft.com/office/drawing/2016/5/11/chartex" xmlns:cx4="http://schemas.microsoft.com/office/drawing/2016/5/10/chartex" xmlns:cx3="http://schemas.microsoft.com/office/drawing/2016/5/9/chartex" xmlns:cx2="http://schemas.microsoft.com/office/drawing/2015/10/21/chartex" xmlns:cx1="http://schemas.microsoft.com/office/drawing/2015/9/8/chartex">
+        <mc:Fallback>
           <w:pict>
             <v:shapetype w14:anchorId="5EFC589A" id="_x0000_t202" coordsize="21600,21600" o:spt="202" path="m,l,21600r21600,l21600,xe">
               <v:stroke joinstyle="miter"/>
               <v:path gradientshapeok="t" o:connecttype="rect"/>
             </v:shapetype>
-            <v:shape id="Text Box 10" o:spid="_x0000_s1034" type="#_x0000_t202" alt="Restricted - مقيد " style="position:absolute;left:0;text-align:left;margin-left:0;margin-top:0;width:84.4pt;height:32.1pt;z-index:251664384;visibility:visible;mso-wrap-style:none;mso-wrap-distance-left:0;mso-wrap-distance-top:0;mso-wrap-distance-right:0;mso-wrap-distance-bottom:0;mso-position-horizontal:left;mso-position-horizontal-relative:page;mso-position-vertical:bottom;mso-position-vertical-relative:page;v-text-anchor:bottom" o:gfxdata="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" filled="f" stroked="f">
+            <v:shape id="Text Box 10" o:spid="_x0000_s1034" type="#_x0000_t202" alt="Restricted - مقيد " style="position:absolute;left:0;text-align:left;margin-left:0;margin-top:0;width:84.4pt;height:32.1pt;z-index:251664384;visibility:visible;mso-wrap-style:none;mso-wrap-distance-left:0;mso-wrap-distance-top:0;mso-wrap-distance-right:0;mso-wrap-distance-bottom:0;mso-position-horizontal:left;mso-position-horizontal-relative:page;mso-position-vertical:bottom;mso-position-vertical-relative:page;v-text-anchor:bottom" o:gfxdata="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" filled="f" stroked="f">
               <v:textbox style="mso-fit-shape-to-text:t" inset="20pt,0,0,15pt">
                 <w:txbxContent>
                   <w:p>
@@ -6113,7 +10024,7 @@
                     </w:r>
                     <w:r>
                       <w:rPr>
-                        <w:rFonts w:ascii="Aptos" w:eastAsia="Aptos" w:hAnsi="Aptos" w:cs="Aptos"/>
+                        <w:rFonts w:ascii="Aptos" w:eastAsia="Aptos" w:hAnsi="Aptos" w:cs="Times New Roman"/>
                         <w:noProof/>
                         <w:color w:val="000000"/>
                         <w:rtl/>
@@ -6169,7 +10080,7 @@
               <wp:docPr id="786098250" name="Text Box 8" descr="Restricted - مقيد ">
                 <a:extLst xmlns:a="http://schemas.openxmlformats.org/drawingml/2006/main">
                   <a:ext uri="{5AE41FA2-C0FF-4470-9BD4-5FADCA87CBE2}">
-                    <aclsh:classification xmlns:aclsh="http://schemas.microsoft.com/office/drawing/2020/classificationShape" xmlns:w16du="http://schemas.microsoft.com/office/word/2023/wordml/word16du" xmlns:w16sdtfl="http://schemas.microsoft.com/office/word/2024/wordml/sdtformatlock" xmlns:w16sdtdh="http://schemas.microsoft.com/office/word/2020/wordml/sdtdatahash" xmlns:w16="http://schemas.microsoft.com/office/word/2018/wordml" xmlns:w16cid="http://schemas.microsoft.com/office/word/2016/wordml/cid" xmlns:w16cex="http://schemas.microsoft.com/office/word/2018/wordml/cex" xmlns:w16cei="http://schemas.microsoft.com/office/word/2026/wordml/cei" xmlns:w="http://schemas.openxmlformats.org/wordprocessingml/2006/main" xmlns:w10="urn:schemas-microsoft-com:office:word" xmlns:v="urn:schemas-microsoft-com:vml" xmlns:o="urn:schemas-microsoft-com:office:office" xmlns:oel="http://schemas.microsoft.com/office/2019/extlst" xmlns:am3d="http://schemas.microsoft.com/office/drawing/2017/model3d" xmlns:aink="http://schemas.microsoft.com/office/drawing/2016/ink" xmlns:cx8="http://schemas.microsoft.com/office/drawing/2016/5/14/chartex" xmlns:cx7="http://schemas.microsoft.com/office/drawing/2016/5/13/chartex" xmlns:cx6="http://schemas.microsoft.com/office/drawing/2016/5/12/chartex" xmlns:cx5="http://schemas.microsoft.com/office/drawing/2016/5/11/chartex" xmlns:cx4="http://schemas.microsoft.com/office/drawing/2016/5/10/chartex" xmlns:cx3="http://schemas.microsoft.com/office/drawing/2016/5/9/chartex" xmlns:cx2="http://schemas.microsoft.com/office/drawing/2015/10/21/chartex" xmlns:cx1="http://schemas.microsoft.com/office/drawing/2015/9/8/chartex" xmlns="" classificationOutcomeType="ftr"/>
+                    <aclsh:classification xmlns="" xmlns:cx1="http://schemas.microsoft.com/office/drawing/2015/9/8/chartex" xmlns:cx2="http://schemas.microsoft.com/office/drawing/2015/10/21/chartex" xmlns:cx3="http://schemas.microsoft.com/office/drawing/2016/5/9/chartex" xmlns:cx4="http://schemas.microsoft.com/office/drawing/2016/5/10/chartex" xmlns:cx5="http://schemas.microsoft.com/office/drawing/2016/5/11/chartex" xmlns:cx6="http://schemas.microsoft.com/office/drawing/2016/5/12/chartex" xmlns:cx7="http://schemas.microsoft.com/office/drawing/2016/5/13/chartex" xmlns:cx8="http://schemas.microsoft.com/office/drawing/2016/5/14/chartex" xmlns:aink="http://schemas.microsoft.com/office/drawing/2016/ink" xmlns:am3d="http://schemas.microsoft.com/office/drawing/2017/model3d" xmlns:oel="http://schemas.microsoft.com/office/2019/extlst" xmlns:o="urn:schemas-microsoft-com:office:office" xmlns:v="urn:schemas-microsoft-com:vml" xmlns:w10="urn:schemas-microsoft-com:office:word" xmlns:w="http://schemas.openxmlformats.org/wordprocessingml/2006/main" xmlns:w16cei="http://schemas.microsoft.com/office/word/2026/wordml/cei" xmlns:w16cex="http://schemas.microsoft.com/office/word/2018/wordml/cex" xmlns:w16cid="http://schemas.microsoft.com/office/word/2016/wordml/cid" xmlns:w16="http://schemas.microsoft.com/office/word/2018/wordml" xmlns:w16sdtdh="http://schemas.microsoft.com/office/word/2020/wordml/sdtdatahash" xmlns:w16sdtfl="http://schemas.microsoft.com/office/word/2024/wordml/sdtformatlock" xmlns:w16du="http://schemas.microsoft.com/office/word/2023/wordml/word16du" xmlns:aclsh="http://schemas.microsoft.com/office/drawing/2020/classificationShape" classificationOutcomeType="ftr"/>
                   </a:ext>
                 </a:extLst>
               </wp:docPr>
@@ -6243,13 +10154,13 @@
             </wp:anchor>
           </w:drawing>
         </mc:Choice>
-        <mc:Fallback xmlns:w16du="http://schemas.microsoft.com/office/word/2023/wordml/word16du" xmlns:w16sdtfl="http://schemas.microsoft.com/office/word/2024/wordml/sdtformatlock" xmlns:w16sdtdh="http://schemas.microsoft.com/office/word/2020/wordml/sdtdatahash" xmlns:w16="http://schemas.microsoft.com/office/word/2018/wordml" xmlns:w16cid="http://schemas.microsoft.com/office/word/2016/wordml/cid" xmlns:w16cex="http://schemas.microsoft.com/office/word/2018/wordml/cex" xmlns:w16cei="http://schemas.microsoft.com/office/word/2026/wordml/cei" xmlns:oel="http://schemas.microsoft.com/office/2019/extlst" xmlns:am3d="http://schemas.microsoft.com/office/drawing/2017/model3d" xmlns:aink="http://schemas.microsoft.com/office/drawing/2016/ink" xmlns:cx8="http://schemas.microsoft.com/office/drawing/2016/5/14/chartex" xmlns:cx7="http://schemas.microsoft.com/office/drawing/2016/5/13/chartex" xmlns:cx6="http://schemas.microsoft.com/office/drawing/2016/5/12/chartex" xmlns:cx5="http://schemas.microsoft.com/office/drawing/2016/5/11/chartex" xmlns:cx4="http://schemas.microsoft.com/office/drawing/2016/5/10/chartex" xmlns:cx3="http://schemas.microsoft.com/office/drawing/2016/5/9/chartex" xmlns:cx2="http://schemas.microsoft.com/office/drawing/2015/10/21/chartex" xmlns:cx1="http://schemas.microsoft.com/office/drawing/2015/9/8/chartex">
+        <mc:Fallback>
           <w:pict>
             <v:shapetype w14:anchorId="6A6AF9A3" id="_x0000_t202" coordsize="21600,21600" o:spt="202" path="m,l,21600r21600,l21600,xe">
               <v:stroke joinstyle="miter"/>
               <v:path gradientshapeok="t" o:connecttype="rect"/>
             </v:shapetype>
-            <v:shape id="Text Box 8" o:spid="_x0000_s1035" type="#_x0000_t202" alt="Restricted - مقيد " style="position:absolute;left:0;text-align:left;margin-left:0;margin-top:0;width:84.4pt;height:32.1pt;z-index:251662336;visibility:visible;mso-wrap-style:none;mso-wrap-distance-left:0;mso-wrap-distance-top:0;mso-wrap-distance-right:0;mso-wrap-distance-bottom:0;mso-position-horizontal:left;mso-position-horizontal-relative:page;mso-position-vertical:bottom;mso-position-vertical-relative:page;v-text-anchor:bottom" o:gfxdata="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" filled="f" stroked="f">
+            <v:shape id="Text Box 8" o:spid="_x0000_s1035" type="#_x0000_t202" alt="Restricted - مقيد " style="position:absolute;left:0;text-align:left;margin-left:0;margin-top:0;width:84.4pt;height:32.1pt;z-index:251662336;visibility:visible;mso-wrap-style:none;mso-wrap-distance-left:0;mso-wrap-distance-top:0;mso-wrap-distance-right:0;mso-wrap-distance-bottom:0;mso-position-horizontal:left;mso-position-horizontal-relative:page;mso-position-vertical:bottom;mso-position-vertical-relative:page;v-text-anchor:bottom" o:gfxdata="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" filled="f" stroked="f">
               <v:textbox style="mso-fit-shape-to-text:t" inset="20pt,0,0,15pt">
                 <w:txbxContent>
                   <w:p>
@@ -6271,7 +10182,7 @@
                     </w:r>
                     <w:r>
                       <w:rPr>
-                        <w:rFonts w:ascii="Aptos" w:eastAsia="Aptos" w:hAnsi="Aptos" w:cs="Aptos"/>
+                        <w:rFonts w:ascii="Aptos" w:eastAsia="Aptos" w:hAnsi="Aptos" w:cs="Times New Roman"/>
                         <w:noProof/>
                         <w:color w:val="000000"/>
                         <w:rtl/>
@@ -6599,7 +10510,7 @@
             </wp:anchor>
           </w:drawing>
         </mc:Choice>
-        <mc:Fallback xmlns:w16du="http://schemas.microsoft.com/office/word/2023/wordml/word16du" xmlns:w16sdtfl="http://schemas.microsoft.com/office/word/2024/wordml/sdtformatlock" xmlns:w16sdtdh="http://schemas.microsoft.com/office/word/2020/wordml/sdtdatahash" xmlns:w16="http://schemas.microsoft.com/office/word/2018/wordml" xmlns:w16cid="http://schemas.microsoft.com/office/word/2016/wordml/cid" xmlns:w16cex="http://schemas.microsoft.com/office/word/2018/wordml/cex" xmlns:w16cei="http://schemas.microsoft.com/office/word/2026/wordml/cei" xmlns:oel="http://schemas.microsoft.com/office/2019/extlst" xmlns:am3d="http://schemas.microsoft.com/office/drawing/2017/model3d" xmlns:aink="http://schemas.microsoft.com/office/drawing/2016/ink" xmlns:cx8="http://schemas.microsoft.com/office/drawing/2016/5/14/chartex" xmlns:cx7="http://schemas.microsoft.com/office/drawing/2016/5/13/chartex" xmlns:cx6="http://schemas.microsoft.com/office/drawing/2016/5/12/chartex" xmlns:cx5="http://schemas.microsoft.com/office/drawing/2016/5/11/chartex" xmlns:cx4="http://schemas.microsoft.com/office/drawing/2016/5/10/chartex" xmlns:cx3="http://schemas.microsoft.com/office/drawing/2016/5/9/chartex" xmlns:cx2="http://schemas.microsoft.com/office/drawing/2015/10/21/chartex" xmlns:cx1="http://schemas.microsoft.com/office/drawing/2015/9/8/chartex">
+        <mc:Fallback xmlns:cx1="http://schemas.microsoft.com/office/drawing/2015/9/8/chartex" xmlns:cx2="http://schemas.microsoft.com/office/drawing/2015/10/21/chartex" xmlns:cx3="http://schemas.microsoft.com/office/drawing/2016/5/9/chartex" xmlns:cx4="http://schemas.microsoft.com/office/drawing/2016/5/10/chartex" xmlns:cx5="http://schemas.microsoft.com/office/drawing/2016/5/11/chartex" xmlns:cx6="http://schemas.microsoft.com/office/drawing/2016/5/12/chartex" xmlns:cx7="http://schemas.microsoft.com/office/drawing/2016/5/13/chartex" xmlns:cx8="http://schemas.microsoft.com/office/drawing/2016/5/14/chartex" xmlns:aink="http://schemas.microsoft.com/office/drawing/2016/ink" xmlns:am3d="http://schemas.microsoft.com/office/drawing/2017/model3d" xmlns:oel="http://schemas.microsoft.com/office/2019/extlst" xmlns:w16cei="http://schemas.microsoft.com/office/word/2026/wordml/cei" xmlns:w16cex="http://schemas.microsoft.com/office/word/2018/wordml/cex" xmlns:w16cid="http://schemas.microsoft.com/office/word/2016/wordml/cid" xmlns:w16="http://schemas.microsoft.com/office/word/2018/wordml" xmlns:w16sdtdh="http://schemas.microsoft.com/office/word/2020/wordml/sdtdatahash" xmlns:w16sdtfl="http://schemas.microsoft.com/office/word/2024/wordml/sdtformatlock" xmlns:w16du="http://schemas.microsoft.com/office/word/2023/wordml/word16du">
           <w:pict>
             <v:line w14:anchorId="04400D3D" id="Straight Connector 6" o:spid="_x0000_s1026" style="position:absolute;z-index:251660288;visibility:visible;mso-wrap-style:square;mso-width-percent:0;mso-height-percent:0;mso-wrap-distance-left:9pt;mso-wrap-distance-top:-3e-5mm;mso-wrap-distance-right:9pt;mso-wrap-distance-bottom:-3e-5mm;mso-position-horizontal:absolute;mso-position-horizontal-relative:text;mso-position-vertical:absolute;mso-position-vertical-relative:text;mso-width-percent:0;mso-height-percent:0;mso-width-relative:page;mso-height-relative:page" from="-68.95pt,-666.45pt" to="489.05pt,-666.45pt" o:gfxdata="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" strokecolor="#4f81bd" strokeweight="2pt">
               <v:shadow on="t" opacity="24903f" origin=",.5" offset="0,.55556mm"/>
@@ -6659,7 +10570,7 @@
             <w:fldChar w:fldCharType="separate"/>
           </w:r>
           <w:r>
-            <w:t>07</w:t>
+            <w:t>03</w:t>
           </w:r>
           <w:r>
             <w:fldChar w:fldCharType="end"/>
@@ -6710,7 +10621,7 @@
             <w:rPr>
               <w:noProof/>
             </w:rPr>
-            <w:instrText>Deliverables</w:instrText>
+            <w:instrText>Task 1 – Database Design (6 Marks)</w:instrText>
           </w:r>
           <w:r>
             <w:rPr>
@@ -6743,7 +10654,7 @@
             <w:rPr>
               <w:noProof/>
             </w:rPr>
-            <w:instrText>Deliverables</w:instrText>
+            <w:instrText>Task 1 – Database Design (6 Marks)</w:instrText>
           </w:r>
           <w:r>
             <w:rPr>
@@ -6761,7 +10672,7 @@
             <w:rPr>
               <w:noProof/>
             </w:rPr>
-            <w:t xml:space="preserve">Deliverables </w:t>
+            <w:t xml:space="preserve">Task 1 – Database Design (6 Marks) </w:t>
           </w:r>
           <w:r>
             <w:fldChar w:fldCharType="end"/>
@@ -11744,6 +15655,7 @@
     <w:rsid w:val="002C763B"/>
     <w:rsid w:val="00324ACF"/>
     <w:rsid w:val="00351A43"/>
+    <w:rsid w:val="00461B18"/>
     <w:rsid w:val="004A7EE6"/>
     <w:rsid w:val="004E5C8C"/>
     <w:rsid w:val="005443A0"/>
@@ -12643,7 +16555,7 @@
 </file>
 
 <file path=customXml/itemProps3.xml><?xml version="1.0" encoding="utf-8"?>
-<ds:datastoreItem xmlns:ds="http://schemas.openxmlformats.org/officeDocument/2006/customXml" ds:itemID="{34AB9000-4A26-4481-A8AF-5093E576A583}">
+<ds:datastoreItem xmlns:ds="http://schemas.openxmlformats.org/officeDocument/2006/customXml" ds:itemID="{0FDA90C2-E837-418D-8420-81D512EB90EE}">
   <ds:schemaRefs>
     <ds:schemaRef ds:uri="http://schemas.openxmlformats.org/officeDocument/2006/bibliography"/>
   </ds:schemaRefs>

</xml_diff>